<commit_message>
Personalize memo and CV with TDAC AIAD research and resume details
Co-Authored-By: Claude Opus 5.5 <noreply@anthropic.com>
Claude-Session: https://claude.ai/code/session_01HUa9sxRc7o7bsnuzSz3H5S
</commit_message>
<xml_diff>
--- a/application/Pezan_DXDT_Application_Memo_DRAFT.docx
+++ b/application/Pezan_DXDT_Application_Memo_DRAFT.docx
@@ -291,22 +291,7 @@
           <w:sz w:val="24"/>
           <w:szCs w:val="24"/>
         </w:rPr>
-        <w:t xml:space="preserve">I intend to serve as an Army officer who can turn operational problems into rigorous mathematical models and fielded software. After commissioning as a </w:t>
-      </w:r>
-      <w:r>
-        <w:rPr>
-          <w:sz w:val="24"/>
-          <w:szCs w:val="24"/>
-          <w:highlight w:val="yellow"/>
-        </w:rPr>
-        <w:t xml:space="preserve">[BRANCH PREFERENCE]</w:t>
-      </w:r>
-      <w:r>
-        <w:rPr>
-          <w:sz w:val="24"/>
-          <w:szCs w:val="24"/>
-        </w:rPr>
-        <w:t xml:space="preserve"> officer, I want to build toward service as an Operations Research/Systems Analyst (FA49) or in an Army software and AI organization such as the Army Software Factory or the Army AI Integration Center. Longer term, I plan to earn a graduate degree in operations research or machine learning and return to West Point to teach in the Department of Mathematical Sciences, bringing current industry and laboratory practice into the classroom.</w:t>
+        <w:t xml:space="preserve">I intend to serve as an Army officer who turns operational problems into rigorous models and fielded software. As an Operations Research major with a finance specialization, I want to build toward service as an Operations Research/Systems Analyst (FA49) or in an Army AI organization such as the Army AI Integration Center, where decision science directly shapes how the force is sustained and employed. Longer term, I plan to earn a graduate degree in operations research or machine learning and return to West Point to teach in the Department of Mathematical Sciences, bringing current industry and laboratory practice into the classroom.</w:t>
       </w:r>
     </w:p>
     <w:p>
@@ -342,7 +327,22 @@
           <w:sz w:val="24"/>
           <w:szCs w:val="24"/>
         </w:rPr>
-        <w:t xml:space="preserve">Mr. Philippone has described data as the ammunition of the future and has framed a commander’s hardest choices as constrained optimization: finding the best decision across competing tradeoffs, fast enough to matter. Machine learning estimates what is happening and what will happen; optimization decides what to do about it. My research interest sits exactly at that junction. Industry iterates on these tools in weeks, while coursework and Army processes move in semesters and years. I am pursuing the DXDT “Velocity” Scholarship to close that gap now, as a cadet, by working inside research environments that move at industry pace on Army problems. Specifically, I seek a summer research placement at MIT Lincoln Laboratory, a federally funded research and development center that has hosted West Point cadets, or at Stanford’s Gordian Knot Center for National Security Innovation, which applies lean-startup methods such as Hacking for Defense to national security problems. Because the scholarship would fund my travel and lodging, I can approach a host as a self-funded researcher. That removes the main barrier to a placement and lets me pursue a project of my own design under an expert mentor, building a working prototype rather than a briefing about one.</w:t>
+        <w:t xml:space="preserve">Mr. Philippone has described data as the ammunition of the future and has framed a commander’s hardest choices as constrained optimization: finding the best decision across competing tradeoffs, fast enough to matter. I saw both sides of that problem this past summer. During my AIAD at the Army’s Transformation Decision Analysis Center (TDAC), I trained a reinforcement-learning agent to allocate resupply in a contested-logistics simulation, and our team met with Palantir </w:t>
+      </w:r>
+      <w:r>
+        <w:rPr>
+          <w:sz w:val="24"/>
+          <w:szCs w:val="24"/>
+          <w:highlight w:val="yellow"/>
+        </w:rPr>
+        <w:t xml:space="preserve">[WHO YOU MET AND WHAT THEY SHOWED YOU]</w:t>
+      </w:r>
+      <w:r>
+        <w:rPr>
+          <w:sz w:val="24"/>
+          <w:szCs w:val="24"/>
+        </w:rPr>
+        <w:t xml:space="preserve">. That contrast showed me how quickly industry moves a model from prototype to an operator’s hands, while Army analytic tools often take years. I am pursuing the DXDT “Velocity” Scholarship to keep closing that gap as a cadet, by working inside research environments that move at industry pace on Army problems. Specifically, I seek a summer research placement at MIT Lincoln Laboratory, a federally funded research and development center that has hosted West Point cadets, or at Stanford’s Gordian Knot Center for National Security Innovation, which applies lean-startup methods such as Hacking for Defense to national security problems. Because the scholarship would fund my travel and lodging, I can approach a host as a self-funded researcher with a working project already in hand. That removes the main barrier to a placement and lets me bring a prototype rather than a briefing about one.</w:t>
       </w:r>
     </w:p>
     <w:p>
@@ -381,37 +381,7 @@
           <w:sz w:val="24"/>
           <w:szCs w:val="24"/>
         </w:rPr>
-        <w:t xml:space="preserve">My near-term goal is to complete a cadet research project in learning-augmented optimization for contested logistics. In large-scale combat operations, Army sustainment must move fuel, ammunition, and repair parts across a network where demand is uncertain and routes and nodes can be cut. Using unclassified, synthetic, and open-source data, I plan to (1) train a machine-learning model that forecasts unit-level supply demand from operational tempo and consumption history, (2) feed those forecasts and their uncertainty into a stochastic or robust mixed-integer optimization model for distribution, and (3) measure how quickly and how well the combined approach re-plans after a disruption compared with a deterministic baseline. Every recommendation will trace back to its source data and forecast assumptions, so a commander can see why the model recommends a plan instead of trusting a black box. I will start this academic year with my faculty advisor, </w:t>
-      </w:r>
-      <w:r>
-        <w:rPr>
-          <w:sz w:val="24"/>
-          <w:szCs w:val="24"/>
-          <w:highlight w:val="yellow"/>
-        </w:rPr>
-        <w:t xml:space="preserve">[ADVISOR NAME]</w:t>
-      </w:r>
-      <w:r>
-        <w:rPr>
-          <w:sz w:val="24"/>
-          <w:szCs w:val="24"/>
-        </w:rPr>
-        <w:t xml:space="preserve">, extend the work during the summer placement, present at Projects Day, and submit a cadet paper to a venue such as the journal Military Operations Research. This research will also be the foundation of my application for </w:t>
-      </w:r>
-      <w:r>
-        <w:rPr>
-          <w:sz w:val="24"/>
-          <w:szCs w:val="24"/>
-          <w:highlight w:val="yellow"/>
-        </w:rPr>
-        <w:t xml:space="preserve">[a graduate scholarship / the Tech Scholar program]</w:t>
-      </w:r>
-      <w:r>
-        <w:rPr>
-          <w:sz w:val="24"/>
-          <w:szCs w:val="24"/>
-        </w:rPr>
-        <w:t xml:space="preserve">.</w:t>
+        <w:t xml:space="preserve">My near-term goal is to turn my AIAD work into a full cadet research project in AI and optimization for contested logistics. At TDAC I redesigned the reward function for a proximal policy optimization (PPO) agent that allocates resupply in Logistics Battle Command, the Army’s stochastic sustainment simulation. The original reward produced an agent that scored well while starving the priority unit during engagements. I built diagnostic tools that exposed four specific flaws, redesigned the reward so a high score could only mean good logistics, and the retrained agent more than tripled the share of requests filled and outperformed a hand-coded priority-aware baseline. Reward design is, at its core, an objective-function problem from operations research. Over the next year, under MAJ Patrick Kuiper, I plan to (1) benchmark learned policies against stochastic and robust mixed-integer optimization models on the same resupply decisions, (2) test hybrid approaches in which optimization supplies structure and learning supplies speed, and (3) scale to larger, randomized scenarios, using TDAC’s Python simulation where permitted or an open simulation I build. I will present at Projects Day and the ARL–USMA Technical Symposium, submit a paper to a venue such as the journal Military Operations Research, and use this work as the foundation for future graduate scholarship applications.</w:t>
       </w:r>
     </w:p>
     <w:p>
@@ -482,7 +452,7 @@
           <w:sz w:val="24"/>
           <w:szCs w:val="24"/>
         </w:rPr>
-        <w:t xml:space="preserve">The funding supports three lines of effort that build on one another. First, a three-week AIAD in summer 2027 at MIT Lincoln Laboratory (Lexington, MA) with a staff mentor in an AI or decision-support group; if a Lincoln Laboratory placement cannot be arranged, the alternate is a research AIAD with the Gordian Knot Center at Stanford (Stanford, CA) at the same estimated cost. Second, attendance at the 2027 INFORMS Analytics+ Conference (4–6 April 2027, Washington, DC) to learn how industry and government practitioners field optimization and analytics, and to present preliminary results if accepted. Third, modest compute and reference resources so I can build and test models at realistic scale during the academic year instead of only in the summer. I would gladly accept a Palantir or Shield AI AIAD in place of either option, and I will take part in any Palantir engagement the department offers, such as a hackathon or AIP bootcamp. Optimization solvers (e.g., Gurobi) are available free under academic licenses and are not included in the budget.</w:t>
+        <w:t xml:space="preserve">The funding supports three lines of effort that build on one another. First, a three-week AIAD in summer 2027 at MIT Lincoln Laboratory (Lexington, MA) with a staff mentor in an AI or decision-support group; if a Lincoln Laboratory placement cannot be arranged, the alternate is a research AIAD with the Gordian Knot Center at Stanford (Stanford, CA) at the same estimated cost. Second, attendance at the 2027 INFORMS Analytics+ Conference (4–6 April 2027, Washington, DC) to learn how industry and government practitioners field optimization and analytics, and to present preliminary results if accepted. Third, cloud compute and reference texts. My summer agent needed roughly 900,000 training steps for a two-unit scenario, and larger scenarios will require GPU time that a cadet laptop cannot provide. I would gladly accept a Palantir or Shield AI AIAD in place of either placement option, and I will take part in any Palantir engagement the department offers, such as a hackathon or AIP bootcamp. Optimization solvers (e.g., Gurobi) are free under academic licenses and are not included in the budget.</w:t>
       </w:r>
     </w:p>
     <w:p>
@@ -525,7 +495,7 @@
           <w:sz w:val="24"/>
           <w:szCs w:val="24"/>
         </w:rPr>
-        <w:t xml:space="preserve">Travel supports the summer research placement and one conference, both completed before graduation.</w:t>
+        <w:t xml:space="preserve">Travel supports the summer research placement and one conference, both completed well before graduation.</w:t>
       </w:r>
     </w:p>
     <w:p>
@@ -1568,22 +1538,7 @@
           <w:sz w:val="24"/>
           <w:szCs w:val="24"/>
         </w:rPr>
-        <w:t xml:space="preserve">Nov–Dec 2026: confirm the host mentor and AIAD through the department. Jan 2027: purchase references and begin cloud compute (used through May 2027). Feb 2027: register for INFORMS Analytics+. 4–6 Apr 2027: attend the conference. Jun–Jul 2027: complete the AIAD. All funds will be spent by 31 July 2027, before my graduation in May </w:t>
-      </w:r>
-      <w:r>
-        <w:rPr>
-          <w:sz w:val="24"/>
-          <w:szCs w:val="24"/>
-          <w:highlight w:val="yellow"/>
-        </w:rPr>
-        <w:t xml:space="preserve">[2028/2029]</w:t>
-      </w:r>
-      <w:r>
-        <w:rPr>
-          <w:sz w:val="24"/>
-          <w:szCs w:val="24"/>
-        </w:rPr>
-        <w:t xml:space="preserve">.</w:t>
+        <w:t xml:space="preserve">Nov–Dec 2026: confirm the host mentor and AIAD through the department. Jan 2027: purchase references and begin cloud compute (used through May 2027). Feb 2027: register for INFORMS Analytics+. 4–6 Apr 2027: attend the conference. Jun–Jul 2027: complete the AIAD. All funds will be spent by 31 July 2027, well before my graduation in May 2029.</w:t>
       </w:r>
     </w:p>
     <w:p>
@@ -1619,22 +1574,7 @@
           <w:sz w:val="24"/>
           <w:szCs w:val="24"/>
         </w:rPr>
-        <w:t xml:space="preserve">CDT Dennis </w:t>
-      </w:r>
-      <w:r>
-        <w:rPr>
-          <w:sz w:val="24"/>
-          <w:szCs w:val="24"/>
-          <w:highlight w:val="yellow"/>
-        </w:rPr>
-        <w:t xml:space="preserve">[M.]</w:t>
-      </w:r>
-      <w:r>
-        <w:rPr>
-          <w:sz w:val="24"/>
-          <w:szCs w:val="24"/>
-        </w:rPr>
-        <w:t xml:space="preserve"> Pezan, Company </w:t>
+        <w:t xml:space="preserve">CDT Dennis G. Pezan, Company </w:t>
       </w:r>
       <w:r>
         <w:rPr>
@@ -1649,37 +1589,7 @@
           <w:sz w:val="24"/>
           <w:szCs w:val="24"/>
         </w:rPr>
-        <w:t xml:space="preserve">, Class of </w:t>
-      </w:r>
-      <w:r>
-        <w:rPr>
-          <w:sz w:val="24"/>
-          <w:szCs w:val="24"/>
-          <w:highlight w:val="yellow"/>
-        </w:rPr>
-        <w:t xml:space="preserve">[2028/2029]</w:t>
-      </w:r>
-      <w:r>
-        <w:rPr>
-          <w:sz w:val="24"/>
-          <w:szCs w:val="24"/>
-        </w:rPr>
-        <w:t xml:space="preserve">; dennis.pezan@westpoint.edu; </w:t>
-      </w:r>
-      <w:r>
-        <w:rPr>
-          <w:sz w:val="24"/>
-          <w:szCs w:val="24"/>
-          <w:highlight w:val="yellow"/>
-        </w:rPr>
-        <w:t xml:space="preserve">[PHONE]</w:t>
-      </w:r>
-      <w:r>
-        <w:rPr>
-          <w:sz w:val="24"/>
-          <w:szCs w:val="24"/>
-        </w:rPr>
-        <w:t xml:space="preserve">.</w:t>
+        <w:t xml:space="preserve">, Class of 2029; dennis.pezan@westpoint.edu; (815) 592-6927.</w:t>
       </w:r>
     </w:p>
     <w:p>
@@ -1738,22 +1648,7 @@
           <w:sz w:val="24"/>
           <w:szCs w:val="24"/>
         </w:rPr>
-        <w:t xml:space="preserve">DENNIS </w:t>
-      </w:r>
-      <w:r>
-        <w:rPr>
-          <w:sz w:val="24"/>
-          <w:szCs w:val="24"/>
-          <w:highlight w:val="yellow"/>
-        </w:rPr>
-        <w:t xml:space="preserve">[M.]</w:t>
-      </w:r>
-      <w:r>
-        <w:rPr>
-          <w:sz w:val="24"/>
-          <w:szCs w:val="24"/>
-        </w:rPr>
-        <w:t xml:space="preserve"> PEZAN</w:t>
+        <w:t xml:space="preserve">DENNIS G. PEZAN</w:t>
       </w:r>
     </w:p>
     <w:p>

</xml_diff>

<commit_message>
Remove conference travel; present only at Projects Day; total $7,410
Co-Authored-By: Claude Opus 5.5 <noreply@anthropic.com>
Claude-Session: https://claude.ai/code/session_01HUa9sxRc7o7bsnuzSz3H5S
</commit_message>
<xml_diff>
--- a/application/Pezan_DXDT_Application_Memo_DRAFT.docx
+++ b/application/Pezan_DXDT_Application_Memo_DRAFT.docx
@@ -366,7 +366,7 @@
           <w:sz w:val="24"/>
           <w:szCs w:val="24"/>
         </w:rPr>
-        <w:t xml:space="preserve">My near-term goal is to build a cadet research program that combines reinforcement learning and network optimization for contested logistics. At TDAC I redesigned the reward function for a reinforcement-learning agent that allocates resupply in Logistics Battle Command, the Army’s sustainment simulation. I built diagnostic tools that exposed why a high-scoring agent was starving the priority unit, and the retrained agent more than tripled the share of requests filled. This semester I am working on network interdiction with my advisor, LTC Matthew Webb, whose doctoral research with the MIT Center for Transportation &amp; Logistics developed a reinforcement-learning approach to maximum-flow network interdiction (Webb and Caplice, submitted to Networks). My project asks where an adversary with a fixed effort budget should act to cut Taiwan’s crude oil supply, and whether LTC Webb’s reinforcement-learning attacker, trained on Ukraine’s rail network, still finds strong strategies on sea lanes. I have built a 57-node, 79-edge model of Taiwan’s crude import routes from open sources, with sourced capacities and seven costed adversary actions, connected it to his code, and verified it against an independent max-flow calculation. Early checks show that no single action hurts Taiwan, because supply reroutes, while combined actions do. Over the coming year I will (1) compare optimization baselines against the trained agent, (2) test how the adversary’s best plan changes as blockade and cyber costs vary, and (3) report whether a rail-trained attacker transfers to a maritime network. I will present at Projects Day and the ARL–USMA Technical Symposium, submit an abstract to the MORS Symposium, and submit a paper to a venue such as the journal Military Operations Research.</w:t>
+        <w:t xml:space="preserve">My near-term goal is to build a cadet research program that combines reinforcement learning and network optimization for contested logistics. At TDAC I redesigned the reward function for a reinforcement-learning agent that allocates resupply in Logistics Battle Command, the Army’s sustainment simulation. I built diagnostic tools that exposed why a high-scoring agent was starving the priority unit, and the retrained agent more than tripled the share of requests filled. This semester I am working on network interdiction with my advisor, LTC Matthew Webb, whose doctoral research with the MIT Center for Transportation &amp; Logistics developed a reinforcement-learning approach to maximum-flow network interdiction (Webb and Caplice, submitted to Networks). My project asks where an adversary with a fixed effort budget should act to cut Taiwan’s crude oil supply, and whether LTC Webb’s reinforcement-learning attacker, trained on Ukraine’s rail network, still finds strong strategies on sea lanes. I have built a 57-node, 79-edge model of Taiwan’s crude import routes from open sources, with sourced capacities and seven costed adversary actions, connected it to his code, and verified it against an independent max-flow calculation. Early checks show that no single action hurts Taiwan, because supply reroutes, while combined actions do. Over the coming year I will (1) compare optimization baselines against the trained agent, (2) test how the adversary’s best plan changes as blockade and cyber costs vary, and (3) report whether a rail-trained attacker transfers to a maritime network. I will present the results at Projects Day.</w:t>
       </w:r>
     </w:p>
     <w:p>
@@ -437,7 +437,7 @@
           <w:sz w:val="24"/>
           <w:szCs w:val="24"/>
         </w:rPr>
-        <w:t xml:space="preserve">The funding supports three lines of effort that build on one another. First, a three-week AIAD in summer 2027 with Palantir in Palo Alto, CA, working with the team that builds and fields Maven. I would build on contacts from this summer’s visit to arrange the placement through the department, and while in Palo Alto I would reconnect with the Gordian Knot Center at no added cost. If a Palantir placement is not available, the alternate is a Shield AI AIAD at the same estimated cost. Second, attendance at the 95th Military Operations Research Society (MORS) Symposium (June 2027, location to be announced), where LTC Webb has presented this line of research, to learn from the defense analysis community and, if my abstract is accepted, to present the interdiction results. Third, cloud compute and reference texts. LTC Webb trains the agent on MIT SuperCloud, but my own baseline runs and cost-sensitivity sweeps need GPU time a cadet laptop cannot provide; my TDAC agent alone needed roughly 900,000 training steps. Optimization solvers (e.g., Gurobi) are free under academic licenses and are not included in the budget.</w:t>
+        <w:t xml:space="preserve">The funding supports two lines of effort that build on one another. First, a three-week AIAD in summer 2027 with Palantir in Palo Alto, CA, working with the team that builds and fields Maven. I would build on contacts from this summer’s visit to arrange the placement through the department, and while in Palo Alto I would reconnect with the Gordian Knot Center at no added cost. If a Palantir placement is not available, the alternate is a Shield AI AIAD at the same estimated cost. Second, cloud compute and reference texts. LTC Webb trains the agent on MIT SuperCloud, but my own baseline runs and cost-sensitivity sweeps need GPU time a cadet laptop cannot provide; my TDAC agent alone needed roughly 900,000 training steps. Optimization solvers (e.g., Gurobi) are free under academic licenses and are not included in the budget.</w:t>
       </w:r>
     </w:p>
     <w:p>
@@ -480,7 +480,7 @@
           <w:sz w:val="24"/>
           <w:szCs w:val="24"/>
         </w:rPr>
-        <w:t xml:space="preserve">Travel supports the summer AIAD and one conference, both completed well before graduation.</w:t>
+        <w:t xml:space="preserve">Travel supports the summer AIAD, completed well before graduation.</w:t>
       </w:r>
     </w:p>
     <w:p>
@@ -781,118 +781,6 @@
                 <w:szCs w:val="22"/>
               </w:rPr>
               <w:t xml:space="preserve">$6,700</w:t>
-            </w:r>
-          </w:p>
-        </w:tc>
-      </w:tr>
-      <w:tr>
-        <w:tc>
-          <w:tcPr>
-            <w:tcW w:w="2137" w:type="dxa"/>
-            <w:vAlign w:val="center"/>
-          </w:tcPr>
-          <w:p>
-            <w:pPr>
-              <w:jc w:val="center"/>
-              <w:rPr>
-                <w:sz w:val="22"/>
-                <w:szCs w:val="22"/>
-              </w:rPr>
-            </w:pPr>
-            <w:r>
-              <w:rPr>
-                <w:sz w:val="22"/>
-                <w:szCs w:val="22"/>
-              </w:rPr>
-              <w:t xml:space="preserve">Conference</w:t>
-            </w:r>
-          </w:p>
-        </w:tc>
-        <w:tc>
-          <w:tcPr>
-            <w:tcW w:w="1980" w:type="dxa"/>
-            <w:vAlign w:val="center"/>
-          </w:tcPr>
-          <w:p>
-            <w:pPr>
-              <w:jc w:val="center"/>
-              <w:rPr>
-                <w:sz w:val="22"/>
-                <w:szCs w:val="22"/>
-              </w:rPr>
-            </w:pPr>
-            <w:r>
-              <w:rPr>
-                <w:sz w:val="22"/>
-                <w:szCs w:val="22"/>
-              </w:rPr>
-              <w:t xml:space="preserve">95th MORS Symposium</w:t>
-            </w:r>
-          </w:p>
-        </w:tc>
-        <w:tc>
-          <w:tcPr>
-            <w:tcW w:w="1890" w:type="dxa"/>
-            <w:vAlign w:val="center"/>
-          </w:tcPr>
-          <w:p>
-            <w:pPr>
-              <w:jc w:val="center"/>
-              <w:rPr>
-                <w:sz w:val="22"/>
-                <w:szCs w:val="22"/>
-              </w:rPr>
-            </w:pPr>
-            <w:r>
-              <w:rPr>
-                <w:sz w:val="22"/>
-                <w:szCs w:val="22"/>
-              </w:rPr>
-              <w:t xml:space="preserve">TBD</w:t>
-            </w:r>
-          </w:p>
-        </w:tc>
-        <w:tc>
-          <w:tcPr>
-            <w:tcW w:w="1530" w:type="dxa"/>
-            <w:vAlign w:val="center"/>
-          </w:tcPr>
-          <w:p>
-            <w:pPr>
-              <w:jc w:val="center"/>
-              <w:rPr>
-                <w:sz w:val="22"/>
-                <w:szCs w:val="22"/>
-              </w:rPr>
-            </w:pPr>
-            <w:r>
-              <w:rPr>
-                <w:sz w:val="22"/>
-                <w:szCs w:val="22"/>
-              </w:rPr>
-              <w:t xml:space="preserve">4 (Jun 2027)</w:t>
-            </w:r>
-          </w:p>
-        </w:tc>
-        <w:tc>
-          <w:tcPr>
-            <w:tcW w:w="1710" w:type="dxa"/>
-            <w:vAlign w:val="center"/>
-          </w:tcPr>
-          <w:p>
-            <w:pPr>
-              <w:jc w:val="center"/>
-              <w:rPr>
-                <w:sz w:val="22"/>
-                <w:szCs w:val="22"/>
-              </w:rPr>
-            </w:pPr>
-            <w:r>
-              <w:rPr>
-                <w:sz w:val="22"/>
-                <w:szCs w:val="22"/>
-              </w:rPr>
-              <w:t xml:space="preserve">$2,000</w:t>
             </w:r>
           </w:p>
         </w:tc>
@@ -1487,7 +1375,7 @@
           <w:sz w:val="24"/>
           <w:szCs w:val="24"/>
         </w:rPr>
-        <w:t xml:space="preserve">$9,410 ($8,700 travel + $710 compute and references), within the $10,000 limit.</w:t>
+        <w:t xml:space="preserve">$7,410 ($6,700 travel + $710 compute and references), within the $10,000 limit.</w:t>
       </w:r>
     </w:p>
     <w:p>
@@ -1523,7 +1411,7 @@
           <w:sz w:val="24"/>
           <w:szCs w:val="24"/>
         </w:rPr>
-        <w:t xml:space="preserve">Nov–Dec 2026: confirm the Palantir placement through the department and my contacts from the summer visit. Jan 2027: purchase references and begin cloud compute (used through May 2027). Mar 2027: submit the MORS abstract. Jun 2027: attend the MORS Symposium. Jun–Jul 2027: complete the AIAD. All funds will be spent by 31 July 2027, well before my graduation in May 2029.</w:t>
+        <w:t xml:space="preserve">Nov–Dec 2026: confirm the Palantir placement through the department and my contacts from the summer visit. Jan 2027: purchase references and begin cloud compute (used through May 2027). Jun–Jul 2027: complete the AIAD. All funds will be spent by 31 July 2027, well before my graduation in May 2029.</w:t>
       </w:r>
     </w:p>
     <w:p>

</xml_diff>

<commit_message>
Fund MIT CTL research AIAD with scholarship; seek Palantir AIAD via priority fill
Co-Authored-By: Claude Opus 5.5 <noreply@anthropic.com>
Claude-Session: https://claude.ai/code/session_01HUa9sxRc7o7bsnuzSz3H5S
</commit_message>
<xml_diff>
--- a/application/Pezan_DXDT_Application_Memo_DRAFT.docx
+++ b/application/Pezan_DXDT_Application_Memo_DRAFT.docx
@@ -327,7 +327,7 @@
           <w:sz w:val="24"/>
           <w:szCs w:val="24"/>
         </w:rPr>
-        <w:t xml:space="preserve">Mr. Philippone has described data as the ammunition of the future and has framed a commander’s hardest choices as constrained optimization: finding the best decision across competing tradeoffs, fast enough to matter. This past summer I saw that idea from three angles. On the Sea to Shining Sea AIAD, Palantir’s team in Palo Alto walked us through Project Maven and how it gives commanders at every echelon a common picture to decide from. A few days later, at the 4th Infantry Division, we saw how a formation actually employs those systems and feeds lessons back to the developers. At Stanford’s Gordian Knot Center, Col. (Ret.) Joseph Felter and Jack Faherty described how student startups get new technology into the hands of Army units, and why that is so hard. Then, at my second AIAD with the Army’s Transformation Decision Analysis Center (TDAC), I built the other half: a reinforcement-learning model for contested resupply. This semester I am modeling how an adversary would cut a supply network. Models like these only matter once a platform puts them in front of a commander. I am pursuing the DXDT “Velocity” Scholarship to return to Palo Alto and work with Palantir on Maven, where I can learn how a fielded platform turns models like mine into decisions, and bring that practice back to my research and my future formation.</w:t>
+        <w:t xml:space="preserve">Mr. Philippone has described data as the ammunition of the future and has framed a commander’s hardest choices as constrained optimization: finding the best decision across competing tradeoffs, fast enough to matter. This past summer I saw that idea from three angles. On the Sea to Shining Sea AIAD, Palantir’s team in Palo Alto walked us through Project Maven and how it gives commanders at every echelon a common picture to decide from. A few days later, at the 4th Infantry Division, we saw how a formation actually employs those systems and feeds lessons back to the developers. At Stanford’s Gordian Knot Center, Col. (Ret.) Joseph Felter and Jack Faherty described how student startups get new technology into the hands of Army units, and why that is so hard. Then, at my second AIAD with the Army’s Transformation Decision Analysis Center (TDAC), I built the other half: a reinforcement-learning model for contested resupply. This semester I am modeling how an adversary would cut a supply network. Models like these only matter once a platform puts them in front of a commander. I am pursuing the DXDT “Velocity” Scholarship for two reasons. First, its funding would let me take my interdiction research to the MIT Center for Transportation &amp; Logistics, where the methods I am building on were developed. Second, as a Velocity Scholar I would seek a Palantir AIAD with the Maven team, where I can learn how a fielded platform turns models like mine into decisions and bring that practice back to my research and my future formation.</w:t>
       </w:r>
     </w:p>
     <w:p>
@@ -437,7 +437,7 @@
           <w:sz w:val="24"/>
           <w:szCs w:val="24"/>
         </w:rPr>
-        <w:t xml:space="preserve">The funding supports two lines of effort that build on one another. First, a three-week AIAD in summer 2027 with Palantir in Palo Alto, CA, working with the team that builds and fields Maven. I would build on contacts from this summer’s visit to arrange the placement through the department, and while in Palo Alto I would reconnect with the Gordian Knot Center at no added cost. If a Palantir placement is not available, the alternate is a Shield AI AIAD at the same estimated cost. Second, cloud compute and reference texts. LTC Webb trains the agent on MIT SuperCloud, but my own baseline runs and cost-sensitivity sweeps need GPU time a cadet laptop cannot provide; my TDAC agent alone needed roughly 900,000 training steps. Optimization solvers (e.g., Gurobi) are free under academic licenses and are not included in the budget.</w:t>
+        <w:t xml:space="preserve">The funding supports two lines of effort that directly advance the research in paragraph 3. First, a three-week research AIAD in summer 2027 at the MIT Center for Transportation &amp; Logistics in Cambridge, MA, where LTC Webb developed the reinforcement-learning interdiction method with Dr. Chris Caplice. Working alongside that group, I would extend the Taiwan model and test the trained attacker against new network types, with placement coordinated through LTC Webb and the department. If an MIT placement cannot be arranged, the alternate is a research AIAD with Stanford’s Gordian Knot Center, whose leaders I met this summer, at the same estimated cost. Second, cloud compute and reference texts. LTC Webb trains the agent on MIT SuperCloud, but my own baseline runs and cost-sensitivity sweeps need GPU time a cadet laptop cannot provide; my TDAC agent alone needed roughly 900,000 training steps. Optimization solvers (e.g., Gurobi) are free under academic licenses and are not included in the budget. Separately, I would seek a Palantir AIAD with the Maven team through the Velocity Scholars’ priority fill; it is not included in this budget.</w:t>
       </w:r>
     </w:p>
     <w:p>
@@ -480,7 +480,7 @@
           <w:sz w:val="24"/>
           <w:szCs w:val="24"/>
         </w:rPr>
-        <w:t xml:space="preserve">Travel supports the summer AIAD, completed well before graduation.</w:t>
+        <w:t xml:space="preserve">Travel supports the summer research AIAD, completed well before graduation.</w:t>
       </w:r>
     </w:p>
     <w:p>
@@ -714,7 +714,7 @@
                 <w:sz w:val="22"/>
                 <w:szCs w:val="22"/>
               </w:rPr>
-              <w:t xml:space="preserve">Palantir Technologies, Maven team (alt: Shield AI)</w:t>
+              <w:t xml:space="preserve">MIT Center for Transportation &amp; Logistics (alt: Stanford Gordian Knot Center)</w:t>
             </w:r>
           </w:p>
         </w:tc>
@@ -736,7 +736,7 @@
                 <w:sz w:val="22"/>
                 <w:szCs w:val="22"/>
               </w:rPr>
-              <w:t xml:space="preserve">Palo Alto, CA</w:t>
+              <w:t xml:space="preserve">Cambridge, MA (alt: Stanford, CA)</w:t>
             </w:r>
           </w:p>
         </w:tc>
@@ -1411,7 +1411,7 @@
           <w:sz w:val="24"/>
           <w:szCs w:val="24"/>
         </w:rPr>
-        <w:t xml:space="preserve">Nov–Dec 2026: confirm the Palantir placement through the department and my contacts from the summer visit. Jan 2027: purchase references and begin cloud compute (used through May 2027). Jun–Jul 2027: complete the AIAD. All funds will be spent by 31 July 2027, well before my graduation in May 2029.</w:t>
+        <w:t xml:space="preserve">Nov–Dec 2026: coordinate the MIT research placement with LTC Webb and the department. Jan 2027: purchase references and begin cloud compute (used through May 2027). Jun–Jul 2027: complete the AIAD. All funds will be spent by 31 July 2027, well before my graduation in May 2029.</w:t>
       </w:r>
     </w:p>
     <w:p>

</xml_diff>

<commit_message>
Trim budget to sourced items: AIAD ($6,700 per LOI) and Network Flows text ($224); keep compute vague
Co-Authored-By: Claude Opus 5.5 <noreply@anthropic.com>
Claude-Session: https://claude.ai/code/session_01HUa9sxRc7o7bsnuzSz3H5S
</commit_message>
<xml_diff>
--- a/application/Pezan_DXDT_Application_Memo_DRAFT.docx
+++ b/application/Pezan_DXDT_Application_Memo_DRAFT.docx
@@ -437,7 +437,7 @@
           <w:sz w:val="24"/>
           <w:szCs w:val="24"/>
         </w:rPr>
-        <w:t xml:space="preserve">The funding supports two lines of effort that directly advance the research in paragraph 3. First, a three-week research AIAD in summer 2027 at the MIT Center for Transportation &amp; Logistics in Cambridge, MA, where LTC Webb developed the reinforcement-learning interdiction method with Dr. Chris Caplice. Working alongside that group, I would extend the Taiwan model and test the trained attacker against new network types, with placement coordinated through LTC Webb and the department. If an MIT placement cannot be arranged, the alternate is a research AIAD with Stanford’s Gordian Knot Center, whose leaders I met this summer, at the same estimated cost. Second, cloud compute and reference texts. LTC Webb trains the agent on MIT SuperCloud, but my own baseline runs and cost-sensitivity sweeps need GPU time a cadet laptop cannot provide; my TDAC agent alone needed roughly 900,000 training steps. Optimization solvers (e.g., Gurobi) are free under academic licenses and are not included in the budget. Separately, I would seek a Palantir AIAD with the Maven team through the Velocity Scholars’ priority fill; it is not included in this budget.</w:t>
+        <w:t xml:space="preserve">The funding supports two lines of effort that directly advance the research in paragraph 3. First, a three-week research AIAD in summer 2027 at the MIT Center for Transportation &amp; Logistics in Cambridge, MA, where LTC Webb developed the reinforcement-learning interdiction method with Dr. Chris Caplice. Working alongside that group, I would extend the Taiwan model and test the trained attacker against new network types, with placement coordinated through LTC Webb and the department. If an MIT placement cannot be arranged, the alternate is a research AIAD with Stanford’s Gordian Knot Center, whose leaders I met this summer, at the same estimated cost. Second, a copy of Ahuja, Magnanti, and Orlin’s Network Flows, the standard reference on the maximum-flow and minimum-cut models that network interdiction is built on.</w:t>
       </w:r>
     </w:p>
     <w:p>
@@ -824,7 +824,7 @@
           <w:sz w:val="24"/>
           <w:szCs w:val="24"/>
         </w:rPr>
-        <w:t xml:space="preserve">Compute and references for model development during the academic year (prices are estimates).</w:t>
+        <w:t xml:space="preserve">Reference text for the network-flow models the project is built on.</w:t>
       </w:r>
     </w:p>
     <w:tbl>
@@ -1011,7 +1011,7 @@
                 <w:sz w:val="22"/>
                 <w:szCs w:val="22"/>
               </w:rPr>
-              <w:t xml:space="preserve">Cloud GPU compute (model training)</w:t>
+              <w:t xml:space="preserve">Textbook: Ahuja, Magnanti &amp; Orlin, Network Flows (ISBN 9780136175490)</w:t>
             </w:r>
           </w:p>
         </w:tc>
@@ -1033,122 +1033,7 @@
                 <w:sz w:val="22"/>
                 <w:szCs w:val="22"/>
               </w:rPr>
-              <w:t xml:space="preserve">AWS or Google Cloud</w:t>
-            </w:r>
-          </w:p>
-        </w:tc>
-        <w:tc>
-          <w:tcPr>
-            <w:tcW w:w="1890" w:type="dxa"/>
-            <w:vAlign w:val="center"/>
-          </w:tcPr>
-          <w:p>
-            <w:pPr>
-              <w:jc w:val="center"/>
-              <w:rPr>
-                <w:sz w:val="22"/>
-                <w:szCs w:val="22"/>
-              </w:rPr>
-            </w:pPr>
-            <w:r>
-              <w:rPr>
-                <w:sz w:val="22"/>
-                <w:szCs w:val="22"/>
-              </w:rPr>
-              <w:t xml:space="preserve">250 hours</w:t>
-            </w:r>
-          </w:p>
-        </w:tc>
-        <w:tc>
-          <w:tcPr>
-            <w:tcW w:w="1530" w:type="dxa"/>
-            <w:vAlign w:val="center"/>
-          </w:tcPr>
-          <w:p>
-            <w:pPr>
-              <w:jc w:val="center"/>
-              <w:rPr>
-                <w:sz w:val="22"/>
-                <w:szCs w:val="22"/>
-              </w:rPr>
-            </w:pPr>
-            <w:r>
-              <w:rPr>
-                <w:sz w:val="22"/>
-                <w:szCs w:val="22"/>
-              </w:rPr>
-              <w:t xml:space="preserve">$2.00/hr</w:t>
-            </w:r>
-          </w:p>
-        </w:tc>
-        <w:tc>
-          <w:tcPr>
-            <w:tcW w:w="1710" w:type="dxa"/>
-            <w:vAlign w:val="center"/>
-          </w:tcPr>
-          <w:p>
-            <w:pPr>
-              <w:jc w:val="center"/>
-              <w:rPr>
-                <w:sz w:val="22"/>
-                <w:szCs w:val="22"/>
-              </w:rPr>
-            </w:pPr>
-            <w:r>
-              <w:rPr>
-                <w:sz w:val="22"/>
-                <w:szCs w:val="22"/>
-              </w:rPr>
-              <w:t xml:space="preserve">$500</w:t>
-            </w:r>
-          </w:p>
-        </w:tc>
-      </w:tr>
-      <w:tr>
-        <w:trPr>
-          <w:cantSplit/>
-        </w:trPr>
-        <w:tc>
-          <w:tcPr>
-            <w:tcW w:w="2137" w:type="dxa"/>
-            <w:vAlign w:val="center"/>
-          </w:tcPr>
-          <w:p>
-            <w:pPr>
-              <w:jc w:val="center"/>
-              <w:rPr>
-                <w:sz w:val="22"/>
-                <w:szCs w:val="22"/>
-              </w:rPr>
-            </w:pPr>
-            <w:r>
-              <w:rPr>
-                <w:sz w:val="22"/>
-                <w:szCs w:val="22"/>
-              </w:rPr>
-              <w:t xml:space="preserve">Textbook: Bertsimas &amp; Tsitsiklis, Linear Optimization</w:t>
-            </w:r>
-          </w:p>
-        </w:tc>
-        <w:tc>
-          <w:tcPr>
-            <w:tcW w:w="1980" w:type="dxa"/>
-            <w:vAlign w:val="center"/>
-          </w:tcPr>
-          <w:p>
-            <w:pPr>
-              <w:jc w:val="center"/>
-              <w:rPr>
-                <w:sz w:val="22"/>
-                <w:szCs w:val="22"/>
-              </w:rPr>
-            </w:pPr>
-            <w:r>
-              <w:rPr>
-                <w:sz w:val="22"/>
-                <w:szCs w:val="22"/>
-              </w:rPr>
-              <w:t xml:space="preserve">Dynamic Ideas</w:t>
+              <w:t xml:space="preserve">Pearson (pearson.com)</w:t>
             </w:r>
           </w:p>
         </w:tc>
@@ -1192,7 +1077,7 @@
                 <w:sz w:val="22"/>
                 <w:szCs w:val="22"/>
               </w:rPr>
-              <w:t xml:space="preserve">$90</w:t>
+              <w:t xml:space="preserve">$224</w:t>
             </w:r>
           </w:p>
         </w:tc>
@@ -1214,122 +1099,7 @@
                 <w:sz w:val="22"/>
                 <w:szCs w:val="22"/>
               </w:rPr>
-              <w:t xml:space="preserve">$90</w:t>
-            </w:r>
-          </w:p>
-        </w:tc>
-      </w:tr>
-      <w:tr>
-        <w:trPr>
-          <w:cantSplit/>
-        </w:trPr>
-        <w:tc>
-          <w:tcPr>
-            <w:tcW w:w="2137" w:type="dxa"/>
-            <w:vAlign w:val="center"/>
-          </w:tcPr>
-          <w:p>
-            <w:pPr>
-              <w:jc w:val="center"/>
-              <w:rPr>
-                <w:sz w:val="22"/>
-                <w:szCs w:val="22"/>
-              </w:rPr>
-            </w:pPr>
-            <w:r>
-              <w:rPr>
-                <w:sz w:val="22"/>
-                <w:szCs w:val="22"/>
-              </w:rPr>
-              <w:t xml:space="preserve">Textbook: Ahuja, Magnanti &amp; Orlin, Network Flows</w:t>
-            </w:r>
-          </w:p>
-        </w:tc>
-        <w:tc>
-          <w:tcPr>
-            <w:tcW w:w="1980" w:type="dxa"/>
-            <w:vAlign w:val="center"/>
-          </w:tcPr>
-          <w:p>
-            <w:pPr>
-              <w:jc w:val="center"/>
-              <w:rPr>
-                <w:sz w:val="22"/>
-                <w:szCs w:val="22"/>
-              </w:rPr>
-            </w:pPr>
-            <w:r>
-              <w:rPr>
-                <w:sz w:val="22"/>
-                <w:szCs w:val="22"/>
-              </w:rPr>
-              <w:t xml:space="preserve">Pearson</w:t>
-            </w:r>
-          </w:p>
-        </w:tc>
-        <w:tc>
-          <w:tcPr>
-            <w:tcW w:w="1890" w:type="dxa"/>
-            <w:vAlign w:val="center"/>
-          </w:tcPr>
-          <w:p>
-            <w:pPr>
-              <w:jc w:val="center"/>
-              <w:rPr>
-                <w:sz w:val="22"/>
-                <w:szCs w:val="22"/>
-              </w:rPr>
-            </w:pPr>
-            <w:r>
-              <w:rPr>
-                <w:sz w:val="22"/>
-                <w:szCs w:val="22"/>
-              </w:rPr>
-              <w:t xml:space="preserve">1</w:t>
-            </w:r>
-          </w:p>
-        </w:tc>
-        <w:tc>
-          <w:tcPr>
-            <w:tcW w:w="1530" w:type="dxa"/>
-            <w:vAlign w:val="center"/>
-          </w:tcPr>
-          <w:p>
-            <w:pPr>
-              <w:jc w:val="center"/>
-              <w:rPr>
-                <w:sz w:val="22"/>
-                <w:szCs w:val="22"/>
-              </w:rPr>
-            </w:pPr>
-            <w:r>
-              <w:rPr>
-                <w:sz w:val="22"/>
-                <w:szCs w:val="22"/>
-              </w:rPr>
-              <w:t xml:space="preserve">$120</w:t>
-            </w:r>
-          </w:p>
-        </w:tc>
-        <w:tc>
-          <w:tcPr>
-            <w:tcW w:w="1710" w:type="dxa"/>
-            <w:vAlign w:val="center"/>
-          </w:tcPr>
-          <w:p>
-            <w:pPr>
-              <w:jc w:val="center"/>
-              <w:rPr>
-                <w:sz w:val="22"/>
-                <w:szCs w:val="22"/>
-              </w:rPr>
-            </w:pPr>
-            <w:r>
-              <w:rPr>
-                <w:sz w:val="22"/>
-                <w:szCs w:val="22"/>
-              </w:rPr>
-              <w:t xml:space="preserve">$120</w:t>
+              <w:t xml:space="preserve">$224</w:t>
             </w:r>
           </w:p>
         </w:tc>
@@ -1375,7 +1145,7 @@
           <w:sz w:val="24"/>
           <w:szCs w:val="24"/>
         </w:rPr>
-        <w:t xml:space="preserve">$7,410 ($6,700 travel + $710 compute and references), within the $10,000 limit.</w:t>
+        <w:t xml:space="preserve">$6,924 ($6,700 travel + $224 reference text), within the $10,000 limit.</w:t>
       </w:r>
     </w:p>
     <w:p>
@@ -1411,7 +1181,7 @@
           <w:sz w:val="24"/>
           <w:szCs w:val="24"/>
         </w:rPr>
-        <w:t xml:space="preserve">Nov–Dec 2026: coordinate the MIT research placement with LTC Webb and the department. Jan 2027: purchase references and begin cloud compute (used through May 2027). Jun–Jul 2027: complete the AIAD. All funds will be spent by 31 July 2027, well before my graduation in May 2029.</w:t>
+        <w:t xml:space="preserve">Nov–Dec 2026: coordinate the MIT research placement with LTC Webb and the department. Jan 2027: purchase the reference text. Jun–Jul 2027: complete the AIAD. All funds will be spent by 31 July 2027, well before my graduation in May 2029.</w:t>
       </w:r>
     </w:p>
     <w:p>

</xml_diff>

<commit_message>
Itemize funding plan with dates and per diem-based cost breakdown
Co-Authored-By: Claude Opus 5.5 <noreply@anthropic.com>
Claude-Session: https://claude.ai/code/session_01HUa9sxRc7o7bsnuzSz3H5S
</commit_message>
<xml_diff>
--- a/application/Pezan_DXDT_Application_Memo_DRAFT.docx
+++ b/application/Pezan_DXDT_Application_Memo_DRAFT.docx
@@ -437,7 +437,22 @@
           <w:sz w:val="24"/>
           <w:szCs w:val="24"/>
         </w:rPr>
-        <w:t xml:space="preserve">The funding supports two lines of effort that directly advance the research in paragraph 3. First, a three-week research AIAD in summer 2027 at the MIT Center for Transportation &amp; Logistics in Cambridge, MA, where LTC Webb developed the reinforcement-learning interdiction method with Dr. Chris Caplice. Working alongside that group, I would extend the Taiwan model and test the trained attacker against new network types, with placement coordinated through LTC Webb and the department. If an MIT placement cannot be arranged, the alternate is a research AIAD with Stanford’s Gordian Knot Center, whose leaders I met this summer, at the same estimated cost. Second, a copy of Ahuja, Magnanti, and Orlin’s Network Flows, the standard reference on the maximum-flow and minimum-cut models that network interdiction is built on.</w:t>
+        <w:t xml:space="preserve">In January 2027, I will spend $224 on a new copy of Ahuja, Magnanti, and Orlin’s Network Flows (Pearson), the standard reference on the maximum-flow and minimum-cut models that network interdiction is built on. I will use it this spring to build the optimization baselines that LTC Webb’s trained attacker is compared against in paragraph 3. From </w:t>
+      </w:r>
+      <w:r>
+        <w:rPr>
+          <w:sz w:val="24"/>
+          <w:szCs w:val="24"/>
+          <w:highlight w:val="yellow"/>
+        </w:rPr>
+        <w:t xml:space="preserve">[7–27 June 2027]</w:t>
+      </w:r>
+      <w:r>
+        <w:rPr>
+          <w:sz w:val="24"/>
+          <w:szCs w:val="24"/>
+        </w:rPr>
+        <w:t xml:space="preserve">, I will spend $6,700 on a three-week research AIAD at the MIT Center for Transportation &amp; Logistics in Cambridge, MA, where LTC Webb developed the reinforcement-learning interdiction method with Dr. Chris Caplice. Of that, $200 is round-trip train travel, $1,932 is meals and incidentals at the federal per diem rate for Boston/Cambridge ($92 per day for 21 days), and $4,568 is lodging for 20 nights (about $228 per night, below the $305 federal lodging rate). While there, I will extend the Taiwan model, test the trained attacker against at least one additional network, and brief the results to the group and LTC Webb before I leave. Those results will go into my Projects Day presentation. The placement will be coordinated through LTC Webb and the department; if it cannot be arranged, I will do the same research AIAD with Stanford’s Gordian Knot Center at the same cost.</w:t>
       </w:r>
     </w:p>
     <w:p>
@@ -758,7 +773,7 @@
                 <w:sz w:val="22"/>
                 <w:szCs w:val="22"/>
               </w:rPr>
-              <w:t xml:space="preserve">21 (Jun–Jul 2027)</w:t>
+              <w:t xml:space="preserve">21 ([7–27 Jun 2027])</w:t>
             </w:r>
           </w:p>
         </w:tc>
@@ -1181,7 +1196,22 @@
           <w:sz w:val="24"/>
           <w:szCs w:val="24"/>
         </w:rPr>
-        <w:t xml:space="preserve">Nov–Dec 2026: coordinate the MIT research placement with LTC Webb and the department. Jan 2027: purchase the reference text. Jun–Jul 2027: complete the AIAD. All funds will be spent by 31 July 2027, well before my graduation in May 2029.</w:t>
+        <w:t xml:space="preserve">Nov–Dec 2026: coordinate the MIT research placement with LTC Webb and the department. Jan 2027: purchase the reference text. </w:t>
+      </w:r>
+      <w:r>
+        <w:rPr>
+          <w:sz w:val="24"/>
+          <w:szCs w:val="24"/>
+          <w:highlight w:val="yellow"/>
+        </w:rPr>
+        <w:t xml:space="preserve">[7–27 June 2027]</w:t>
+      </w:r>
+      <w:r>
+        <w:rPr>
+          <w:sz w:val="24"/>
+          <w:szCs w:val="24"/>
+        </w:rPr>
+        <w:t xml:space="preserve">: complete the AIAD. All funds will be spent by 30 June 2027, well before my graduation in May 2029.</w:t>
       </w:r>
     </w:p>
     <w:p>

</xml_diff>

<commit_message>
Date the memo 2 November 2026
Co-Authored-By: Claude Opus 5.5 <noreply@anthropic.com>
Claude-Session: https://claude.ai/code/session_01HUa9sxRc7o7bsnuzSz3H5S
</commit_message>
<xml_diff>
--- a/application/Pezan_DXDT_Application_Memo_DRAFT.docx
+++ b/application/Pezan_DXDT_Application_Memo_DRAFT.docx
@@ -166,16 +166,8 @@
         <w:rPr>
           <w:sz w:val="24"/>
           <w:szCs w:val="24"/>
-          <w:highlight w:val="yellow"/>
-        </w:rPr>
-        <w:t xml:space="preserve">[DD]</w:t>
-      </w:r>
-      <w:r>
-        <w:rPr>
-          <w:sz w:val="24"/>
-          <w:szCs w:val="24"/>
-        </w:rPr>
-        <w:t xml:space="preserve"> October 2026</w:t>
+        </w:rPr>
+        <w:t xml:space="preserve">2 November 2026</w:t>
       </w:r>
     </w:p>
     <w:p>

</xml_diff>

<commit_message>
Rework memo funding plan: four events plus a Lincoln Laboratory AIAD
Replace the textbook and MIT CTL AIAD with AUSA Global Force, IEEE SIEDS,
the SCSP AI+ Expo and hackathon, the MORS Symposium, and an AIAD at MIT
Lincoln Laboratory, one paragraph per event, costed at FY2027 GSA per diem.

Co-Authored-By: Claude Opus 5.5 <noreply@anthropic.com>
Claude-Session: https://claude.ai/code/session_01HUa9sxRc7o7bsnuzSz3H5S
</commit_message>
<xml_diff>
--- a/application/Pezan_DXDT_Application_Memo_DRAFT.docx
+++ b/application/Pezan_DXDT_Application_Memo_DRAFT.docx
@@ -319,7 +319,7 @@
           <w:sz w:val="24"/>
           <w:szCs w:val="24"/>
         </w:rPr>
-        <w:t xml:space="preserve">Mr. Philippone has described data as the ammunition of the future and has framed a commander’s hardest choices as constrained optimization: finding the best decision across competing tradeoffs, fast enough to matter. This past summer I saw that idea from three angles. On the Sea to Shining Sea AIAD, Palantir’s team in Palo Alto walked us through Project Maven and how it gives commanders at every echelon a common picture to decide from. A few days later, at the 4th Infantry Division, we saw how a formation actually employs those systems and feeds lessons back to the developers. At Stanford’s Gordian Knot Center, Col. (Ret.) Joseph Felter and Jack Faherty described how student startups get new technology into the hands of Army units, and why that is so hard. Then, at my second AIAD with the Army’s Transformation Decision Analysis Center (TDAC), I built the other half: a reinforcement-learning model for contested resupply. This semester I am modeling how an adversary would cut a supply network. Models like these only matter once a platform puts them in front of a commander. I am pursuing the DXDT “Velocity” Scholarship for two reasons. First, its funding would let me take my interdiction research to the MIT Center for Transportation &amp; Logistics, where the methods I am building on were developed. Second, as a Velocity Scholar I would seek a Palantir AIAD with the Maven team, where I can learn how a fielded platform turns models like mine into decisions and bring that practice back to my research and my future formation.</w:t>
+        <w:t xml:space="preserve">Mr. Philippone has described data as the ammunition of the future and has framed a commander’s hardest choices as constrained optimization: finding the best decision across competing tradeoffs, fast enough to matter. This past summer I saw that idea from three angles. On the Sea to Shining Sea AIAD, Palantir’s team in Palo Alto walked us through Project Maven and how it gives commanders at every echelon a common picture to decide from. A few days later, at the 4th Infantry Division, we saw how a formation actually employs those systems and feeds lessons back to the developers. At Stanford’s Gordian Knot Center, Col. (Ret.) Joseph Felter and Jack Faherty described how student startups get new technology into the hands of Army units, and why that is so hard. Then, at my second AIAD with the Army’s Transformation Decision Analysis Center (TDAC), I built the other half: a reinforcement-learning model for contested resupply. This semester I am modeling how an adversary would cut a supply network. Models like these only matter once a platform puts them in front of a commander. I am pursuing the DXDT “Velocity” Scholarship for two reasons. First, its funding would take my interdiction research out of the classroom: to Army and defense conferences where I can present it, a hackathon where I can compete, and MIT Lincoln Laboratory, where I can learn how tools like it are tested before they reach a commander. Second, as a Velocity Scholar I would seek a Palantir AIAD with the Maven team, where I can learn how a fielded platform turns models like mine into decisions and bring that practice back to my research and my future formation.</w:t>
       </w:r>
     </w:p>
     <w:p>
@@ -358,7 +358,7 @@
           <w:sz w:val="24"/>
           <w:szCs w:val="24"/>
         </w:rPr>
-        <w:t xml:space="preserve">My near-term goal is to build a cadet research program that combines reinforcement learning and network optimization for contested logistics. At TDAC I redesigned the reward function for a reinforcement-learning agent that allocates resupply in Logistics Battle Command, the Army’s sustainment simulation. I built diagnostic tools that exposed why a high-scoring agent was starving the priority unit, and the retrained agent more than tripled the share of requests filled. This semester I am working on network interdiction with my advisor, LTC Matthew Webb, whose doctoral research with the MIT Center for Transportation &amp; Logistics developed a reinforcement-learning approach to maximum-flow network interdiction (Webb and Caplice, submitted to Networks). My project asks where an adversary with a fixed effort budget should act to cut Taiwan’s crude oil supply, and whether LTC Webb’s reinforcement-learning attacker, trained on Ukraine’s rail network, still finds strong strategies on sea lanes. I have built a 57-node, 79-edge model of Taiwan’s crude import routes from open sources, with sourced capacities and seven costed adversary actions, connected it to his code, and verified it against an independent max-flow calculation. Early checks show that no single action hurts Taiwan, because supply reroutes, while combined actions do. Over the coming year I will (1) compare optimization baselines against the trained agent, (2) test how the adversary’s best plan changes as blockade and cyber costs vary, and (3) report whether a rail-trained attacker transfers to a maritime network. I will present the results at Projects Day.</w:t>
+        <w:t xml:space="preserve">My near-term goal is to build a cadet research program that combines reinforcement learning and network optimization for contested logistics. At TDAC I redesigned the reward function for a reinforcement-learning agent that allocates resupply in Logistics Battle Command, the Army’s sustainment simulation. I built diagnostic tools that exposed why a high-scoring agent was starving the priority unit, and the retrained agent more than tripled the share of requests filled. This semester I am working on network interdiction with my advisor, LTC Matthew Webb, whose doctoral research with the MIT Center for Transportation &amp; Logistics developed a reinforcement-learning approach to maximum-flow network interdiction (Webb and Caplice, submitted to Networks). My project asks where an adversary with a fixed effort budget should act to cut Taiwan’s crude oil supply, and whether LTC Webb’s reinforcement-learning attacker, trained on Ukraine’s rail network, still finds strong strategies on sea lanes. I have built a 57-node, 79-edge model of Taiwan’s crude import routes from open sources, with sourced capacities and seven costed adversary actions, connected it to his code, and verified it against an independent max-flow calculation. Early checks show that no single action hurts Taiwan, because supply reroutes, while combined actions do. Over the coming year I will (1) compare optimization baselines against the trained agent, (2) test how the adversary’s best plan changes as blockade and cyber costs vary, and (3) report whether a rail-trained attacker transfers to a maritime network. I will present the results at Projects Day and at the conferences in paragraph 4.</w:t>
       </w:r>
     </w:p>
     <w:p>
@@ -429,7 +429,29 @@
           <w:sz w:val="24"/>
           <w:szCs w:val="24"/>
         </w:rPr>
-        <w:t xml:space="preserve">In January 2027, I will spend $224 on a new copy of Ahuja, Magnanti, and Orlin’s Network Flows (Pearson), the standard reference on the maximum-flow and minimum-cut models that network interdiction is built on. I will use it this spring to build the optimization baselines that LTC Webb’s trained attacker is compared against in paragraph 3. From </w:t>
+        <w:t xml:space="preserve">From 16–18 March 2027, I will spend $500 to fly to Huntsville, AL, and $477 on lodging and meals to attend the AUSA Global Force Symposium, hosted with Army Materiel Command. My Taiwan model plays the attacker; Global Force is where the Army’s sustainment leaders explain how they plan to keep supply moving in a contested theater. I will bring their constraints back into the defender side of my model.</w:t>
+      </w:r>
+    </w:p>
+    <w:p>
+      <w:pPr>
+        <w:pStyle w:val="ListParagraph"/>
+        <w:tabs>
+          <w:tab w:val="left" w:pos="4680"/>
+        </w:tabs>
+        <w:spacing w:before="120"/>
+        <w:ind w:left="660"/>
+        <w:contextualSpacing w:val="0"/>
+        <w:rPr>
+          <w:sz w:val="24"/>
+          <w:szCs w:val="24"/>
+        </w:rPr>
+      </w:pPr>
+      <w:r>
+        <w:rPr>
+          <w:sz w:val="24"/>
+          <w:szCs w:val="24"/>
+        </w:rPr>
+        <w:t xml:space="preserve">In </w:t>
       </w:r>
       <w:r>
         <w:rPr>
@@ -437,14 +459,132 @@
           <w:szCs w:val="24"/>
           <w:highlight w:val="yellow"/>
         </w:rPr>
-        <w:t xml:space="preserve">[7–27 June 2027]</w:t>
+        <w:t xml:space="preserve">[early May 2027]</w:t>
       </w:r>
       <w:r>
         <w:rPr>
           <w:sz w:val="24"/>
           <w:szCs w:val="24"/>
         </w:rPr>
-        <w:t xml:space="preserve">, I will spend $6,700 on a three-week research AIAD at the MIT Center for Transportation &amp; Logistics in Cambridge, MA, where LTC Webb developed the reinforcement-learning interdiction method with Dr. Chris Caplice. Of that, $200 is round-trip train travel, $1,932 is meals and incidentals at the federal per diem rate for Boston/Cambridge ($92 per day for 21 days), and $4,568 is lodging for 20 nights (about $228 per night, below the $305 federal lodging rate). While there, I will extend the Taiwan model, test the trained attacker against at least one additional network, and brief the results to the group and LTC Webb before I leave. Those results will go into my Projects Day presentation. The placement will be coordinated through LTC Webb and the department; if it cannot be arranged, I will do the same research AIAD with Stanford’s Gordian Knot Center at the same cost.</w:t>
+        <w:t xml:space="preserve">, I will spend $250 on train travel and $262 on lodging and meals to present my interdiction results at the IEEE Systems and Information Engineering Design Symposium (SIEDS) at the University of Virginia, if my paper is accepted. Accepted papers are published in IEEE Xplore, which would give the project a peer-reviewed, citable result for the department.</w:t>
+      </w:r>
+    </w:p>
+    <w:p>
+      <w:pPr>
+        <w:pStyle w:val="ListParagraph"/>
+        <w:tabs>
+          <w:tab w:val="left" w:pos="4680"/>
+        </w:tabs>
+        <w:spacing w:before="120"/>
+        <w:ind w:left="660"/>
+        <w:contextualSpacing w:val="0"/>
+        <w:rPr>
+          <w:sz w:val="24"/>
+          <w:szCs w:val="24"/>
+        </w:rPr>
+      </w:pPr>
+      <w:r>
+        <w:rPr>
+          <w:sz w:val="24"/>
+          <w:szCs w:val="24"/>
+        </w:rPr>
+        <w:t xml:space="preserve">From 23–25 May 2027, I will spend $250 on train travel and $820 on lodging and meals to attend the SCSP AI+ Expo in Washington, DC, the largest gathering of defense-technology companies and government AI leaders in the country. If SCSP runs its National Security Technology Hackathon again, I will enter with a team of cadets; in 2026, finalists demonstrated their prototypes on stage at the Expo. The Expo also lets me follow up in person with the Palantir team I met this summer.</w:t>
+      </w:r>
+    </w:p>
+    <w:p>
+      <w:pPr>
+        <w:pStyle w:val="ListParagraph"/>
+        <w:tabs>
+          <w:tab w:val="left" w:pos="4680"/>
+        </w:tabs>
+        <w:spacing w:before="120"/>
+        <w:ind w:left="660"/>
+        <w:contextualSpacing w:val="0"/>
+        <w:rPr>
+          <w:sz w:val="24"/>
+          <w:szCs w:val="24"/>
+        </w:rPr>
+      </w:pPr>
+      <w:r>
+        <w:rPr>
+          <w:sz w:val="24"/>
+          <w:szCs w:val="24"/>
+        </w:rPr>
+        <w:t xml:space="preserve">In </w:t>
+      </w:r>
+      <w:r>
+        <w:rPr>
+          <w:sz w:val="24"/>
+          <w:szCs w:val="24"/>
+          <w:highlight w:val="yellow"/>
+        </w:rPr>
+        <w:t xml:space="preserve">[June 2027]</w:t>
+      </w:r>
+      <w:r>
+        <w:rPr>
+          <w:sz w:val="24"/>
+          <w:szCs w:val="24"/>
+        </w:rPr>
+        <w:t xml:space="preserve">, I will spend about $1,329 on airfare, lodging, and meals to attend the 95th Military Operations Research Society (MORS) Symposium, where Army and Defense Department analysts present the models that inform force decisions. I will submit my Taiwan study to a working group and present it if accepted; this is the community I intend to join as an FA49.</w:t>
+      </w:r>
+    </w:p>
+    <w:p>
+      <w:pPr>
+        <w:pStyle w:val="ListParagraph"/>
+        <w:tabs>
+          <w:tab w:val="left" w:pos="4680"/>
+        </w:tabs>
+        <w:spacing w:before="120"/>
+        <w:ind w:left="660"/>
+        <w:contextualSpacing w:val="0"/>
+        <w:rPr>
+          <w:sz w:val="24"/>
+          <w:szCs w:val="24"/>
+        </w:rPr>
+      </w:pPr>
+      <w:r>
+        <w:rPr>
+          <w:sz w:val="24"/>
+          <w:szCs w:val="24"/>
+        </w:rPr>
+        <w:t xml:space="preserve">Finally, from </w:t>
+      </w:r>
+      <w:r>
+        <w:rPr>
+          <w:sz w:val="24"/>
+          <w:szCs w:val="24"/>
+          <w:highlight w:val="yellow"/>
+        </w:rPr>
+        <w:t xml:space="preserve">[12–30 July 2027]</w:t>
+      </w:r>
+      <w:r>
+        <w:rPr>
+          <w:sz w:val="24"/>
+          <w:szCs w:val="24"/>
+        </w:rPr>
+        <w:t xml:space="preserve">, I will spend $5,703 on housing, food, and transportation for a three-week AIAD at MIT Lincoln Laboratory in Lexington, MA: $200 for train travel, $3,740 for 20 nights of lodging, and $1,763 for meals. Lincoln Laboratory builds and tests decision-support and reinforcement-learning tools for Defense Department planning problems. My TDAC work showed how an agent can score well while failing the unit that matters most. At Lincoln Laboratory I want to learn how professional engineers test and evaluate these systems before they reach operators, and bring that discipline back to my research and to cadet research in the department.</w:t>
+      </w:r>
+    </w:p>
+    <w:p>
+      <w:pPr>
+        <w:pStyle w:val="ListParagraph"/>
+        <w:tabs>
+          <w:tab w:val="left" w:pos="4680"/>
+        </w:tabs>
+        <w:spacing w:before="120"/>
+        <w:ind w:left="660"/>
+        <w:contextualSpacing w:val="0"/>
+        <w:rPr>
+          <w:sz w:val="24"/>
+          <w:szCs w:val="24"/>
+        </w:rPr>
+      </w:pPr>
+      <w:r>
+        <w:rPr>
+          <w:sz w:val="24"/>
+          <w:szCs w:val="24"/>
+        </w:rPr>
+        <w:t xml:space="preserve">The remaining $409 will pay conference registration and paper fees (SIEDS and MORS). All lodging and meal estimates use FY2027 federal per diem rates.</w:t>
       </w:r>
     </w:p>
     <w:p>
@@ -487,7 +627,7 @@
           <w:sz w:val="24"/>
           <w:szCs w:val="24"/>
         </w:rPr>
-        <w:t xml:space="preserve">Travel supports the summer research AIAD, completed well before graduation.</w:t>
+        <w:t xml:space="preserve">Five trips, in order, all completed by July 2027.</w:t>
       </w:r>
     </w:p>
     <w:p>
@@ -681,6 +821,9 @@
         </w:tc>
       </w:tr>
       <w:tr>
+        <w:trPr>
+          <w:cantSplit/>
+        </w:trPr>
         <w:tc>
           <w:tcPr>
             <w:tcW w:w="2137" w:type="dxa"/>
@@ -699,7 +842,7 @@
                 <w:sz w:val="22"/>
                 <w:szCs w:val="22"/>
               </w:rPr>
-              <w:t xml:space="preserve">AIAD</w:t>
+              <w:t xml:space="preserve">Conference</w:t>
             </w:r>
           </w:p>
         </w:tc>
@@ -721,7 +864,7 @@
                 <w:sz w:val="22"/>
                 <w:szCs w:val="22"/>
               </w:rPr>
-              <w:t xml:space="preserve">MIT Center for Transportation &amp; Logistics (alt: Stanford Gordian Knot Center)</w:t>
+              <w:t xml:space="preserve">AUSA Global Force Symposium</w:t>
             </w:r>
           </w:p>
         </w:tc>
@@ -743,7 +886,7 @@
                 <w:sz w:val="22"/>
                 <w:szCs w:val="22"/>
               </w:rPr>
-              <w:t xml:space="preserve">Cambridge, MA (alt: Stanford, CA)</w:t>
+              <w:t xml:space="preserve">Huntsville, AL</w:t>
             </w:r>
           </w:p>
         </w:tc>
@@ -765,7 +908,7 @@
                 <w:sz w:val="22"/>
                 <w:szCs w:val="22"/>
               </w:rPr>
-              <w:t xml:space="preserve">21 ([7–27 Jun 2027])</w:t>
+              <w:t xml:space="preserve">16–18 Mar 2027 (3 days)</w:t>
             </w:r>
           </w:p>
         </w:tc>
@@ -787,211 +930,7 @@
                 <w:sz w:val="22"/>
                 <w:szCs w:val="22"/>
               </w:rPr>
-              <w:t xml:space="preserve">$6,700</w:t>
-            </w:r>
-          </w:p>
-        </w:tc>
-      </w:tr>
-    </w:tbl>
-    <w:p>
-      <w:pPr>
-        <w:tabs>
-          <w:tab w:val="left" w:pos="4680"/>
-        </w:tabs>
-        <w:rPr>
-          <w:sz w:val="24"/>
-          <w:szCs w:val="24"/>
-        </w:rPr>
-      </w:pPr>
-    </w:p>
-    <w:p>
-      <w:pPr>
-        <w:pStyle w:val="ListParagraph"/>
-        <w:numPr>
-          <w:ilvl w:val="0"/>
-          <w:numId w:val="28"/>
-        </w:numPr>
-        <w:tabs>
-          <w:tab w:val="left" w:pos="4680"/>
-        </w:tabs>
-        <w:rPr>
-          <w:sz w:val="24"/>
-          <w:szCs w:val="24"/>
-        </w:rPr>
-      </w:pPr>
-      <w:r>
-        <w:rPr>
-          <w:sz w:val="24"/>
-          <w:szCs w:val="24"/>
-        </w:rPr>
-        <w:t xml:space="preserve">Equipment, Materials, or Supplies. </w:t>
-      </w:r>
-      <w:r>
-        <w:rPr>
-          <w:sz w:val="24"/>
-          <w:szCs w:val="24"/>
-        </w:rPr>
-        <w:t xml:space="preserve">Reference text for the network-flow models the project is built on.</w:t>
-      </w:r>
-    </w:p>
-    <w:tbl>
-      <w:tblPr>
-        <w:tblW w:w="9247" w:type="dxa"/>
-        <w:tblInd w:w="108" w:type="dxa"/>
-        <w:tblBorders>
-          <w:top w:val="single" w:color="auto" w:sz="4" w:space="0"/>
-          <w:left w:val="single" w:color="auto" w:sz="4" w:space="0"/>
-          <w:bottom w:val="single" w:color="auto" w:sz="4" w:space="0"/>
-          <w:right w:val="single" w:color="auto" w:sz="4" w:space="0"/>
-          <w:insideH w:val="single" w:color="auto" w:sz="4" w:space="0"/>
-          <w:insideV w:val="single" w:color="auto" w:sz="4" w:space="0"/>
-        </w:tblBorders>
-        <w:tblLayout w:type="fixed"/>
-        <w:tblLook w:val="01E0" w:firstRow="1" w:lastRow="1" w:firstColumn="1" w:lastColumn="1" w:noHBand="0" w:noVBand="0"/>
-      </w:tblPr>
-      <w:tblGrid>
-        <w:gridCol w:w="2137"/>
-        <w:gridCol w:w="1980"/>
-        <w:gridCol w:w="1890"/>
-        <w:gridCol w:w="1530"/>
-        <w:gridCol w:w="1710"/>
-      </w:tblGrid>
-      <w:tr>
-        <w:trPr>
-          <w:trHeight w:val="620"/>
-        </w:trPr>
-        <w:tc>
-          <w:tcPr>
-            <w:tcW w:w="2137" w:type="dxa"/>
-          </w:tcPr>
-          <w:p>
-            <w:pPr>
-              <w:jc w:val="center"/>
-              <w:rPr>
-                <w:rFonts w:eastAsia="Batang"/>
-                <w:b/>
-                <w:bCs/>
-                <w:sz w:val="22"/>
-                <w:szCs w:val="22"/>
-              </w:rPr>
-            </w:pPr>
-            <w:r>
-              <w:rPr>
-                <w:b/>
-                <w:bCs/>
-                <w:sz w:val="22"/>
-                <w:szCs w:val="22"/>
-              </w:rPr>
-              <w:t>Item</w:t>
-            </w:r>
-          </w:p>
-        </w:tc>
-        <w:tc>
-          <w:tcPr>
-            <w:tcW w:w="1980" w:type="dxa"/>
-          </w:tcPr>
-          <w:p>
-            <w:pPr>
-              <w:jc w:val="center"/>
-              <w:rPr>
-                <w:rFonts w:eastAsia="Batang"/>
-                <w:sz w:val="22"/>
-                <w:szCs w:val="22"/>
-              </w:rPr>
-            </w:pPr>
-            <w:r>
-              <w:rPr>
-                <w:b/>
-                <w:bCs/>
-                <w:sz w:val="22"/>
-                <w:szCs w:val="22"/>
-              </w:rPr>
-              <w:t>Vendor</w:t>
-            </w:r>
-            <w:r>
-              <w:rPr>
-                <w:sz w:val="22"/>
-                <w:szCs w:val="22"/>
-              </w:rPr>
-              <w:t xml:space="preserve"> (provide link to your item, if possible)</w:t>
-            </w:r>
-          </w:p>
-        </w:tc>
-        <w:tc>
-          <w:tcPr>
-            <w:tcW w:w="1890" w:type="dxa"/>
-          </w:tcPr>
-          <w:p>
-            <w:pPr>
-              <w:jc w:val="center"/>
-              <w:rPr>
-                <w:rFonts w:eastAsia="Batang"/>
-                <w:b/>
-                <w:bCs/>
-                <w:sz w:val="22"/>
-                <w:szCs w:val="22"/>
-              </w:rPr>
-            </w:pPr>
-            <w:r>
-              <w:rPr>
-                <w:b/>
-                <w:bCs/>
-                <w:sz w:val="22"/>
-                <w:szCs w:val="22"/>
-              </w:rPr>
-              <w:t>Quantity</w:t>
-            </w:r>
-          </w:p>
-        </w:tc>
-        <w:tc>
-          <w:tcPr>
-            <w:tcW w:w="1530" w:type="dxa"/>
-          </w:tcPr>
-          <w:p>
-            <w:pPr>
-              <w:jc w:val="center"/>
-              <w:rPr>
-                <w:rFonts w:eastAsia="Batang"/>
-                <w:b/>
-                <w:bCs/>
-                <w:sz w:val="22"/>
-                <w:szCs w:val="22"/>
-              </w:rPr>
-            </w:pPr>
-            <w:r>
-              <w:rPr>
-                <w:b/>
-                <w:bCs/>
-                <w:sz w:val="22"/>
-                <w:szCs w:val="22"/>
-              </w:rPr>
-              <w:t>Unit Cost</w:t>
-            </w:r>
-          </w:p>
-        </w:tc>
-        <w:tc>
-          <w:tcPr>
-            <w:tcW w:w="1710" w:type="dxa"/>
-          </w:tcPr>
-          <w:p>
-            <w:pPr>
-              <w:jc w:val="center"/>
-              <w:rPr>
-                <w:rFonts w:eastAsia="Batang"/>
-                <w:b/>
-                <w:bCs/>
-                <w:sz w:val="22"/>
-                <w:szCs w:val="22"/>
-              </w:rPr>
-            </w:pPr>
-            <w:r>
-              <w:rPr>
-                <w:b/>
-                <w:bCs/>
-                <w:sz w:val="22"/>
-                <w:szCs w:val="22"/>
-              </w:rPr>
-              <w:t>Total Cost</w:t>
+              <w:t xml:space="preserve">$977</w:t>
             </w:r>
           </w:p>
         </w:tc>
@@ -1018,7 +957,7 @@
                 <w:sz w:val="22"/>
                 <w:szCs w:val="22"/>
               </w:rPr>
-              <w:t xml:space="preserve">Textbook: Ahuja, Magnanti &amp; Orlin, Network Flows (ISBN 9780136175490)</w:t>
+              <w:t xml:space="preserve">Conference (present)</w:t>
             </w:r>
           </w:p>
         </w:tc>
@@ -1040,7 +979,7 @@
                 <w:sz w:val="22"/>
                 <w:szCs w:val="22"/>
               </w:rPr>
-              <w:t xml:space="preserve">Pearson (pearson.com)</w:t>
+              <w:t xml:space="preserve">IEEE SIEDS, University of Virginia</w:t>
             </w:r>
           </w:p>
         </w:tc>
@@ -1062,7 +1001,7 @@
                 <w:sz w:val="22"/>
                 <w:szCs w:val="22"/>
               </w:rPr>
-              <w:t xml:space="preserve">1</w:t>
+              <w:t xml:space="preserve">Charlottesville, VA</w:t>
             </w:r>
           </w:p>
         </w:tc>
@@ -1083,8 +1022,16 @@
               <w:rPr>
                 <w:sz w:val="22"/>
                 <w:szCs w:val="22"/>
-              </w:rPr>
-              <w:t xml:space="preserve">$224</w:t>
+                <w:highlight w:val="yellow"/>
+              </w:rPr>
+              <w:t xml:space="preserve">[Early May 2027]</w:t>
+            </w:r>
+            <w:r>
+              <w:rPr>
+                <w:sz w:val="22"/>
+                <w:szCs w:val="22"/>
+              </w:rPr>
+              <w:t xml:space="preserve"> (2 days)</w:t>
             </w:r>
           </w:p>
         </w:tc>
@@ -1106,7 +1053,369 @@
                 <w:sz w:val="22"/>
                 <w:szCs w:val="22"/>
               </w:rPr>
-              <w:t xml:space="preserve">$224</w:t>
+              <w:t xml:space="preserve">$512</w:t>
+            </w:r>
+          </w:p>
+        </w:tc>
+      </w:tr>
+      <w:tr>
+        <w:trPr>
+          <w:cantSplit/>
+        </w:trPr>
+        <w:tc>
+          <w:tcPr>
+            <w:tcW w:w="2137" w:type="dxa"/>
+            <w:vAlign w:val="center"/>
+          </w:tcPr>
+          <w:p>
+            <w:pPr>
+              <w:jc w:val="center"/>
+              <w:rPr>
+                <w:sz w:val="22"/>
+                <w:szCs w:val="22"/>
+              </w:rPr>
+            </w:pPr>
+            <w:r>
+              <w:rPr>
+                <w:sz w:val="22"/>
+                <w:szCs w:val="22"/>
+              </w:rPr>
+              <w:t xml:space="preserve">Conference and hackathon</w:t>
+            </w:r>
+          </w:p>
+        </w:tc>
+        <w:tc>
+          <w:tcPr>
+            <w:tcW w:w="1980" w:type="dxa"/>
+            <w:vAlign w:val="center"/>
+          </w:tcPr>
+          <w:p>
+            <w:pPr>
+              <w:jc w:val="center"/>
+              <w:rPr>
+                <w:sz w:val="22"/>
+                <w:szCs w:val="22"/>
+              </w:rPr>
+            </w:pPr>
+            <w:r>
+              <w:rPr>
+                <w:sz w:val="22"/>
+                <w:szCs w:val="22"/>
+              </w:rPr>
+              <w:t xml:space="preserve">SCSP AI+ Expo</w:t>
+            </w:r>
+          </w:p>
+        </w:tc>
+        <w:tc>
+          <w:tcPr>
+            <w:tcW w:w="1890" w:type="dxa"/>
+            <w:vAlign w:val="center"/>
+          </w:tcPr>
+          <w:p>
+            <w:pPr>
+              <w:jc w:val="center"/>
+              <w:rPr>
+                <w:sz w:val="22"/>
+                <w:szCs w:val="22"/>
+              </w:rPr>
+            </w:pPr>
+            <w:r>
+              <w:rPr>
+                <w:sz w:val="22"/>
+                <w:szCs w:val="22"/>
+              </w:rPr>
+              <w:t xml:space="preserve">Washington, DC</w:t>
+            </w:r>
+          </w:p>
+        </w:tc>
+        <w:tc>
+          <w:tcPr>
+            <w:tcW w:w="1530" w:type="dxa"/>
+            <w:vAlign w:val="center"/>
+          </w:tcPr>
+          <w:p>
+            <w:pPr>
+              <w:jc w:val="center"/>
+              <w:rPr>
+                <w:sz w:val="22"/>
+                <w:szCs w:val="22"/>
+              </w:rPr>
+            </w:pPr>
+            <w:r>
+              <w:rPr>
+                <w:sz w:val="22"/>
+                <w:szCs w:val="22"/>
+              </w:rPr>
+              <w:t xml:space="preserve">23–25 May 2027 (3 days)</w:t>
+            </w:r>
+          </w:p>
+        </w:tc>
+        <w:tc>
+          <w:tcPr>
+            <w:tcW w:w="1710" w:type="dxa"/>
+            <w:vAlign w:val="center"/>
+          </w:tcPr>
+          <w:p>
+            <w:pPr>
+              <w:jc w:val="center"/>
+              <w:rPr>
+                <w:sz w:val="22"/>
+                <w:szCs w:val="22"/>
+              </w:rPr>
+            </w:pPr>
+            <w:r>
+              <w:rPr>
+                <w:sz w:val="22"/>
+                <w:szCs w:val="22"/>
+              </w:rPr>
+              <w:t xml:space="preserve">$1,070</w:t>
+            </w:r>
+          </w:p>
+        </w:tc>
+      </w:tr>
+      <w:tr>
+        <w:trPr>
+          <w:cantSplit/>
+        </w:trPr>
+        <w:tc>
+          <w:tcPr>
+            <w:tcW w:w="2137" w:type="dxa"/>
+            <w:vAlign w:val="center"/>
+          </w:tcPr>
+          <w:p>
+            <w:pPr>
+              <w:jc w:val="center"/>
+              <w:rPr>
+                <w:sz w:val="22"/>
+                <w:szCs w:val="22"/>
+              </w:rPr>
+            </w:pPr>
+            <w:r>
+              <w:rPr>
+                <w:sz w:val="22"/>
+                <w:szCs w:val="22"/>
+              </w:rPr>
+              <w:t xml:space="preserve">Conference (present)</w:t>
+            </w:r>
+          </w:p>
+        </w:tc>
+        <w:tc>
+          <w:tcPr>
+            <w:tcW w:w="1980" w:type="dxa"/>
+            <w:vAlign w:val="center"/>
+          </w:tcPr>
+          <w:p>
+            <w:pPr>
+              <w:jc w:val="center"/>
+              <w:rPr>
+                <w:sz w:val="22"/>
+                <w:szCs w:val="22"/>
+              </w:rPr>
+            </w:pPr>
+            <w:r>
+              <w:rPr>
+                <w:sz w:val="22"/>
+                <w:szCs w:val="22"/>
+              </w:rPr>
+              <w:t xml:space="preserve">95th MORS Symposium</w:t>
+            </w:r>
+          </w:p>
+        </w:tc>
+        <w:tc>
+          <w:tcPr>
+            <w:tcW w:w="1890" w:type="dxa"/>
+            <w:vAlign w:val="center"/>
+          </w:tcPr>
+          <w:p>
+            <w:pPr>
+              <w:jc w:val="center"/>
+              <w:rPr>
+                <w:sz w:val="22"/>
+                <w:szCs w:val="22"/>
+              </w:rPr>
+            </w:pPr>
+            <w:r>
+              <w:rPr>
+                <w:sz w:val="22"/>
+                <w:szCs w:val="22"/>
+                <w:highlight w:val="yellow"/>
+              </w:rPr>
+              <w:t xml:space="preserve">[Location TBA]</w:t>
+            </w:r>
+          </w:p>
+        </w:tc>
+        <w:tc>
+          <w:tcPr>
+            <w:tcW w:w="1530" w:type="dxa"/>
+            <w:vAlign w:val="center"/>
+          </w:tcPr>
+          <w:p>
+            <w:pPr>
+              <w:jc w:val="center"/>
+              <w:rPr>
+                <w:sz w:val="22"/>
+                <w:szCs w:val="22"/>
+              </w:rPr>
+            </w:pPr>
+            <w:r>
+              <w:rPr>
+                <w:sz w:val="22"/>
+                <w:szCs w:val="22"/>
+                <w:highlight w:val="yellow"/>
+              </w:rPr>
+              <w:t xml:space="preserve">[June 2027]</w:t>
+            </w:r>
+            <w:r>
+              <w:rPr>
+                <w:sz w:val="22"/>
+                <w:szCs w:val="22"/>
+              </w:rPr>
+              <w:t xml:space="preserve"> (4 days)</w:t>
+            </w:r>
+          </w:p>
+        </w:tc>
+        <w:tc>
+          <w:tcPr>
+            <w:tcW w:w="1710" w:type="dxa"/>
+            <w:vAlign w:val="center"/>
+          </w:tcPr>
+          <w:p>
+            <w:pPr>
+              <w:jc w:val="center"/>
+              <w:rPr>
+                <w:sz w:val="22"/>
+                <w:szCs w:val="22"/>
+              </w:rPr>
+            </w:pPr>
+            <w:r>
+              <w:rPr>
+                <w:sz w:val="22"/>
+                <w:szCs w:val="22"/>
+              </w:rPr>
+              <w:t xml:space="preserve">$1,329</w:t>
+            </w:r>
+          </w:p>
+        </w:tc>
+      </w:tr>
+      <w:tr>
+        <w:trPr>
+          <w:cantSplit/>
+        </w:trPr>
+        <w:tc>
+          <w:tcPr>
+            <w:tcW w:w="2137" w:type="dxa"/>
+            <w:vAlign w:val="center"/>
+          </w:tcPr>
+          <w:p>
+            <w:pPr>
+              <w:jc w:val="center"/>
+              <w:rPr>
+                <w:sz w:val="22"/>
+                <w:szCs w:val="22"/>
+              </w:rPr>
+            </w:pPr>
+            <w:r>
+              <w:rPr>
+                <w:sz w:val="22"/>
+                <w:szCs w:val="22"/>
+              </w:rPr>
+              <w:t xml:space="preserve">AIAD</w:t>
+            </w:r>
+          </w:p>
+        </w:tc>
+        <w:tc>
+          <w:tcPr>
+            <w:tcW w:w="1980" w:type="dxa"/>
+            <w:vAlign w:val="center"/>
+          </w:tcPr>
+          <w:p>
+            <w:pPr>
+              <w:jc w:val="center"/>
+              <w:rPr>
+                <w:sz w:val="22"/>
+                <w:szCs w:val="22"/>
+              </w:rPr>
+            </w:pPr>
+            <w:r>
+              <w:rPr>
+                <w:sz w:val="22"/>
+                <w:szCs w:val="22"/>
+              </w:rPr>
+              <w:t xml:space="preserve">MIT Lincoln Laboratory</w:t>
+            </w:r>
+          </w:p>
+        </w:tc>
+        <w:tc>
+          <w:tcPr>
+            <w:tcW w:w="1890" w:type="dxa"/>
+            <w:vAlign w:val="center"/>
+          </w:tcPr>
+          <w:p>
+            <w:pPr>
+              <w:jc w:val="center"/>
+              <w:rPr>
+                <w:sz w:val="22"/>
+                <w:szCs w:val="22"/>
+              </w:rPr>
+            </w:pPr>
+            <w:r>
+              <w:rPr>
+                <w:sz w:val="22"/>
+                <w:szCs w:val="22"/>
+              </w:rPr>
+              <w:t xml:space="preserve">Lexington, MA</w:t>
+            </w:r>
+          </w:p>
+        </w:tc>
+        <w:tc>
+          <w:tcPr>
+            <w:tcW w:w="1530" w:type="dxa"/>
+            <w:vAlign w:val="center"/>
+          </w:tcPr>
+          <w:p>
+            <w:pPr>
+              <w:jc w:val="center"/>
+              <w:rPr>
+                <w:sz w:val="22"/>
+                <w:szCs w:val="22"/>
+              </w:rPr>
+            </w:pPr>
+            <w:r>
+              <w:rPr>
+                <w:sz w:val="22"/>
+                <w:szCs w:val="22"/>
+                <w:highlight w:val="yellow"/>
+              </w:rPr>
+              <w:t xml:space="preserve">[12–30 Jul 2027]</w:t>
+            </w:r>
+            <w:r>
+              <w:rPr>
+                <w:sz w:val="22"/>
+                <w:szCs w:val="22"/>
+              </w:rPr>
+              <w:t xml:space="preserve"> (21 days)</w:t>
+            </w:r>
+          </w:p>
+        </w:tc>
+        <w:tc>
+          <w:tcPr>
+            <w:tcW w:w="1710" w:type="dxa"/>
+            <w:vAlign w:val="center"/>
+          </w:tcPr>
+          <w:p>
+            <w:pPr>
+              <w:jc w:val="center"/>
+              <w:rPr>
+                <w:sz w:val="22"/>
+                <w:szCs w:val="22"/>
+              </w:rPr>
+            </w:pPr>
+            <w:r>
+              <w:rPr>
+                <w:sz w:val="22"/>
+                <w:szCs w:val="22"/>
+              </w:rPr>
+              <w:t xml:space="preserve">$5,703</w:t>
             </w:r>
           </w:p>
         </w:tc>
@@ -1152,7 +1461,7 @@
           <w:sz w:val="24"/>
           <w:szCs w:val="24"/>
         </w:rPr>
-        <w:t xml:space="preserve">$6,924 ($6,700 travel + $224 reference text), within the $10,000 limit.</w:t>
+        <w:t xml:space="preserve">$10,000: $9,591 for the five trips above and $409 for registration and paper fees.</w:t>
       </w:r>
     </w:p>
     <w:p>
@@ -1181,14 +1490,14 @@
           <w:sz w:val="24"/>
           <w:szCs w:val="24"/>
         </w:rPr>
-        <w:t xml:space="preserve">     e. Timeline for Expenditures. </w:t>
+        <w:t xml:space="preserve">     d. Timeline for Expenditures. </w:t>
       </w:r>
       <w:r>
         <w:rPr>
           <w:sz w:val="24"/>
           <w:szCs w:val="24"/>
         </w:rPr>
-        <w:t xml:space="preserve">Nov–Dec 2026: coordinate the MIT research placement with LTC Webb and the department. Jan 2027: purchase the reference text. </w:t>
+        <w:t xml:space="preserve">Nov 2026–Feb 2027: register for Global Force, submit the SIEDS abstract, and request the Lincoln Laboratory AIAD. 16–18 March 2027: Global Force. </w:t>
       </w:r>
       <w:r>
         <w:rPr>
@@ -1196,14 +1505,44 @@
           <w:szCs w:val="24"/>
           <w:highlight w:val="yellow"/>
         </w:rPr>
-        <w:t xml:space="preserve">[7–27 June 2027]</w:t>
+        <w:t xml:space="preserve">[Early May 2027]</w:t>
       </w:r>
       <w:r>
         <w:rPr>
           <w:sz w:val="24"/>
           <w:szCs w:val="24"/>
         </w:rPr>
-        <w:t xml:space="preserve">: complete the AIAD. All funds will be spent by 30 June 2027, well before my graduation in May 2029.</w:t>
+        <w:t xml:space="preserve">: SIEDS. 23–25 May 2027: AI+ Expo. </w:t>
+      </w:r>
+      <w:r>
+        <w:rPr>
+          <w:sz w:val="24"/>
+          <w:szCs w:val="24"/>
+          <w:highlight w:val="yellow"/>
+        </w:rPr>
+        <w:t xml:space="preserve">[June 2027]</w:t>
+      </w:r>
+      <w:r>
+        <w:rPr>
+          <w:sz w:val="24"/>
+          <w:szCs w:val="24"/>
+        </w:rPr>
+        <w:t xml:space="preserve">: MORS Symposium. </w:t>
+      </w:r>
+      <w:r>
+        <w:rPr>
+          <w:sz w:val="24"/>
+          <w:szCs w:val="24"/>
+          <w:highlight w:val="yellow"/>
+        </w:rPr>
+        <w:t xml:space="preserve">[12–30 July 2027]</w:t>
+      </w:r>
+      <w:r>
+        <w:rPr>
+          <w:sz w:val="24"/>
+          <w:szCs w:val="24"/>
+        </w:rPr>
+        <w:t xml:space="preserve">: Lincoln Laboratory AIAD. All funds will be spent by 31 July 2027, well before my graduation in May 2029.</w:t>
       </w:r>
     </w:p>
     <w:p>

</xml_diff>

<commit_message>
Strip memo budget to a plain list of ideas for advisor review
Co-Authored-By: Claude Opus 5.5 <noreply@anthropic.com>
Claude-Session: https://claude.ai/code/session_01HUa9sxRc7o7bsnuzSz3H5S
</commit_message>
<xml_diff>
--- a/application/Pezan_DXDT_Application_Memo_DRAFT.docx
+++ b/application/Pezan_DXDT_Application_Memo_DRAFT.docx
@@ -428,8 +428,9 @@
         <w:rPr>
           <w:sz w:val="24"/>
           <w:szCs w:val="24"/>
-        </w:rPr>
-        <w:t xml:space="preserve">From 16–18 March 2027, I will spend $500 to fly to Huntsville, AL, and $477 on lodging and meals to attend the AUSA Global Force Symposium, hosted with Army Materiel Command. My Taiwan model plays the attacker; Global Force is where the Army’s sustainment leaders explain how they plan to keep supply moving in a contested theater. I will bring their constraints back into the defender side of my model.</w:t>
+          <w:highlight w:val="yellow"/>
+        </w:rPr>
+        <w:t xml:space="preserve">[Working ideas, to be finalized after advisor feedback.]</w:t>
       </w:r>
     </w:p>
     <w:p>
@@ -451,22 +452,7 @@
           <w:sz w:val="24"/>
           <w:szCs w:val="24"/>
         </w:rPr>
-        <w:t xml:space="preserve">In </w:t>
-      </w:r>
-      <w:r>
-        <w:rPr>
-          <w:sz w:val="24"/>
-          <w:szCs w:val="24"/>
-          <w:highlight w:val="yellow"/>
-        </w:rPr>
-        <w:t xml:space="preserve">[early May 2027]</w:t>
-      </w:r>
-      <w:r>
-        <w:rPr>
-          <w:sz w:val="24"/>
-          <w:szCs w:val="24"/>
-        </w:rPr>
-        <w:t xml:space="preserve">, I will spend $250 on train travel and $262 on lodging and meals to present my interdiction results at the IEEE Systems and Information Engineering Design Symposium (SIEDS) at the University of Virginia, if my paper is accepted. Accepted papers are published in IEEE Xplore, which would give the project a peer-reviewed, citable result for the department.</w:t>
+        <w:t xml:space="preserve">AUSA Global Force Symposium, Huntsville, AL (March 2027): learn how Army Materiel Command and sustainment leaders plan to keep supply moving in a contested theater.</w:t>
       </w:r>
     </w:p>
     <w:p>
@@ -488,7 +474,7 @@
           <w:sz w:val="24"/>
           <w:szCs w:val="24"/>
         </w:rPr>
-        <w:t xml:space="preserve">From 23–25 May 2027, I will spend $250 on train travel and $820 on lodging and meals to attend the SCSP AI+ Expo in Washington, DC, the largest gathering of defense-technology companies and government AI leaders in the country. If SCSP runs its National Security Technology Hackathon again, I will enter with a team of cadets; in 2026, finalists demonstrated their prototypes on stage at the Expo. The Expo also lets me follow up in person with the Palantir team I met this summer.</w:t>
+        <w:t xml:space="preserve">IEEE SIEDS, University of Virginia (May 2027): submit and present the Taiwan interdiction paper; accepted papers are published in IEEE Xplore.</w:t>
       </w:r>
     </w:p>
     <w:p>
@@ -510,22 +496,7 @@
           <w:sz w:val="24"/>
           <w:szCs w:val="24"/>
         </w:rPr>
-        <w:t xml:space="preserve">In </w:t>
-      </w:r>
-      <w:r>
-        <w:rPr>
-          <w:sz w:val="24"/>
-          <w:szCs w:val="24"/>
-          <w:highlight w:val="yellow"/>
-        </w:rPr>
-        <w:t xml:space="preserve">[June 2027]</w:t>
-      </w:r>
-      <w:r>
-        <w:rPr>
-          <w:sz w:val="24"/>
-          <w:szCs w:val="24"/>
-        </w:rPr>
-        <w:t xml:space="preserve">, I will spend about $1,329 on airfare, lodging, and meals to attend the 95th Military Operations Research Society (MORS) Symposium, where Army and Defense Department analysts present the models that inform force decisions. I will submit my Taiwan study to a working group and present it if accepted; this is the community I intend to join as an FA49.</w:t>
+        <w:t xml:space="preserve">SCSP AI+ Expo and hackathon, Washington, DC (May 2027): compete with a cadet team and reconnect with Palantir.</w:t>
       </w:r>
     </w:p>
     <w:p>
@@ -547,22 +518,7 @@
           <w:sz w:val="24"/>
           <w:szCs w:val="24"/>
         </w:rPr>
-        <w:t xml:space="preserve">Finally, from </w:t>
-      </w:r>
-      <w:r>
-        <w:rPr>
-          <w:sz w:val="24"/>
-          <w:szCs w:val="24"/>
-          <w:highlight w:val="yellow"/>
-        </w:rPr>
-        <w:t xml:space="preserve">[12–30 July 2027]</w:t>
-      </w:r>
-      <w:r>
-        <w:rPr>
-          <w:sz w:val="24"/>
-          <w:szCs w:val="24"/>
-        </w:rPr>
-        <w:t xml:space="preserve">, I will spend $5,703 on housing, food, and transportation for a three-week AIAD at MIT Lincoln Laboratory in Lexington, MA: $200 for train travel, $3,740 for 20 nights of lodging, and $1,763 for meals. Lincoln Laboratory builds and tests decision-support and reinforcement-learning tools for Defense Department planning problems. My TDAC work showed how an agent can score well while failing the unit that matters most. At Lincoln Laboratory I want to learn how professional engineers test and evaluate these systems before they reach operators, and bring that discipline back to my research and to cadet research in the department.</w:t>
+        <w:t xml:space="preserve">MORS Symposium (June 2027): present to the Army and Defense Department analysts I intend to join as an FA49.</w:t>
       </w:r>
     </w:p>
     <w:p>
@@ -584,7 +540,7 @@
           <w:sz w:val="24"/>
           <w:szCs w:val="24"/>
         </w:rPr>
-        <w:t xml:space="preserve">The remaining $409 will pay conference registration and paper fees (SIEDS and MORS). All lodging and meal estimates use FY2027 federal per diem rates.</w:t>
+        <w:t xml:space="preserve">MIT Lincoln Laboratory AIAD, Lexington, MA (late July 2027): learn how AI decision tools are tested and evaluated before they reach operators.</w:t>
       </w:r>
     </w:p>
     <w:p>
@@ -626,8 +582,9 @@
         <w:rPr>
           <w:sz w:val="24"/>
           <w:szCs w:val="24"/>
-        </w:rPr>
-        <w:t xml:space="preserve">Five trips, in order, all completed by July 2027.</w:t>
+          <w:highlight w:val="yellow"/>
+        </w:rPr>
+        <w:t xml:space="preserve">[TBD]</w:t>
       </w:r>
     </w:p>
     <w:p>
@@ -842,7 +799,7 @@
                 <w:sz w:val="22"/>
                 <w:szCs w:val="22"/>
               </w:rPr>
-              <w:t xml:space="preserve">Conference</w:t>
+              <w:t xml:space="preserve"> </w:t>
             </w:r>
           </w:p>
         </w:tc>
@@ -864,7 +821,7 @@
                 <w:sz w:val="22"/>
                 <w:szCs w:val="22"/>
               </w:rPr>
-              <w:t xml:space="preserve">AUSA Global Force Symposium</w:t>
+              <w:t xml:space="preserve"> </w:t>
             </w:r>
           </w:p>
         </w:tc>
@@ -886,7 +843,7 @@
                 <w:sz w:val="22"/>
                 <w:szCs w:val="22"/>
               </w:rPr>
-              <w:t xml:space="preserve">Huntsville, AL</w:t>
+              <w:t xml:space="preserve"> </w:t>
             </w:r>
           </w:p>
         </w:tc>
@@ -908,7 +865,7 @@
                 <w:sz w:val="22"/>
                 <w:szCs w:val="22"/>
               </w:rPr>
-              <w:t xml:space="preserve">16–18 Mar 2027 (3 days)</w:t>
+              <w:t xml:space="preserve"> </w:t>
             </w:r>
           </w:p>
         </w:tc>
@@ -930,7 +887,7 @@
                 <w:sz w:val="22"/>
                 <w:szCs w:val="22"/>
               </w:rPr>
-              <w:t xml:space="preserve">$977</w:t>
+              <w:t xml:space="preserve"> </w:t>
             </w:r>
           </w:p>
         </w:tc>
@@ -957,7 +914,7 @@
                 <w:sz w:val="22"/>
                 <w:szCs w:val="22"/>
               </w:rPr>
-              <w:t xml:space="preserve">Conference (present)</w:t>
+              <w:t xml:space="preserve"> </w:t>
             </w:r>
           </w:p>
         </w:tc>
@@ -979,7 +936,7 @@
                 <w:sz w:val="22"/>
                 <w:szCs w:val="22"/>
               </w:rPr>
-              <w:t xml:space="preserve">IEEE SIEDS, University of Virginia</w:t>
+              <w:t xml:space="preserve"> </w:t>
             </w:r>
           </w:p>
         </w:tc>
@@ -1001,7 +958,7 @@
                 <w:sz w:val="22"/>
                 <w:szCs w:val="22"/>
               </w:rPr>
-              <w:t xml:space="preserve">Charlottesville, VA</w:t>
+              <w:t xml:space="preserve"> </w:t>
             </w:r>
           </w:p>
         </w:tc>
@@ -1022,16 +979,8 @@
               <w:rPr>
                 <w:sz w:val="22"/>
                 <w:szCs w:val="22"/>
-                <w:highlight w:val="yellow"/>
               </w:rPr>
-              <w:t xml:space="preserve">[Early May 2027]</w:t>
-            </w:r>
-            <w:r>
-              <w:rPr>
-                <w:sz w:val="22"/>
-                <w:szCs w:val="22"/>
-              </w:rPr>
-              <w:t xml:space="preserve"> (2 days)</w:t>
+              <w:t xml:space="preserve"> </w:t>
             </w:r>
           </w:p>
         </w:tc>
@@ -1053,7 +1002,7 @@
                 <w:sz w:val="22"/>
                 <w:szCs w:val="22"/>
               </w:rPr>
-              <w:t xml:space="preserve">$512</w:t>
+              <w:t xml:space="preserve"> </w:t>
             </w:r>
           </w:p>
         </w:tc>
@@ -1080,7 +1029,7 @@
                 <w:sz w:val="22"/>
                 <w:szCs w:val="22"/>
               </w:rPr>
-              <w:t xml:space="preserve">Conference and hackathon</w:t>
+              <w:t xml:space="preserve"> </w:t>
             </w:r>
           </w:p>
         </w:tc>
@@ -1102,7 +1051,7 @@
                 <w:sz w:val="22"/>
                 <w:szCs w:val="22"/>
               </w:rPr>
-              <w:t xml:space="preserve">SCSP AI+ Expo</w:t>
+              <w:t xml:space="preserve"> </w:t>
             </w:r>
           </w:p>
         </w:tc>
@@ -1124,7 +1073,7 @@
                 <w:sz w:val="22"/>
                 <w:szCs w:val="22"/>
               </w:rPr>
-              <w:t xml:space="preserve">Washington, DC</w:t>
+              <w:t xml:space="preserve"> </w:t>
             </w:r>
           </w:p>
         </w:tc>
@@ -1146,7 +1095,7 @@
                 <w:sz w:val="22"/>
                 <w:szCs w:val="22"/>
               </w:rPr>
-              <w:t xml:space="preserve">23–25 May 2027 (3 days)</w:t>
+              <w:t xml:space="preserve"> </w:t>
             </w:r>
           </w:p>
         </w:tc>
@@ -1168,254 +1117,7 @@
                 <w:sz w:val="22"/>
                 <w:szCs w:val="22"/>
               </w:rPr>
-              <w:t xml:space="preserve">$1,070</w:t>
-            </w:r>
-          </w:p>
-        </w:tc>
-      </w:tr>
-      <w:tr>
-        <w:trPr>
-          <w:cantSplit/>
-        </w:trPr>
-        <w:tc>
-          <w:tcPr>
-            <w:tcW w:w="2137" w:type="dxa"/>
-            <w:vAlign w:val="center"/>
-          </w:tcPr>
-          <w:p>
-            <w:pPr>
-              <w:jc w:val="center"/>
-              <w:rPr>
-                <w:sz w:val="22"/>
-                <w:szCs w:val="22"/>
-              </w:rPr>
-            </w:pPr>
-            <w:r>
-              <w:rPr>
-                <w:sz w:val="22"/>
-                <w:szCs w:val="22"/>
-              </w:rPr>
-              <w:t xml:space="preserve">Conference (present)</w:t>
-            </w:r>
-          </w:p>
-        </w:tc>
-        <w:tc>
-          <w:tcPr>
-            <w:tcW w:w="1980" w:type="dxa"/>
-            <w:vAlign w:val="center"/>
-          </w:tcPr>
-          <w:p>
-            <w:pPr>
-              <w:jc w:val="center"/>
-              <w:rPr>
-                <w:sz w:val="22"/>
-                <w:szCs w:val="22"/>
-              </w:rPr>
-            </w:pPr>
-            <w:r>
-              <w:rPr>
-                <w:sz w:val="22"/>
-                <w:szCs w:val="22"/>
-              </w:rPr>
-              <w:t xml:space="preserve">95th MORS Symposium</w:t>
-            </w:r>
-          </w:p>
-        </w:tc>
-        <w:tc>
-          <w:tcPr>
-            <w:tcW w:w="1890" w:type="dxa"/>
-            <w:vAlign w:val="center"/>
-          </w:tcPr>
-          <w:p>
-            <w:pPr>
-              <w:jc w:val="center"/>
-              <w:rPr>
-                <w:sz w:val="22"/>
-                <w:szCs w:val="22"/>
-              </w:rPr>
-            </w:pPr>
-            <w:r>
-              <w:rPr>
-                <w:sz w:val="22"/>
-                <w:szCs w:val="22"/>
-                <w:highlight w:val="yellow"/>
-              </w:rPr>
-              <w:t xml:space="preserve">[Location TBA]</w:t>
-            </w:r>
-          </w:p>
-        </w:tc>
-        <w:tc>
-          <w:tcPr>
-            <w:tcW w:w="1530" w:type="dxa"/>
-            <w:vAlign w:val="center"/>
-          </w:tcPr>
-          <w:p>
-            <w:pPr>
-              <w:jc w:val="center"/>
-              <w:rPr>
-                <w:sz w:val="22"/>
-                <w:szCs w:val="22"/>
-              </w:rPr>
-            </w:pPr>
-            <w:r>
-              <w:rPr>
-                <w:sz w:val="22"/>
-                <w:szCs w:val="22"/>
-                <w:highlight w:val="yellow"/>
-              </w:rPr>
-              <w:t xml:space="preserve">[June 2027]</w:t>
-            </w:r>
-            <w:r>
-              <w:rPr>
-                <w:sz w:val="22"/>
-                <w:szCs w:val="22"/>
-              </w:rPr>
-              <w:t xml:space="preserve"> (4 days)</w:t>
-            </w:r>
-          </w:p>
-        </w:tc>
-        <w:tc>
-          <w:tcPr>
-            <w:tcW w:w="1710" w:type="dxa"/>
-            <w:vAlign w:val="center"/>
-          </w:tcPr>
-          <w:p>
-            <w:pPr>
-              <w:jc w:val="center"/>
-              <w:rPr>
-                <w:sz w:val="22"/>
-                <w:szCs w:val="22"/>
-              </w:rPr>
-            </w:pPr>
-            <w:r>
-              <w:rPr>
-                <w:sz w:val="22"/>
-                <w:szCs w:val="22"/>
-              </w:rPr>
-              <w:t xml:space="preserve">$1,329</w:t>
-            </w:r>
-          </w:p>
-        </w:tc>
-      </w:tr>
-      <w:tr>
-        <w:trPr>
-          <w:cantSplit/>
-        </w:trPr>
-        <w:tc>
-          <w:tcPr>
-            <w:tcW w:w="2137" w:type="dxa"/>
-            <w:vAlign w:val="center"/>
-          </w:tcPr>
-          <w:p>
-            <w:pPr>
-              <w:jc w:val="center"/>
-              <w:rPr>
-                <w:sz w:val="22"/>
-                <w:szCs w:val="22"/>
-              </w:rPr>
-            </w:pPr>
-            <w:r>
-              <w:rPr>
-                <w:sz w:val="22"/>
-                <w:szCs w:val="22"/>
-              </w:rPr>
-              <w:t xml:space="preserve">AIAD</w:t>
-            </w:r>
-          </w:p>
-        </w:tc>
-        <w:tc>
-          <w:tcPr>
-            <w:tcW w:w="1980" w:type="dxa"/>
-            <w:vAlign w:val="center"/>
-          </w:tcPr>
-          <w:p>
-            <w:pPr>
-              <w:jc w:val="center"/>
-              <w:rPr>
-                <w:sz w:val="22"/>
-                <w:szCs w:val="22"/>
-              </w:rPr>
-            </w:pPr>
-            <w:r>
-              <w:rPr>
-                <w:sz w:val="22"/>
-                <w:szCs w:val="22"/>
-              </w:rPr>
-              <w:t xml:space="preserve">MIT Lincoln Laboratory</w:t>
-            </w:r>
-          </w:p>
-        </w:tc>
-        <w:tc>
-          <w:tcPr>
-            <w:tcW w:w="1890" w:type="dxa"/>
-            <w:vAlign w:val="center"/>
-          </w:tcPr>
-          <w:p>
-            <w:pPr>
-              <w:jc w:val="center"/>
-              <w:rPr>
-                <w:sz w:val="22"/>
-                <w:szCs w:val="22"/>
-              </w:rPr>
-            </w:pPr>
-            <w:r>
-              <w:rPr>
-                <w:sz w:val="22"/>
-                <w:szCs w:val="22"/>
-              </w:rPr>
-              <w:t xml:space="preserve">Lexington, MA</w:t>
-            </w:r>
-          </w:p>
-        </w:tc>
-        <w:tc>
-          <w:tcPr>
-            <w:tcW w:w="1530" w:type="dxa"/>
-            <w:vAlign w:val="center"/>
-          </w:tcPr>
-          <w:p>
-            <w:pPr>
-              <w:jc w:val="center"/>
-              <w:rPr>
-                <w:sz w:val="22"/>
-                <w:szCs w:val="22"/>
-              </w:rPr>
-            </w:pPr>
-            <w:r>
-              <w:rPr>
-                <w:sz w:val="22"/>
-                <w:szCs w:val="22"/>
-                <w:highlight w:val="yellow"/>
-              </w:rPr>
-              <w:t xml:space="preserve">[12–30 Jul 2027]</w:t>
-            </w:r>
-            <w:r>
-              <w:rPr>
-                <w:sz w:val="22"/>
-                <w:szCs w:val="22"/>
-              </w:rPr>
-              <w:t xml:space="preserve"> (21 days)</w:t>
-            </w:r>
-          </w:p>
-        </w:tc>
-        <w:tc>
-          <w:tcPr>
-            <w:tcW w:w="1710" w:type="dxa"/>
-            <w:vAlign w:val="center"/>
-          </w:tcPr>
-          <w:p>
-            <w:pPr>
-              <w:jc w:val="center"/>
-              <w:rPr>
-                <w:sz w:val="22"/>
-                <w:szCs w:val="22"/>
-              </w:rPr>
-            </w:pPr>
-            <w:r>
-              <w:rPr>
-                <w:sz w:val="22"/>
-                <w:szCs w:val="22"/>
-              </w:rPr>
-              <w:t xml:space="preserve">$5,703</w:t>
+              <w:t xml:space="preserve"> </w:t>
             </w:r>
           </w:p>
         </w:tc>
@@ -1460,8 +1162,9 @@
         <w:rPr>
           <w:sz w:val="24"/>
           <w:szCs w:val="24"/>
-        </w:rPr>
-        <w:t xml:space="preserve">$10,000: $9,591 for the five trips above and $409 for registration and paper fees.</w:t>
+          <w:highlight w:val="yellow"/>
+        </w:rPr>
+        <w:t xml:space="preserve">[TBD]</w:t>
       </w:r>
     </w:p>
     <w:p>
@@ -1496,53 +1199,9 @@
         <w:rPr>
           <w:sz w:val="24"/>
           <w:szCs w:val="24"/>
-        </w:rPr>
-        <w:t xml:space="preserve">Nov 2026–Feb 2027: register for Global Force, submit the SIEDS abstract, and request the Lincoln Laboratory AIAD. 16–18 March 2027: Global Force. </w:t>
-      </w:r>
-      <w:r>
-        <w:rPr>
-          <w:sz w:val="24"/>
-          <w:szCs w:val="24"/>
           <w:highlight w:val="yellow"/>
         </w:rPr>
-        <w:t xml:space="preserve">[Early May 2027]</w:t>
-      </w:r>
-      <w:r>
-        <w:rPr>
-          <w:sz w:val="24"/>
-          <w:szCs w:val="24"/>
-        </w:rPr>
-        <w:t xml:space="preserve">: SIEDS. 23–25 May 2027: AI+ Expo. </w:t>
-      </w:r>
-      <w:r>
-        <w:rPr>
-          <w:sz w:val="24"/>
-          <w:szCs w:val="24"/>
-          <w:highlight w:val="yellow"/>
-        </w:rPr>
-        <w:t xml:space="preserve">[June 2027]</w:t>
-      </w:r>
-      <w:r>
-        <w:rPr>
-          <w:sz w:val="24"/>
-          <w:szCs w:val="24"/>
-        </w:rPr>
-        <w:t xml:space="preserve">: MORS Symposium. </w:t>
-      </w:r>
-      <w:r>
-        <w:rPr>
-          <w:sz w:val="24"/>
-          <w:szCs w:val="24"/>
-          <w:highlight w:val="yellow"/>
-        </w:rPr>
-        <w:t xml:space="preserve">[12–30 July 2027]</w:t>
-      </w:r>
-      <w:r>
-        <w:rPr>
-          <w:sz w:val="24"/>
-          <w:szCs w:val="24"/>
-        </w:rPr>
-        <w:t xml:space="preserve">: Lincoln Laboratory AIAD. All funds will be spent by 31 July 2027, well before my graduation in May 2029.</w:t>
+        <w:t xml:space="preserve">[TBD]</w:t>
       </w:r>
     </w:p>
     <w:p>

</xml_diff>

<commit_message>
Memo: priority budget (Lincoln Lab AIAD, AI+ Expo, HackNYU) on the edited draft
Co-Authored-By: Claude Opus 5.5 <noreply@anthropic.com>
Claude-Session: https://claude.ai/code/session_01HUa9sxRc7o7bsnuzSz3H5S
</commit_message>
<xml_diff>
--- a/application/Pezan_DXDT_Application_Memo_DRAFT.docx
+++ b/application/Pezan_DXDT_Application_Memo_DRAFT.docx
@@ -4,12 +4,12 @@
   <w:body>
     <w:p>
       <w:pPr>
-        <w:framePr w:w="5285" w:hSpace="187" w:wrap="auto" w:hAnchor="page" w:vAnchor="page" w:xAlign="center" w:y="901"/>
+        <w:framePr w:w="5285" w:hSpace="187" w:wrap="auto" w:vAnchor="page" w:hAnchor="page" w:xAlign="center" w:y="901"/>
         <w:jc w:val="center"/>
         <w:rPr>
           <w:rFonts w:ascii="Arial" w:hAnsi="Arial"/>
-          <w:b w:val="1"/>
-          <w:bCs w:val="1"/>
+          <w:b/>
+          <w:bCs/>
         </w:rPr>
       </w:pPr>
       <w:r>
@@ -58,7 +58,7 @@
     </w:p>
     <w:p>
       <w:pPr>
-        <w:framePr w:w="5285" w:hSpace="187" w:wrap="auto" w:hAnchor="page" w:vAnchor="page" w:xAlign="center" w:y="901"/>
+        <w:framePr w:w="5285" w:hSpace="187" w:wrap="auto" w:vAnchor="page" w:hAnchor="page" w:xAlign="center" w:y="901"/>
         <w:jc w:val="center"/>
         <w:rPr>
           <w:rFonts w:ascii="Arial" w:hAnsi="Arial"/>
@@ -96,7 +96,7 @@
     </w:p>
     <w:p>
       <w:pPr>
-        <w:framePr w:w="5285" w:hSpace="187" w:wrap="auto" w:hAnchor="page" w:vAnchor="page" w:xAlign="center" w:y="901"/>
+        <w:framePr w:w="5285" w:hSpace="187" w:wrap="auto" w:vAnchor="page" w:hAnchor="page" w:xAlign="center" w:y="901"/>
         <w:jc w:val="center"/>
         <w:rPr>
           <w:rFonts w:ascii="Arial" w:hAnsi="Arial"/>
@@ -107,14 +107,14 @@
     <w:p>
       <w:pPr>
         <w:pStyle w:val="TEALetterHead"/>
-        <w:framePr w:hSpace="187" w:wrap="auto" w:hAnchor="page" w:vAnchor="page" w:x="720" w:y="721"/>
+        <w:framePr w:hSpace="187" w:wrap="auto" w:vAnchor="page" w:hAnchor="page" w:x="720" w:y="721"/>
       </w:pPr>
       <w:r>
         <w:rPr>
           <w:sz w:val="20"/>
         </w:rPr>
         <w:object w:dxaOrig="1421" w:dyaOrig="1421" w14:anchorId="173EA0B2">
-          <v:shapetype id="_x0000_t75" coordsize="21600,21600" filled="f" stroked="f" o:spt="75" o:preferrelative="t" path="m@4@5l@4@11@9@11@9@5xe">
+          <v:shapetype id="_x0000_t75" coordsize="21600,21600" o:spt="75" o:preferrelative="t" path="m@4@5l@4@11@9@11@9@5xe" filled="f" stroked="f">
             <v:stroke joinstyle="miter"/>
             <v:formulas>
               <v:f eqn="if lineDrawn pixelLineWidth 0"/>
@@ -130,13 +130,13 @@
               <v:f eqn="prod @7 21600 pixelHeight"/>
               <v:f eqn="sum @10 21600 0"/>
             </v:formulas>
-            <v:path gradientshapeok="t" o:connecttype="rect" o:extrusionok="f"/>
+            <v:path o:extrusionok="f" gradientshapeok="t" o:connecttype="rect"/>
             <o:lock v:ext="edit" aspectratio="t"/>
           </v:shapetype>
-          <v:shape id="_x0000_i1025" style="width:71.5pt;height:71.5pt" fillcolor="window" o:ole="" type="#_x0000_t75">
-            <v:imagedata o:title="" r:id="rId11"/>
+          <v:shape id="_x0000_i1025" type="#_x0000_t75" style="width:71.3pt;height:71.3pt" o:ole="" fillcolor="window">
+            <v:imagedata r:id="rId11" o:title=""/>
           </v:shape>
-          <o:OLEObject Type="Embed" ProgID="Word.Picture.8" ShapeID="_x0000_i1025" DrawAspect="Content" ObjectID="_1852704777" r:id="rId12"/>
+          <o:OLEObject Type="Embed" ProgID="Word.Picture.8" ShapeID="_x0000_i1025" DrawAspect="Content" ObjectID="_1853593667" r:id="rId12"/>
         </w:object>
       </w:r>
     </w:p>
@@ -156,18 +156,42 @@
           <w:szCs w:val="24"/>
         </w:rPr>
         <w:t>MADN-MTH</w:t>
+      </w:r>
+      <w:r>
+        <w:rPr>
+          <w:sz w:val="24"/>
+          <w:szCs w:val="24"/>
+        </w:rPr>
         <w:tab/>
+      </w:r>
+      <w:r>
+        <w:rPr>
+          <w:sz w:val="24"/>
+          <w:szCs w:val="24"/>
+        </w:rPr>
         <w:tab/>
+      </w:r>
+      <w:r>
+        <w:rPr>
+          <w:sz w:val="24"/>
+          <w:szCs w:val="24"/>
+        </w:rPr>
         <w:tab/>
+      </w:r>
+      <w:r>
+        <w:rPr>
+          <w:sz w:val="24"/>
+          <w:szCs w:val="24"/>
+        </w:rPr>
         <w:tab/>
+      </w:r>
+      <w:r>
+        <w:rPr>
+          <w:sz w:val="24"/>
+          <w:szCs w:val="24"/>
+        </w:rPr>
         <w:tab/>
-      </w:r>
-      <w:r>
-        <w:rPr>
-          <w:sz w:val="24"/>
-          <w:szCs w:val="24"/>
-        </w:rPr>
-        <w:t xml:space="preserve">2 November 2026</w:t>
+        <w:t>2 November 2026</w:t>
       </w:r>
     </w:p>
     <w:p>
@@ -207,7 +231,7 @@
           <w:sz w:val="24"/>
           <w:szCs w:val="24"/>
         </w:rPr>
-        <w:t xml:space="preserve">MEMORANDUM FOR DXDT “Velocity” Scholarship Committee, United States Military Academy, West Point, NY 10996</w:t>
+        <w:t>MEMORANDUM FOR DXDT “Velocity” Scholarship Committee, United States Military Academy, West Point, NY 10996</w:t>
       </w:r>
     </w:p>
     <w:p>
@@ -236,7 +260,7 @@
           <w:sz w:val="24"/>
           <w:szCs w:val="24"/>
         </w:rPr>
-        <w:t xml:space="preserve">SUBJECT: Application for AY 2027 DXDT “Velocity” Scholarship</w:t>
+        <w:t>SUBJECT: Application for AY 2027 DXDT “Velocity” Scholarship</w:t>
       </w:r>
     </w:p>
     <w:p>
@@ -276,14 +300,14 @@
           <w:sz w:val="24"/>
           <w:szCs w:val="24"/>
         </w:rPr>
-        <w:t xml:space="preserve">1.  Long-term Professional Goals.  </w:t>
-      </w:r>
-      <w:r>
-        <w:rPr>
-          <w:sz w:val="24"/>
-          <w:szCs w:val="24"/>
-        </w:rPr>
-        <w:t xml:space="preserve">I intend to serve as an Army officer who turns operational problems into rigorous models and fielded software. I plan to commission as an Infantry officer and lead Soldiers first, because the problems worth modeling start in formations. As an Operations Research major with a minor in artificial intelligence and a finance specialization, I then want to build toward service as an Operations Research/Systems Analyst (FA49) or in an Army AI organization, where decision science directly shapes how the force is sustained and employed. Longer term, I plan to earn a graduate degree in operations research or machine learning and return to West Point to teach in the Department of Mathematical Sciences, bringing current industry practice into the classroom.</w:t>
+        <w:t>1.  Long-term Professional Goals.  I intend to serve as an Army officer who turns operational problems into rigorous models and fielded software. I plan to commission as an Infantry officer and lead Soldiers first, because the problems worth modeling start in formations. As an Operations Research major with a minor in artificial intelligence and a finance specialization, I then want to build toward service as an Operations Research/Systems Analyst (FA49) or in an Army AI organization, where decision science directly shapes how the force is sustained and employed. Longer term, I plan to earn a graduate degree in operations research or machine learning and return to West Point to teach in the Department of Mathematical Sciences, bringing current industry practice into the classroom.</w:t>
+      </w:r>
+      <w:r>
+        <w:rPr>
+          <w:sz w:val="24"/>
+          <w:szCs w:val="24"/>
+        </w:rPr>
+        <w:br/>
       </w:r>
     </w:p>
     <w:p>
@@ -296,6 +320,13 @@
           <w:szCs w:val="24"/>
         </w:rPr>
       </w:pPr>
+      <w:r>
+        <w:rPr>
+          <w:sz w:val="24"/>
+          <w:szCs w:val="24"/>
+        </w:rPr>
+        <w:t>COULD BREAK IT DOWN FURTHER EX. AFTER COMPANY COMMAND = LONG TEMRS. BEFORE = SHORT TERM</w:t>
+      </w:r>
     </w:p>
     <w:p>
       <w:pPr>
@@ -307,38 +338,88 @@
           <w:szCs w:val="24"/>
         </w:rPr>
       </w:pPr>
-      <w:r>
-        <w:rPr>
-          <w:sz w:val="24"/>
-          <w:szCs w:val="24"/>
-        </w:rPr>
-        <w:t xml:space="preserve">2. Purpose. </w:t>
-      </w:r>
-      <w:r>
-        <w:rPr>
-          <w:sz w:val="24"/>
-          <w:szCs w:val="24"/>
-        </w:rPr>
-        <w:t xml:space="preserve">Mr. Philippone has described data as the ammunition of the future and has framed a commander’s hardest choices as constrained optimization: finding the best decision across competing tradeoffs, fast enough to matter. This past summer I saw that idea from three angles. On the Sea to Shining Sea AIAD, Palantir’s team in Palo Alto walked us through Project Maven and how it gives commanders at every echelon a common picture to decide from. A few days later, at the 4th Infantry Division, we saw how a formation actually employs those systems and feeds lessons back to the developers. At Stanford’s Gordian Knot Center, Col. (Ret.) Joseph Felter and Jack Faherty described how student startups get new technology into the hands of Army units, and why that is so hard. Then, at my second AIAD with the Army’s Transformation Decision Analysis Center (TDAC), I built the other half: a reinforcement-learning model for contested resupply. This semester I am modeling how an adversary would cut a supply network. Models like these only matter once a platform puts them in front of a commander. I am pursuing the DXDT “Velocity” Scholarship for two reasons. First, its funding would take my interdiction research out of the classroom: to Army and defense conferences where I can present it, a hackathon where I can compete, and MIT Lincoln Laboratory, where I can learn how tools like it are tested before they reach a commander. Second, as a Velocity Scholar I would seek a Palantir AIAD with the Maven team, where I can learn how a fielded platform turns models like mine into decisions and bring that practice back to my research and my future formation.</w:t>
-      </w:r>
     </w:p>
     <w:p>
       <w:pPr>
         <w:tabs>
           <w:tab w:val="left" w:pos="4680"/>
         </w:tabs>
-        <w:ind w:left="540" w:hanging="540"/>
-        <w:rPr>
-          <w:sz w:val="24"/>
-          <w:szCs w:val="24"/>
-        </w:rPr>
-      </w:pPr>
+        <w:rPr>
+          <w:sz w:val="24"/>
+          <w:szCs w:val="24"/>
+        </w:rPr>
+      </w:pPr>
+      <w:r>
+        <w:rPr>
+          <w:sz w:val="24"/>
+          <w:szCs w:val="24"/>
+        </w:rPr>
+        <w:t xml:space="preserve">2. Purpose. Mr. </w:t>
+      </w:r>
+      <w:proofErr w:type="spellStart"/>
+      <w:r>
+        <w:rPr>
+          <w:sz w:val="24"/>
+          <w:szCs w:val="24"/>
+        </w:rPr>
+        <w:t>Philippone</w:t>
+      </w:r>
+      <w:proofErr w:type="spellEnd"/>
+      <w:r>
+        <w:rPr>
+          <w:sz w:val="24"/>
+          <w:szCs w:val="24"/>
+        </w:rPr>
+        <w:t xml:space="preserve"> has described data as the ammunition of the future and has framed a commander’s hardest choices as constrained optimization: finding the best decision across competing tradeoffs, fast enough to matter. This past summer I saw that idea from three angles. On the Sea to Shining Sea AIAD, Palantir’s team in Palo Alto walked us through Project Maven and how it gives commanders at every echelon a common picture to decide from. A few days later, at the 4th Infantry Division, we saw how a formation </w:t>
+      </w:r>
+      <w:r>
+        <w:rPr>
+          <w:sz w:val="24"/>
+          <w:szCs w:val="24"/>
+        </w:rPr>
+        <w:t>employs</w:t>
+      </w:r>
+      <w:r>
+        <w:rPr>
+          <w:sz w:val="24"/>
+          <w:szCs w:val="24"/>
+        </w:rPr>
+        <w:t xml:space="preserve"> those systems and feeds lessons back to the developers. At Stanford’s Gordian Knot Center, Col. (Ret.) Joseph Felter and Jack Faherty described how student startups get new technology into the hands of Army units, and why that is so hard. Then, at my second AIAD with the Army’s Transformation Decision Analysis Center (TDAC), I built the other half: a reinforcement-learning model for contested resupply. This semester I am modeling how an adversary would cut a supply network. Models like these only matter once a platform puts them in front of a commander. I am pursuing the DXDT “Velocity” Scholarship for two reasons. First, its funding would take my interdiction research out of the classroom: to Army and defense conferences where I can present it, a hackathon where I can compete, and MIT Lincoln Laboratory, where I can learn how tools like it </w:t>
+      </w:r>
+      <w:proofErr w:type="gramStart"/>
+      <w:r>
+        <w:rPr>
+          <w:sz w:val="24"/>
+          <w:szCs w:val="24"/>
+        </w:rPr>
+        <w:t>are</w:t>
+      </w:r>
+      <w:proofErr w:type="gramEnd"/>
+      <w:r>
+        <w:rPr>
+          <w:sz w:val="24"/>
+          <w:szCs w:val="24"/>
+        </w:rPr>
+        <w:t xml:space="preserve"> tested before they reach a commander. Second, as a Velocity Scholar I would seek a Palantir AIAD with the Maven team, where I can learn how a fielded platform turns models like mine into decisions and bring that practice back to my research and my future formation.</w:t>
+      </w:r>
     </w:p>
     <w:p>
       <w:pPr>
         <w:tabs>
           <w:tab w:val="left" w:pos="4680"/>
         </w:tabs>
+        <w:ind w:left="540" w:hanging="540"/>
+        <w:rPr>
+          <w:sz w:val="24"/>
+          <w:szCs w:val="24"/>
+        </w:rPr>
+      </w:pPr>
+    </w:p>
+    <w:p>
+      <w:pPr>
+        <w:tabs>
+          <w:tab w:val="left" w:pos="4680"/>
+        </w:tabs>
         <w:rPr>
           <w:i/>
           <w:iCs/>
@@ -351,14 +432,75 @@
           <w:sz w:val="24"/>
           <w:szCs w:val="24"/>
         </w:rPr>
-        <w:t xml:space="preserve">3. Near-term Research Goals.  </w:t>
-      </w:r>
-      <w:r>
-        <w:rPr>
-          <w:sz w:val="24"/>
-          <w:szCs w:val="24"/>
-        </w:rPr>
-        <w:t xml:space="preserve">My near-term goal is to build a cadet research program that combines reinforcement learning and network optimization for contested logistics. At TDAC I redesigned the reward function for a reinforcement-learning agent that allocates resupply in Logistics Battle Command, the Army’s sustainment simulation. I built diagnostic tools that exposed why a high-scoring agent was starving the priority unit, and the retrained agent more than tripled the share of requests filled. This semester I am working on network interdiction with my advisor, LTC Matthew Webb, whose doctoral research with the MIT Center for Transportation &amp; Logistics developed a reinforcement-learning approach to maximum-flow network interdiction (Webb and Caplice, submitted to Networks). My project asks where an adversary with a fixed effort budget should act to cut Taiwan’s crude oil supply, and whether LTC Webb’s reinforcement-learning attacker, trained on Ukraine’s rail network, still finds strong strategies on sea lanes. I have built a 57-node, 79-edge model of Taiwan’s crude import routes from open sources, with sourced capacities and seven costed adversary actions, connected it to his code, and verified it against an independent max-flow calculation. Early checks show that no single action hurts Taiwan, because supply reroutes, while combined actions do. Over the coming year I will (1) compare optimization baselines against the trained agent, (2) test how the adversary’s best plan changes as blockade and cyber costs vary, and (3) report whether a rail-trained attacker transfers to a maritime network. I will present the results at Projects Day and at the conferences in paragraph 4.</w:t>
+        <w:t xml:space="preserve">3. Near-term Research Goals.  My near-term goal is to build a cadet research program that combines reinforcement learning and network optimization for contested logistics. At TDAC I </w:t>
+      </w:r>
+      <w:r>
+        <w:rPr>
+          <w:sz w:val="24"/>
+          <w:szCs w:val="24"/>
+        </w:rPr>
+        <w:lastRenderedPageBreak/>
+        <w:t xml:space="preserve">redesigned the reward function for a reinforcement-learning agent that allocates resupply in Logistics Battle Command, the Army’s sustainment simulation. I built diagnostic tools that </w:t>
+      </w:r>
+      <w:proofErr w:type="gramStart"/>
+      <w:r>
+        <w:rPr>
+          <w:sz w:val="24"/>
+          <w:szCs w:val="24"/>
+        </w:rPr>
+        <w:t>exposed</w:t>
+      </w:r>
+      <w:proofErr w:type="gramEnd"/>
+      <w:r>
+        <w:rPr>
+          <w:sz w:val="24"/>
+          <w:szCs w:val="24"/>
+        </w:rPr>
+        <w:t xml:space="preserve"> why a high-scoring agent was starving the priority unit, and the retrained agent more than tripled the share of requests filled. This semester I am working on network interdiction with my advisor, LTC Matthew Webb, whose doctoral research with the MIT Center for Transportation &amp; Logistics developed a reinforcement-learning approach to maximum-flow network interdiction (Webb and Caplice, submitted to Networks). </w:t>
+      </w:r>
+      <w:r>
+        <w:rPr>
+          <w:color w:val="EE0000"/>
+          <w:sz w:val="24"/>
+          <w:szCs w:val="24"/>
+        </w:rPr>
+        <w:t>My project asks where an adversary with a fixed effort budget should act to cut Taiwan’s crude oil supply</w:t>
+      </w:r>
+      <w:r>
+        <w:rPr>
+          <w:sz w:val="24"/>
+          <w:szCs w:val="24"/>
+        </w:rPr>
+        <w:t>,</w:t>
+      </w:r>
+      <w:r>
+        <w:rPr>
+          <w:color w:val="2F5496" w:themeColor="accent1" w:themeShade="BF"/>
+          <w:sz w:val="24"/>
+          <w:szCs w:val="24"/>
+        </w:rPr>
+        <w:t xml:space="preserve"> and whether LTC Webb’s reinforcement-learning attacker, trained on Ukraine’s rail network, still finds strong strategies on sea lanes</w:t>
+      </w:r>
+      <w:r>
+        <w:rPr>
+          <w:sz w:val="24"/>
+          <w:szCs w:val="24"/>
+        </w:rPr>
+        <w:t xml:space="preserve">. I have built a 57-node, 79-edge model of Taiwan’s crude import routes from open sources, with sourced capacities and seven costed adversary actions, connected it to his code, and verified it against an independent max-flow calculation. Early checks show that no single action hurts Taiwan because </w:t>
+      </w:r>
+      <w:r>
+        <w:rPr>
+          <w:sz w:val="24"/>
+          <w:szCs w:val="24"/>
+        </w:rPr>
+        <w:t xml:space="preserve">of </w:t>
+      </w:r>
+      <w:r>
+        <w:rPr>
+          <w:sz w:val="24"/>
+          <w:szCs w:val="24"/>
+        </w:rPr>
+        <w:t>supply reroutes. Over the coming year I will (1) compare optimization baselines against the trained agent, (2) test how the adversary’s best plan changes as blockade and cyber costs vary, and (3) report whether a rail-trained attacker transfers to a maritime network. I will present the results at Projects Day and at the conferences in paragraph 4.</w:t>
       </w:r>
     </w:p>
     <w:p>
@@ -428,9 +570,8 @@
         <w:rPr>
           <w:sz w:val="24"/>
           <w:szCs w:val="24"/>
-          <w:highlight w:val="yellow"/>
-        </w:rPr>
-        <w:t xml:space="preserve">[Working ideas, to be finalized after advisor feedback.]</w:t>
+        </w:rPr>
+        <w:t xml:space="preserve">I have listed my plan in priority order.</w:t>
       </w:r>
     </w:p>
     <w:p>
@@ -452,7 +593,22 @@
           <w:sz w:val="24"/>
           <w:szCs w:val="24"/>
         </w:rPr>
-        <w:t xml:space="preserve">AUSA Global Force Symposium, Huntsville, AL (March 2027): learn how Army Materiel Command and sustainment leaders plan to keep supply moving in a contested theater.</w:t>
+        <w:t xml:space="preserve">From </w:t>
+      </w:r>
+      <w:r>
+        <w:rPr>
+          <w:sz w:val="24"/>
+          <w:szCs w:val="24"/>
+          <w:highlight w:val="yellow"/>
+        </w:rPr>
+        <w:t xml:space="preserve">[12–30 July 2027]</w:t>
+      </w:r>
+      <w:r>
+        <w:rPr>
+          <w:sz w:val="24"/>
+          <w:szCs w:val="24"/>
+        </w:rPr>
+        <w:t xml:space="preserve">, I will spend $6,700 on housing, food, and transportation for a three-week AIAD at MIT Lincoln Laboratory in Lexington, MA, a Department of Defense research center that builds and tests AI and decision-support tools for the military. At TDAC, my agent scored well while starving the priority unit, which is a testing and evaluation failure. At Lincoln Laboratory I will learn how engineers test these tools before they reach Soldiers, and bring that discipline back to my research and to cadet research in the department.</w:t>
       </w:r>
     </w:p>
     <w:p>
@@ -474,7 +630,7 @@
           <w:sz w:val="24"/>
           <w:szCs w:val="24"/>
         </w:rPr>
-        <w:t xml:space="preserve">IEEE SIEDS, University of Virginia (May 2027): submit and present the Taiwan interdiction paper; accepted papers are published in IEEE Xplore.</w:t>
+        <w:t xml:space="preserve">On 24–25 May 2027, I will spend $2,000 on train travel, lodging, and meals to attend the SCSP AI+ Expo in Washington, DC; admission is free. The Expo is the largest gathering of defense-technology companies and government AI leaders in the country, with more than 18,000 attendees. If SCSP runs its National Security Technology Hackathon again, I will enter with a team of cadets; in 2026, finalists demonstrated their prototypes on stage at the Expo. I will also meet the industry teams, such as Palantir’s, whose platforms put models like mine in front of commanders.</w:t>
       </w:r>
     </w:p>
     <w:p>
@@ -496,7 +652,22 @@
           <w:sz w:val="24"/>
           <w:szCs w:val="24"/>
         </w:rPr>
-        <w:t xml:space="preserve">SCSP AI+ Expo and hackathon, Washington, DC (May 2027): compete with a cadet team and reconnect with Palantir.</w:t>
+        <w:t xml:space="preserve">In </w:t>
+      </w:r>
+      <w:r>
+        <w:rPr>
+          <w:sz w:val="24"/>
+          <w:szCs w:val="24"/>
+          <w:highlight w:val="yellow"/>
+        </w:rPr>
+        <w:t xml:space="preserve">[February 2027]</w:t>
+      </w:r>
+      <w:r>
+        <w:rPr>
+          <w:sz w:val="24"/>
+          <w:szCs w:val="24"/>
+        </w:rPr>
+        <w:t xml:space="preserve">, I will spend $300 on bus fare and meals to compete in HackNYU, a 48-hour student hackathon at New York University that draws more than 800 students; registration is free. It is a low-cost way to practice building a working prototype with a team under time pressure before the AI+ Expo hackathon.</w:t>
       </w:r>
     </w:p>
     <w:p>
@@ -505,60 +676,17 @@
         <w:tabs>
           <w:tab w:val="left" w:pos="4680"/>
         </w:tabs>
-        <w:spacing w:before="120"/>
         <w:ind w:left="660"/>
-        <w:contextualSpacing w:val="0"/>
-        <w:rPr>
-          <w:sz w:val="24"/>
-          <w:szCs w:val="24"/>
-        </w:rPr>
-      </w:pPr>
-      <w:r>
-        <w:rPr>
-          <w:sz w:val="24"/>
-          <w:szCs w:val="24"/>
-        </w:rPr>
-        <w:t xml:space="preserve">MORS Symposium (June 2027): present to the Army and Defense Department analysts I intend to join as an FA49.</w:t>
-      </w:r>
+        <w:rPr>
+          <w:sz w:val="24"/>
+          <w:szCs w:val="24"/>
+        </w:rPr>
+      </w:pPr>
     </w:p>
     <w:p>
       <w:pPr>
         <w:pStyle w:val="ListParagraph"/>
-        <w:tabs>
-          <w:tab w:val="left" w:pos="4680"/>
-        </w:tabs>
-        <w:spacing w:before="120"/>
-        <w:ind w:left="660"/>
-        <w:contextualSpacing w:val="0"/>
-        <w:rPr>
-          <w:sz w:val="24"/>
-          <w:szCs w:val="24"/>
-        </w:rPr>
-      </w:pPr>
-      <w:r>
-        <w:rPr>
-          <w:sz w:val="24"/>
-          <w:szCs w:val="24"/>
-        </w:rPr>
-        <w:t xml:space="preserve">MIT Lincoln Laboratory AIAD, Lexington, MA (late July 2027): learn how AI decision tools are tested and evaluated before they reach operators.</w:t>
-      </w:r>
-    </w:p>
-    <w:p>
-      <w:pPr>
-        <w:pStyle w:val="ListParagraph"/>
-        <w:tabs>
-          <w:tab w:val="left" w:pos="4680"/>
-        </w:tabs>
-        <w:ind w:left="660"/>
-        <w:rPr>
-          <w:sz w:val="24"/>
-          <w:szCs w:val="24"/>
-        </w:rPr>
-      </w:pPr>
-    </w:p>
-    <w:p>
-      <w:pPr>
-        <w:pStyle w:val="ListParagraph"/>
+        <w:keepNext/>
         <w:numPr>
           <w:ilvl w:val="0"/>
           <w:numId w:val="28"/>
@@ -582,14 +710,14 @@
         <w:rPr>
           <w:sz w:val="24"/>
           <w:szCs w:val="24"/>
-          <w:highlight w:val="yellow"/>
-        </w:rPr>
-        <w:t xml:space="preserve">[TBD]</w:t>
+        </w:rPr>
+        <w:t xml:space="preserve">Listed in priority order.</w:t>
       </w:r>
     </w:p>
     <w:p>
       <w:pPr>
         <w:pStyle w:val="ListParagraph"/>
+        <w:keepNext/>
         <w:tabs>
           <w:tab w:val="left" w:pos="4680"/>
         </w:tabs>
@@ -605,12 +733,12 @@
         <w:tblW w:w="9247" w:type="dxa"/>
         <w:tblInd w:w="108" w:type="dxa"/>
         <w:tblBorders>
-          <w:top w:val="single" w:color="auto" w:sz="4" w:space="0"/>
-          <w:left w:val="single" w:color="auto" w:sz="4" w:space="0"/>
-          <w:bottom w:val="single" w:color="auto" w:sz="4" w:space="0"/>
-          <w:right w:val="single" w:color="auto" w:sz="4" w:space="0"/>
-          <w:insideH w:val="single" w:color="auto" w:sz="4" w:space="0"/>
-          <w:insideV w:val="single" w:color="auto" w:sz="4" w:space="0"/>
+          <w:top w:val="single" w:sz="4" w:space="0" w:color="auto"/>
+          <w:left w:val="single" w:sz="4" w:space="0" w:color="auto"/>
+          <w:bottom w:val="single" w:sz="4" w:space="0" w:color="auto"/>
+          <w:right w:val="single" w:sz="4" w:space="0" w:color="auto"/>
+          <w:insideH w:val="single" w:sz="4" w:space="0" w:color="auto"/>
+          <w:insideV w:val="single" w:sz="4" w:space="0" w:color="auto"/>
         </w:tblBorders>
         <w:tblLayout w:type="fixed"/>
         <w:tblLook w:val="01E0" w:firstRow="1" w:lastRow="1" w:firstColumn="1" w:lastColumn="1" w:noHBand="0" w:noVBand="0"/>
@@ -624,6 +752,7 @@
       </w:tblGrid>
       <w:tr>
         <w:trPr>
+          <w:cantSplit/>
           <w:trHeight w:val="620"/>
         </w:trPr>
         <w:tc>
@@ -632,6 +761,7 @@
           </w:tcPr>
           <w:p>
             <w:pPr>
+              <w:keepNext/>
               <w:jc w:val="center"/>
               <w:rPr>
                 <w:rFonts w:eastAsia="Batang"/>
@@ -658,6 +788,7 @@
           </w:tcPr>
           <w:p>
             <w:pPr>
+              <w:keepNext/>
               <w:jc w:val="center"/>
               <w:rPr>
                 <w:rFonts w:eastAsia="Batang"/>
@@ -684,6 +815,7 @@
           </w:tcPr>
           <w:p>
             <w:pPr>
+              <w:keepNext/>
               <w:jc w:val="center"/>
               <w:rPr>
                 <w:rFonts w:eastAsia="Batang"/>
@@ -710,6 +842,7 @@
           </w:tcPr>
           <w:p>
             <w:pPr>
+              <w:keepNext/>
               <w:jc w:val="center"/>
               <w:rPr>
                 <w:rFonts w:eastAsia="Batang"/>
@@ -736,6 +869,7 @@
           </w:tcPr>
           <w:p>
             <w:pPr>
+              <w:keepNext/>
               <w:jc w:val="center"/>
               <w:rPr>
                 <w:b/>
@@ -756,6 +890,7 @@
           </w:p>
           <w:p>
             <w:pPr>
+              <w:keepNext/>
               <w:jc w:val="center"/>
               <w:rPr>
                 <w:rFonts w:eastAsia="Batang"/>
@@ -788,6 +923,7 @@
           </w:tcPr>
           <w:p>
             <w:pPr>
+              <w:keepNext/>
               <w:jc w:val="center"/>
               <w:rPr>
                 <w:sz w:val="22"/>
@@ -799,7 +935,7 @@
                 <w:sz w:val="22"/>
                 <w:szCs w:val="22"/>
               </w:rPr>
-              <w:t xml:space="preserve"> </w:t>
+              <w:t xml:space="preserve">AIAD</w:t>
             </w:r>
           </w:p>
         </w:tc>
@@ -810,6 +946,7 @@
           </w:tcPr>
           <w:p>
             <w:pPr>
+              <w:keepNext/>
               <w:jc w:val="center"/>
               <w:rPr>
                 <w:sz w:val="22"/>
@@ -821,7 +958,7 @@
                 <w:sz w:val="22"/>
                 <w:szCs w:val="22"/>
               </w:rPr>
-              <w:t xml:space="preserve"> </w:t>
+              <w:t xml:space="preserve">MIT Lincoln Laboratory</w:t>
             </w:r>
           </w:p>
         </w:tc>
@@ -832,6 +969,7 @@
           </w:tcPr>
           <w:p>
             <w:pPr>
+              <w:keepNext/>
               <w:jc w:val="center"/>
               <w:rPr>
                 <w:sz w:val="22"/>
@@ -843,7 +981,7 @@
                 <w:sz w:val="22"/>
                 <w:szCs w:val="22"/>
               </w:rPr>
-              <w:t xml:space="preserve"> </w:t>
+              <w:t xml:space="preserve">Lexington, MA</w:t>
             </w:r>
           </w:p>
         </w:tc>
@@ -854,6 +992,38 @@
           </w:tcPr>
           <w:p>
             <w:pPr>
+              <w:keepNext/>
+              <w:jc w:val="center"/>
+              <w:rPr>
+                <w:sz w:val="22"/>
+                <w:szCs w:val="22"/>
+              </w:rPr>
+            </w:pPr>
+            <w:r>
+              <w:rPr>
+                <w:sz w:val="22"/>
+                <w:szCs w:val="22"/>
+                <w:highlight w:val="yellow"/>
+              </w:rPr>
+              <w:t xml:space="preserve">[12–30 Jul 2027]</w:t>
+            </w:r>
+            <w:r>
+              <w:rPr>
+                <w:sz w:val="22"/>
+                <w:szCs w:val="22"/>
+              </w:rPr>
+              <w:t xml:space="preserve"> (21 days)</w:t>
+            </w:r>
+          </w:p>
+        </w:tc>
+        <w:tc>
+          <w:tcPr>
+            <w:tcW w:w="1710" w:type="dxa"/>
+            <w:vAlign w:val="center"/>
+          </w:tcPr>
+          <w:p>
+            <w:pPr>
+              <w:keepNext/>
               <w:jc w:val="center"/>
               <w:rPr>
                 <w:sz w:val="22"/>
@@ -865,17 +1035,23 @@
                 <w:sz w:val="22"/>
                 <w:szCs w:val="22"/>
               </w:rPr>
-              <w:t xml:space="preserve"> </w:t>
+              <w:t xml:space="preserve">$6,700</w:t>
             </w:r>
           </w:p>
         </w:tc>
+      </w:tr>
+      <w:tr>
+        <w:trPr>
+          <w:cantSplit/>
+        </w:trPr>
         <w:tc>
           <w:tcPr>
-            <w:tcW w:w="1710" w:type="dxa"/>
+            <w:tcW w:w="2137" w:type="dxa"/>
             <w:vAlign w:val="center"/>
           </w:tcPr>
           <w:p>
             <w:pPr>
+              <w:keepNext/>
               <w:jc w:val="center"/>
               <w:rPr>
                 <w:sz w:val="22"/>
@@ -887,7 +1063,99 @@
                 <w:sz w:val="22"/>
                 <w:szCs w:val="22"/>
               </w:rPr>
-              <w:t xml:space="preserve"> </w:t>
+              <w:t xml:space="preserve">Conference and hackathon</w:t>
+            </w:r>
+          </w:p>
+        </w:tc>
+        <w:tc>
+          <w:tcPr>
+            <w:tcW w:w="1980" w:type="dxa"/>
+            <w:vAlign w:val="center"/>
+          </w:tcPr>
+          <w:p>
+            <w:pPr>
+              <w:keepNext/>
+              <w:jc w:val="center"/>
+              <w:rPr>
+                <w:sz w:val="22"/>
+                <w:szCs w:val="22"/>
+              </w:rPr>
+            </w:pPr>
+            <w:r>
+              <w:rPr>
+                <w:sz w:val="22"/>
+                <w:szCs w:val="22"/>
+              </w:rPr>
+              <w:t xml:space="preserve">SCSP AI+ Expo</w:t>
+            </w:r>
+          </w:p>
+        </w:tc>
+        <w:tc>
+          <w:tcPr>
+            <w:tcW w:w="1890" w:type="dxa"/>
+            <w:vAlign w:val="center"/>
+          </w:tcPr>
+          <w:p>
+            <w:pPr>
+              <w:keepNext/>
+              <w:jc w:val="center"/>
+              <w:rPr>
+                <w:sz w:val="22"/>
+                <w:szCs w:val="22"/>
+              </w:rPr>
+            </w:pPr>
+            <w:r>
+              <w:rPr>
+                <w:sz w:val="22"/>
+                <w:szCs w:val="22"/>
+              </w:rPr>
+              <w:t xml:space="preserve">Washington, DC</w:t>
+            </w:r>
+          </w:p>
+        </w:tc>
+        <w:tc>
+          <w:tcPr>
+            <w:tcW w:w="1530" w:type="dxa"/>
+            <w:vAlign w:val="center"/>
+          </w:tcPr>
+          <w:p>
+            <w:pPr>
+              <w:keepNext/>
+              <w:jc w:val="center"/>
+              <w:rPr>
+                <w:sz w:val="22"/>
+                <w:szCs w:val="22"/>
+              </w:rPr>
+            </w:pPr>
+            <w:r>
+              <w:rPr>
+                <w:sz w:val="22"/>
+                <w:szCs w:val="22"/>
+              </w:rPr>
+              <w:t xml:space="preserve">24–25 May 2027 (3 days)</w:t>
+            </w:r>
+          </w:p>
+        </w:tc>
+        <w:tc>
+          <w:tcPr>
+            <w:tcW w:w="1710" w:type="dxa"/>
+            <w:vAlign w:val="center"/>
+          </w:tcPr>
+          <w:p>
+            <w:pPr>
+              <w:keepNext/>
+              <w:jc w:val="center"/>
+              <w:rPr>
+                <w:sz w:val="22"/>
+                <w:szCs w:val="22"/>
+              </w:rPr>
+            </w:pPr>
+            <w:r>
+              <w:rPr>
+                <w:sz w:val="22"/>
+                <w:szCs w:val="22"/>
+              </w:rPr>
+              <w:t xml:space="preserve">$2,000</w:t>
             </w:r>
           </w:p>
         </w:tc>
@@ -914,7 +1182,7 @@
                 <w:sz w:val="22"/>
                 <w:szCs w:val="22"/>
               </w:rPr>
-              <w:t xml:space="preserve"> </w:t>
+              <w:t xml:space="preserve">Hackathon</w:t>
             </w:r>
           </w:p>
         </w:tc>
@@ -936,7 +1204,7 @@
                 <w:sz w:val="22"/>
                 <w:szCs w:val="22"/>
               </w:rPr>
-              <w:t xml:space="preserve"> </w:t>
+              <w:t xml:space="preserve">HackNYU, New York University</w:t>
             </w:r>
           </w:p>
         </w:tc>
@@ -958,7 +1226,7 @@
                 <w:sz w:val="22"/>
                 <w:szCs w:val="22"/>
               </w:rPr>
-              <w:t xml:space="preserve"> </w:t>
+              <w:t xml:space="preserve">New York, NY</w:t>
             </w:r>
           </w:p>
         </w:tc>
@@ -979,8 +1247,16 @@
               <w:rPr>
                 <w:sz w:val="22"/>
                 <w:szCs w:val="22"/>
+                <w:highlight w:val="yellow"/>
               </w:rPr>
-              <w:t xml:space="preserve"> </w:t>
+              <w:t xml:space="preserve">[Feb 2027]</w:t>
+            </w:r>
+            <w:r>
+              <w:rPr>
+                <w:sz w:val="22"/>
+                <w:szCs w:val="22"/>
+              </w:rPr>
+              <w:t xml:space="preserve"> (2 days)</w:t>
             </w:r>
           </w:p>
         </w:tc>
@@ -1002,122 +1278,7 @@
                 <w:sz w:val="22"/>
                 <w:szCs w:val="22"/>
               </w:rPr>
-              <w:t xml:space="preserve"> </w:t>
-            </w:r>
-          </w:p>
-        </w:tc>
-      </w:tr>
-      <w:tr>
-        <w:trPr>
-          <w:cantSplit/>
-        </w:trPr>
-        <w:tc>
-          <w:tcPr>
-            <w:tcW w:w="2137" w:type="dxa"/>
-            <w:vAlign w:val="center"/>
-          </w:tcPr>
-          <w:p>
-            <w:pPr>
-              <w:jc w:val="center"/>
-              <w:rPr>
-                <w:sz w:val="22"/>
-                <w:szCs w:val="22"/>
-              </w:rPr>
-            </w:pPr>
-            <w:r>
-              <w:rPr>
-                <w:sz w:val="22"/>
-                <w:szCs w:val="22"/>
-              </w:rPr>
-              <w:t xml:space="preserve"> </w:t>
-            </w:r>
-          </w:p>
-        </w:tc>
-        <w:tc>
-          <w:tcPr>
-            <w:tcW w:w="1980" w:type="dxa"/>
-            <w:vAlign w:val="center"/>
-          </w:tcPr>
-          <w:p>
-            <w:pPr>
-              <w:jc w:val="center"/>
-              <w:rPr>
-                <w:sz w:val="22"/>
-                <w:szCs w:val="22"/>
-              </w:rPr>
-            </w:pPr>
-            <w:r>
-              <w:rPr>
-                <w:sz w:val="22"/>
-                <w:szCs w:val="22"/>
-              </w:rPr>
-              <w:t xml:space="preserve"> </w:t>
-            </w:r>
-          </w:p>
-        </w:tc>
-        <w:tc>
-          <w:tcPr>
-            <w:tcW w:w="1890" w:type="dxa"/>
-            <w:vAlign w:val="center"/>
-          </w:tcPr>
-          <w:p>
-            <w:pPr>
-              <w:jc w:val="center"/>
-              <w:rPr>
-                <w:sz w:val="22"/>
-                <w:szCs w:val="22"/>
-              </w:rPr>
-            </w:pPr>
-            <w:r>
-              <w:rPr>
-                <w:sz w:val="22"/>
-                <w:szCs w:val="22"/>
-              </w:rPr>
-              <w:t xml:space="preserve"> </w:t>
-            </w:r>
-          </w:p>
-        </w:tc>
-        <w:tc>
-          <w:tcPr>
-            <w:tcW w:w="1530" w:type="dxa"/>
-            <w:vAlign w:val="center"/>
-          </w:tcPr>
-          <w:p>
-            <w:pPr>
-              <w:jc w:val="center"/>
-              <w:rPr>
-                <w:sz w:val="22"/>
-                <w:szCs w:val="22"/>
-              </w:rPr>
-            </w:pPr>
-            <w:r>
-              <w:rPr>
-                <w:sz w:val="22"/>
-                <w:szCs w:val="22"/>
-              </w:rPr>
-              <w:t xml:space="preserve"> </w:t>
-            </w:r>
-          </w:p>
-        </w:tc>
-        <w:tc>
-          <w:tcPr>
-            <w:tcW w:w="1710" w:type="dxa"/>
-            <w:vAlign w:val="center"/>
-          </w:tcPr>
-          <w:p>
-            <w:pPr>
-              <w:jc w:val="center"/>
-              <w:rPr>
-                <w:sz w:val="22"/>
-                <w:szCs w:val="22"/>
-              </w:rPr>
-            </w:pPr>
-            <w:r>
-              <w:rPr>
-                <w:sz w:val="22"/>
-                <w:szCs w:val="22"/>
-              </w:rPr>
-              <w:t xml:space="preserve"> </w:t>
+              <w:t xml:space="preserve">$300</w:t>
             </w:r>
           </w:p>
         </w:tc>
@@ -1162,9 +1323,8 @@
         <w:rPr>
           <w:sz w:val="24"/>
           <w:szCs w:val="24"/>
-          <w:highlight w:val="yellow"/>
-        </w:rPr>
-        <w:t xml:space="preserve">[TBD]</w:t>
+        </w:rPr>
+        <w:t xml:space="preserve">$9,000 ($6,700 AIAD, $2,000 AI+ Expo, $300 hackathon), within the $10,000 limit.</w:t>
       </w:r>
     </w:p>
     <w:p>
@@ -1199,9 +1359,38 @@
         <w:rPr>
           <w:sz w:val="24"/>
           <w:szCs w:val="24"/>
+        </w:rPr>
+        <w:t xml:space="preserve">Nov 2026–Jan 2027: request the Lincoln Laboratory AIAD and register for HackNYU and the AI+ Expo. </w:t>
+      </w:r>
+      <w:r>
+        <w:rPr>
+          <w:sz w:val="24"/>
+          <w:szCs w:val="24"/>
           <w:highlight w:val="yellow"/>
         </w:rPr>
-        <w:t xml:space="preserve">[TBD]</w:t>
+        <w:t xml:space="preserve">[February 2027]</w:t>
+      </w:r>
+      <w:r>
+        <w:rPr>
+          <w:sz w:val="24"/>
+          <w:szCs w:val="24"/>
+        </w:rPr>
+        <w:t xml:space="preserve">: HackNYU. 24–25 May 2027: AI+ Expo. </w:t>
+      </w:r>
+      <w:r>
+        <w:rPr>
+          <w:sz w:val="24"/>
+          <w:szCs w:val="24"/>
+          <w:highlight w:val="yellow"/>
+        </w:rPr>
+        <w:t xml:space="preserve">[12–30 July 2027]</w:t>
+      </w:r>
+      <w:r>
+        <w:rPr>
+          <w:sz w:val="24"/>
+          <w:szCs w:val="24"/>
+        </w:rPr>
+        <w:t xml:space="preserve">: Lincoln Laboratory AIAD. All funds will be spent by 31 July 2027, well before my graduation in May 2029.</w:t>
       </w:r>
     </w:p>
     <w:p>
@@ -1230,14 +1419,23 @@
           <w:sz w:val="24"/>
           <w:szCs w:val="24"/>
         </w:rPr>
-        <w:t xml:space="preserve">5. Contact information for applicant. </w:t>
-      </w:r>
-      <w:r>
-        <w:rPr>
-          <w:sz w:val="24"/>
-          <w:szCs w:val="24"/>
-        </w:rPr>
-        <w:t xml:space="preserve">CDT Dennis G. Pezan, Company C-2, Class of 2029; dennis.pezan@westpoint.edu; (815) 592-6927.</w:t>
+        <w:t xml:space="preserve">5. Contact information for </w:t>
+      </w:r>
+      <w:proofErr w:type="gramStart"/>
+      <w:r>
+        <w:rPr>
+          <w:sz w:val="24"/>
+          <w:szCs w:val="24"/>
+        </w:rPr>
+        <w:t>applicant</w:t>
+      </w:r>
+      <w:proofErr w:type="gramEnd"/>
+      <w:r>
+        <w:rPr>
+          <w:sz w:val="24"/>
+          <w:szCs w:val="24"/>
+        </w:rPr>
+        <w:t>. CDT Dennis G. Pezan, Company C-2, Class of 2029; dennis.pezan@westpoint.edu; (815) 592-6927.</w:t>
       </w:r>
     </w:p>
     <w:p>
@@ -1289,14 +1487,14 @@
           <w:szCs w:val="24"/>
         </w:rPr>
         <w:t>Encl</w:t>
+      </w:r>
+      <w:r>
+        <w:rPr>
+          <w:sz w:val="24"/>
+          <w:szCs w:val="24"/>
+        </w:rPr>
         <w:tab/>
-      </w:r>
-      <w:r>
-        <w:rPr>
-          <w:sz w:val="24"/>
-          <w:szCs w:val="24"/>
-        </w:rPr>
-        <w:t xml:space="preserve">DENNIS G. PEZAN</w:t>
+        <w:t>DENNIS G. PEZAN</w:t>
       </w:r>
     </w:p>
     <w:p>
@@ -1315,6 +1513,12 @@
           <w:szCs w:val="24"/>
         </w:rPr>
         <w:t xml:space="preserve">Applicant’s Curriculum Vitae </w:t>
+      </w:r>
+      <w:r>
+        <w:rPr>
+          <w:sz w:val="24"/>
+          <w:szCs w:val="24"/>
+        </w:rPr>
         <w:tab/>
         <w:t>CDT, USCC</w:t>
       </w:r>
@@ -1322,7 +1526,7 @@
     <w:sectPr>
       <w:headerReference w:type="default" r:id="rId13"/>
       <w:headerReference w:type="first" r:id="rId14"/>
-      <w:pgSz w:w="12240" w:h="15840" w:orient="portrait" w:code="1"/>
+      <w:pgSz w:w="12240" w:h="15840" w:code="1"/>
       <w:pgMar w:top="1440" w:right="1440" w:bottom="1296" w:left="1440" w:header="432" w:footer="0" w:gutter="0"/>
       <w:pgNumType w:start="1"/>
       <w:cols w:space="720"/>
@@ -2544,7 +2748,7 @@
         <w:ind w:left="720" w:hanging="360"/>
       </w:pPr>
       <w:rPr>
-        <w:rFonts w:hint="default" w:ascii="Times" w:hAnsi="Times"/>
+        <w:rFonts w:ascii="Times" w:hAnsi="Times" w:hint="default"/>
       </w:rPr>
     </w:lvl>
     <w:lvl w:ilvl="1" w:tplc="04090019" w:tentative="1">
@@ -2633,7 +2837,7 @@
         <w:ind w:left="640" w:hanging="336"/>
       </w:pPr>
       <w:rPr>
-        <w:rFonts w:hint="default" w:ascii="Arial" w:hAnsi="Arial" w:eastAsia="Arial" w:cs="Arial"/>
+        <w:rFonts w:ascii="Arial" w:eastAsia="Arial" w:hAnsi="Arial" w:cs="Arial" w:hint="default"/>
         <w:w w:val="99"/>
         <w:sz w:val="24"/>
         <w:szCs w:val="24"/>
@@ -2928,7 +3132,7 @@
         <w:ind w:left="720" w:hanging="360"/>
       </w:pPr>
       <w:rPr>
-        <w:rFonts w:hint="default" w:ascii="Symbol" w:hAnsi="Symbol"/>
+        <w:rFonts w:ascii="Symbol" w:hAnsi="Symbol" w:hint="default"/>
       </w:rPr>
     </w:lvl>
     <w:lvl w:ilvl="1" w:tplc="04090003">
@@ -2940,7 +3144,7 @@
         <w:ind w:left="1440" w:hanging="360"/>
       </w:pPr>
       <w:rPr>
-        <w:rFonts w:hint="default" w:ascii="Courier New" w:hAnsi="Courier New" w:cs="Courier New"/>
+        <w:rFonts w:ascii="Courier New" w:hAnsi="Courier New" w:cs="Courier New" w:hint="default"/>
       </w:rPr>
     </w:lvl>
     <w:lvl w:ilvl="2" w:tplc="04090005" w:tentative="1">
@@ -2952,7 +3156,7 @@
         <w:ind w:left="2160" w:hanging="360"/>
       </w:pPr>
       <w:rPr>
-        <w:rFonts w:hint="default" w:ascii="Wingdings" w:hAnsi="Wingdings"/>
+        <w:rFonts w:ascii="Wingdings" w:hAnsi="Wingdings" w:hint="default"/>
       </w:rPr>
     </w:lvl>
     <w:lvl w:ilvl="3" w:tplc="04090001" w:tentative="1">
@@ -2964,7 +3168,7 @@
         <w:ind w:left="2880" w:hanging="360"/>
       </w:pPr>
       <w:rPr>
-        <w:rFonts w:hint="default" w:ascii="Symbol" w:hAnsi="Symbol"/>
+        <w:rFonts w:ascii="Symbol" w:hAnsi="Symbol" w:hint="default"/>
       </w:rPr>
     </w:lvl>
     <w:lvl w:ilvl="4" w:tplc="04090003" w:tentative="1">
@@ -2976,7 +3180,7 @@
         <w:ind w:left="3600" w:hanging="360"/>
       </w:pPr>
       <w:rPr>
-        <w:rFonts w:hint="default" w:ascii="Courier New" w:hAnsi="Courier New" w:cs="Courier New"/>
+        <w:rFonts w:ascii="Courier New" w:hAnsi="Courier New" w:cs="Courier New" w:hint="default"/>
       </w:rPr>
     </w:lvl>
     <w:lvl w:ilvl="5" w:tplc="04090005" w:tentative="1">
@@ -2988,7 +3192,7 @@
         <w:ind w:left="4320" w:hanging="360"/>
       </w:pPr>
       <w:rPr>
-        <w:rFonts w:hint="default" w:ascii="Wingdings" w:hAnsi="Wingdings"/>
+        <w:rFonts w:ascii="Wingdings" w:hAnsi="Wingdings" w:hint="default"/>
       </w:rPr>
     </w:lvl>
     <w:lvl w:ilvl="6" w:tplc="04090001" w:tentative="1">
@@ -3000,7 +3204,7 @@
         <w:ind w:left="5040" w:hanging="360"/>
       </w:pPr>
       <w:rPr>
-        <w:rFonts w:hint="default" w:ascii="Symbol" w:hAnsi="Symbol"/>
+        <w:rFonts w:ascii="Symbol" w:hAnsi="Symbol" w:hint="default"/>
       </w:rPr>
     </w:lvl>
     <w:lvl w:ilvl="7" w:tplc="04090003" w:tentative="1">
@@ -3012,7 +3216,7 @@
         <w:ind w:left="5760" w:hanging="360"/>
       </w:pPr>
       <w:rPr>
-        <w:rFonts w:hint="default" w:ascii="Courier New" w:hAnsi="Courier New" w:cs="Courier New"/>
+        <w:rFonts w:ascii="Courier New" w:hAnsi="Courier New" w:cs="Courier New" w:hint="default"/>
       </w:rPr>
     </w:lvl>
     <w:lvl w:ilvl="8" w:tplc="04090005" w:tentative="1">
@@ -3024,7 +3228,7 @@
         <w:ind w:left="6480" w:hanging="360"/>
       </w:pPr>
       <w:rPr>
-        <w:rFonts w:hint="default" w:ascii="Wingdings" w:hAnsi="Wingdings"/>
+        <w:rFonts w:ascii="Wingdings" w:hAnsi="Wingdings" w:hint="default"/>
       </w:rPr>
     </w:lvl>
   </w:abstractNum>
@@ -3157,7 +3361,7 @@
         <w:ind w:left="465" w:hanging="360"/>
       </w:pPr>
       <w:rPr>
-        <w:rFonts w:hint="default" w:ascii="Times" w:hAnsi="Times"/>
+        <w:rFonts w:ascii="Times" w:hAnsi="Times" w:hint="default"/>
       </w:rPr>
     </w:lvl>
     <w:lvl w:ilvl="1" w:tplc="04090019" w:tentative="1">
@@ -4338,11 +4542,11 @@
 </file>
 
 <file path=word/styles.xml><?xml version="1.0" encoding="utf-8"?>
-<w:styles xmlns:wp14="http://schemas.microsoft.com/office/word/2010/wordprocessingDrawing" xmlns:mc="http://schemas.openxmlformats.org/markup-compatibility/2006" xmlns:r="http://schemas.openxmlformats.org/officeDocument/2006/relationships" xmlns:w="http://schemas.openxmlformats.org/wordprocessingml/2006/main" xmlns:w14="http://schemas.microsoft.com/office/word/2010/wordml" xmlns:w15="http://schemas.microsoft.com/office/word/2012/wordml" xmlns:w16cex="http://schemas.microsoft.com/office/word/2018/wordml/cex" xmlns:w16cid="http://schemas.microsoft.com/office/word/2016/wordml/cid" xmlns:w16="http://schemas.microsoft.com/office/word/2018/wordml" xmlns:w16du="http://schemas.microsoft.com/office/word/2023/wordml/word16du" xmlns:w16sdtdh="http://schemas.microsoft.com/office/word/2020/wordml/sdtdatahash" xmlns:w16sdtfl="http://schemas.microsoft.com/office/word/2024/wordml/sdtformatlock" xmlns:w16se="http://schemas.microsoft.com/office/word/2015/wordml/symex" mc:Ignorable="w14 w15 w16se w16cid w16 w16cex w16sdtdh w16sdtfl w16du wp14">
+<w:styles xmlns:mc="http://schemas.openxmlformats.org/markup-compatibility/2006" xmlns:r="http://schemas.openxmlformats.org/officeDocument/2006/relationships" xmlns:w="http://schemas.openxmlformats.org/wordprocessingml/2006/main" xmlns:w14="http://schemas.microsoft.com/office/word/2010/wordml" xmlns:w15="http://schemas.microsoft.com/office/word/2012/wordml" xmlns:w16cex="http://schemas.microsoft.com/office/word/2018/wordml/cex" xmlns:w16cid="http://schemas.microsoft.com/office/word/2016/wordml/cid" xmlns:w16="http://schemas.microsoft.com/office/word/2018/wordml" xmlns:w16du="http://schemas.microsoft.com/office/word/2023/wordml/word16du" xmlns:w16sdtdh="http://schemas.microsoft.com/office/word/2020/wordml/sdtdatahash" xmlns:w16sdtfl="http://schemas.microsoft.com/office/word/2024/wordml/sdtformatlock" xmlns:w16se="http://schemas.microsoft.com/office/word/2015/wordml/symex" mc:Ignorable="w14 w15 w16se w16cid w16 w16cex w16sdtdh w16sdtfl w16du">
   <w:docDefaults>
     <w:rPrDefault>
       <w:rPr>
-        <w:rFonts w:ascii="Times New Roman" w:hAnsi="Times New Roman" w:eastAsia="Times New Roman" w:cs="Times New Roman"/>
+        <w:rFonts w:ascii="Times New Roman" w:eastAsia="Times New Roman" w:hAnsi="Times New Roman" w:cs="Times New Roman"/>
         <w:lang w:val="en-US" w:eastAsia="en-US" w:bidi="ar-SA"/>
       </w:rPr>
     </w:rPrDefault>
@@ -4355,10 +4559,10 @@
     <w:lsdException w:name="heading 3" w:uiPriority="9" w:qFormat="1"/>
     <w:lsdException w:name="heading 4" w:uiPriority="9" w:qFormat="1"/>
     <w:lsdException w:name="heading 5" w:uiPriority="9" w:qFormat="1"/>
-    <w:lsdException w:name="heading 6" w:uiPriority="9" w:semiHidden="1" w:unhideWhenUsed="1" w:qFormat="1"/>
-    <w:lsdException w:name="heading 7" w:uiPriority="9" w:semiHidden="1" w:unhideWhenUsed="1" w:qFormat="1"/>
-    <w:lsdException w:name="heading 8" w:uiPriority="9" w:semiHidden="1" w:unhideWhenUsed="1" w:qFormat="1"/>
-    <w:lsdException w:name="heading 9" w:uiPriority="9" w:semiHidden="1" w:unhideWhenUsed="1" w:qFormat="1"/>
+    <w:lsdException w:name="heading 6" w:semiHidden="1" w:uiPriority="9" w:unhideWhenUsed="1" w:qFormat="1"/>
+    <w:lsdException w:name="heading 7" w:semiHidden="1" w:uiPriority="9" w:unhideWhenUsed="1" w:qFormat="1"/>
+    <w:lsdException w:name="heading 8" w:semiHidden="1" w:uiPriority="9" w:unhideWhenUsed="1" w:qFormat="1"/>
+    <w:lsdException w:name="heading 9" w:semiHidden="1" w:uiPriority="9" w:unhideWhenUsed="1" w:qFormat="1"/>
     <w:lsdException w:name="index 1" w:semiHidden="1" w:unhideWhenUsed="1"/>
     <w:lsdException w:name="index 2" w:semiHidden="1" w:unhideWhenUsed="1"/>
     <w:lsdException w:name="index 3" w:semiHidden="1" w:unhideWhenUsed="1"/>
@@ -4368,15 +4572,15 @@
     <w:lsdException w:name="index 7" w:semiHidden="1" w:unhideWhenUsed="1"/>
     <w:lsdException w:name="index 8" w:semiHidden="1" w:unhideWhenUsed="1"/>
     <w:lsdException w:name="index 9" w:semiHidden="1" w:unhideWhenUsed="1"/>
-    <w:lsdException w:name="toc 1" w:uiPriority="39" w:semiHidden="1" w:unhideWhenUsed="1"/>
-    <w:lsdException w:name="toc 2" w:uiPriority="39" w:semiHidden="1" w:unhideWhenUsed="1"/>
-    <w:lsdException w:name="toc 3" w:uiPriority="39" w:semiHidden="1" w:unhideWhenUsed="1"/>
-    <w:lsdException w:name="toc 4" w:uiPriority="39" w:semiHidden="1" w:unhideWhenUsed="1"/>
-    <w:lsdException w:name="toc 5" w:uiPriority="39" w:semiHidden="1" w:unhideWhenUsed="1"/>
-    <w:lsdException w:name="toc 6" w:uiPriority="39" w:semiHidden="1" w:unhideWhenUsed="1"/>
-    <w:lsdException w:name="toc 7" w:uiPriority="39" w:semiHidden="1" w:unhideWhenUsed="1"/>
-    <w:lsdException w:name="toc 8" w:uiPriority="39" w:semiHidden="1" w:unhideWhenUsed="1"/>
-    <w:lsdException w:name="toc 9" w:uiPriority="39" w:semiHidden="1" w:unhideWhenUsed="1"/>
+    <w:lsdException w:name="toc 1" w:semiHidden="1" w:uiPriority="39" w:unhideWhenUsed="1"/>
+    <w:lsdException w:name="toc 2" w:semiHidden="1" w:uiPriority="39" w:unhideWhenUsed="1"/>
+    <w:lsdException w:name="toc 3" w:semiHidden="1" w:uiPriority="39" w:unhideWhenUsed="1"/>
+    <w:lsdException w:name="toc 4" w:semiHidden="1" w:uiPriority="39" w:unhideWhenUsed="1"/>
+    <w:lsdException w:name="toc 5" w:semiHidden="1" w:uiPriority="39" w:unhideWhenUsed="1"/>
+    <w:lsdException w:name="toc 6" w:semiHidden="1" w:uiPriority="39" w:unhideWhenUsed="1"/>
+    <w:lsdException w:name="toc 7" w:semiHidden="1" w:uiPriority="39" w:unhideWhenUsed="1"/>
+    <w:lsdException w:name="toc 8" w:semiHidden="1" w:uiPriority="39" w:unhideWhenUsed="1"/>
+    <w:lsdException w:name="toc 9" w:semiHidden="1" w:uiPriority="39" w:unhideWhenUsed="1"/>
     <w:lsdException w:name="Normal Indent" w:semiHidden="1" w:unhideWhenUsed="1"/>
     <w:lsdException w:name="footnote text" w:semiHidden="1" w:unhideWhenUsed="1"/>
     <w:lsdException w:name="annotation text" w:semiHidden="1" w:unhideWhenUsed="1"/>
@@ -4414,8 +4618,8 @@
     <w:lsdException w:name="Title" w:uiPriority="10" w:qFormat="1"/>
     <w:lsdException w:name="Closing" w:semiHidden="1" w:unhideWhenUsed="1"/>
     <w:lsdException w:name="Signature" w:semiHidden="1" w:unhideWhenUsed="1"/>
-    <w:lsdException w:name="Default Paragraph Font" w:uiPriority="1" w:semiHidden="1" w:unhideWhenUsed="1"/>
-    <w:lsdException w:name="Body Text" w:uiPriority="0" w:semiHidden="1" w:unhideWhenUsed="1"/>
+    <w:lsdException w:name="Default Paragraph Font" w:semiHidden="1" w:uiPriority="1" w:unhideWhenUsed="1"/>
+    <w:lsdException w:name="Body Text" w:semiHidden="1" w:uiPriority="0" w:unhideWhenUsed="1"/>
     <w:lsdException w:name="Body Text Indent" w:semiHidden="1" w:unhideWhenUsed="1"/>
     <w:lsdException w:name="List Continue" w:semiHidden="1" w:unhideWhenUsed="1"/>
     <w:lsdException w:name="List Continue 2" w:semiHidden="1" w:unhideWhenUsed="1"/>
@@ -4614,8 +4818,8 @@
     <w:lsdException w:name="Subtle Reference" w:uiPriority="31" w:qFormat="1"/>
     <w:lsdException w:name="Intense Reference" w:uiPriority="32" w:qFormat="1"/>
     <w:lsdException w:name="Book Title" w:uiPriority="33" w:qFormat="1"/>
-    <w:lsdException w:name="Bibliography" w:uiPriority="37" w:semiHidden="1" w:unhideWhenUsed="1"/>
-    <w:lsdException w:name="TOC Heading" w:uiPriority="39" w:semiHidden="1" w:unhideWhenUsed="1" w:qFormat="1"/>
+    <w:lsdException w:name="Bibliography" w:semiHidden="1" w:uiPriority="37" w:unhideWhenUsed="1"/>
+    <w:lsdException w:name="TOC Heading" w:semiHidden="1" w:uiPriority="39" w:unhideWhenUsed="1" w:qFormat="1"/>
     <w:lsdException w:name="Plain Table 1" w:uiPriority="41"/>
     <w:lsdException w:name="Plain Table 2" w:uiPriority="42"/>
     <w:lsdException w:name="Plain Table 3" w:uiPriority="43"/>
@@ -4726,7 +4930,7 @@
     <w:lsdException w:name="Unresolved Mention" w:semiHidden="1" w:unhideWhenUsed="1"/>
     <w:lsdException w:name="Smart Link" w:semiHidden="1" w:unhideWhenUsed="1"/>
   </w:latentStyles>
-  <w:style w:type="paragraph" w:styleId="Normal" w:default="1">
+  <w:style w:type="paragraph" w:default="1" w:styleId="Normal">
     <w:name w:val="Normal"/>
     <w:qFormat/>
     <w:rsid w:val="00926EC9"/>
@@ -4794,13 +4998,13 @@
       <w:sz w:val="22"/>
     </w:rPr>
   </w:style>
-  <w:style w:type="character" w:styleId="DefaultParagraphFont" w:default="1">
+  <w:style w:type="character" w:default="1" w:styleId="DefaultParagraphFont">
     <w:name w:val="Default Paragraph Font"/>
     <w:uiPriority w:val="1"/>
     <w:semiHidden/>
     <w:unhideWhenUsed/>
   </w:style>
-  <w:style w:type="table" w:styleId="TableNormal" w:default="1">
+  <w:style w:type="table" w:default="1" w:styleId="TableNormal">
     <w:name w:val="Normal Table"/>
     <w:uiPriority w:val="99"/>
     <w:semiHidden/>
@@ -4815,7 +5019,7 @@
       </w:tblCellMar>
     </w:tblPr>
   </w:style>
-  <w:style w:type="numbering" w:styleId="NoList" w:default="1">
+  <w:style w:type="numbering" w:default="1" w:styleId="NoList">
     <w:name w:val="No List"/>
     <w:uiPriority w:val="99"/>
     <w:semiHidden/>
@@ -4832,7 +5036,7 @@
       </w:tabs>
     </w:pPr>
   </w:style>
-  <w:style w:type="paragraph" w:styleId="TEALetterHead" w:customStyle="1">
+  <w:style w:type="paragraph" w:customStyle="1" w:styleId="TEALetterHead">
     <w:name w:val="TEA Letter Head"/>
     <w:basedOn w:val="Normal"/>
     <w:rsid w:val="00926EC9"/>
@@ -4855,7 +5059,7 @@
     <w:qFormat/>
     <w:rsid w:val="00926EC9"/>
     <w:pPr>
-      <w:framePr w:w="5285" w:hSpace="187" w:wrap="auto" w:hAnchor="page" w:vAnchor="page" w:xAlign="center" w:y="901"/>
+      <w:framePr w:w="5285" w:hSpace="187" w:wrap="auto" w:vAnchor="page" w:hAnchor="page" w:xAlign="center" w:y="901"/>
       <w:jc w:val="center"/>
     </w:pPr>
     <w:rPr>
@@ -4961,19 +5165,19 @@
     <w:unhideWhenUsed/>
     <w:rsid w:val="00D646DC"/>
     <w:rPr>
-      <w:rFonts w:ascii="Consolas" w:hAnsi="Consolas" w:eastAsia="Calibri"/>
+      <w:rFonts w:ascii="Consolas" w:eastAsia="Calibri" w:hAnsi="Consolas"/>
       <w:sz w:val="21"/>
       <w:szCs w:val="21"/>
     </w:rPr>
   </w:style>
-  <w:style w:type="character" w:styleId="PlainTextChar" w:customStyle="1">
+  <w:style w:type="character" w:customStyle="1" w:styleId="PlainTextChar">
     <w:name w:val="Plain Text Char"/>
     <w:link w:val="PlainText"/>
     <w:uiPriority w:val="99"/>
     <w:semiHidden/>
     <w:rsid w:val="00D646DC"/>
     <w:rPr>
-      <w:rFonts w:ascii="Consolas" w:hAnsi="Consolas" w:eastAsia="Calibri" w:cs="Times New Roman"/>
+      <w:rFonts w:ascii="Consolas" w:eastAsia="Calibri" w:hAnsi="Consolas" w:cs="Times New Roman"/>
       <w:sz w:val="21"/>
       <w:szCs w:val="21"/>
     </w:rPr>
@@ -4984,7 +5188,7 @@
     <w:qFormat/>
     <w:rsid w:val="00982E02"/>
   </w:style>
-  <w:style w:type="character" w:styleId="Normal12ptChar" w:customStyle="1">
+  <w:style w:type="character" w:customStyle="1" w:styleId="Normal12ptChar">
     <w:name w:val="Normal + 12 pt Char"/>
     <w:link w:val="Normal12pt"/>
     <w:locked/>
@@ -4994,7 +5198,7 @@
       <w:sz w:val="24"/>
     </w:rPr>
   </w:style>
-  <w:style w:type="paragraph" w:styleId="Normal12pt" w:customStyle="1">
+  <w:style w:type="paragraph" w:customStyle="1" w:styleId="Normal12pt">
     <w:name w:val="Normal + 12 pt"/>
     <w:basedOn w:val="Normal"/>
     <w:link w:val="Normal12ptChar"/>
@@ -5024,7 +5228,7 @@
       <w:szCs w:val="16"/>
     </w:rPr>
   </w:style>
-  <w:style w:type="character" w:styleId="BalloonTextChar" w:customStyle="1">
+  <w:style w:type="character" w:customStyle="1" w:styleId="BalloonTextChar">
     <w:name w:val="Balloon Text Char"/>
     <w:link w:val="BalloonText"/>
     <w:uiPriority w:val="99"/>
@@ -5037,7 +5241,7 @@
     </w:rPr>
   </w:style>
   <w:style w:type="character" w:styleId="CommentReference">
-    <w:name w:val="Comment Reference"/>
+    <w:name w:val="annotation reference"/>
     <w:basedOn w:val="DefaultParagraphFont"/>
     <w:uiPriority w:val="99"/>
     <w:semiHidden/>
@@ -5049,14 +5253,14 @@
     </w:rPr>
   </w:style>
   <w:style w:type="paragraph" w:styleId="CommentText">
-    <w:name w:val="Comment Text"/>
+    <w:name w:val="annotation text"/>
     <w:basedOn w:val="Normal"/>
     <w:link w:val="CommentTextChar"/>
     <w:uiPriority w:val="99"/>
     <w:unhideWhenUsed/>
     <w:rsid w:val="00435E1B"/>
   </w:style>
-  <w:style w:type="character" w:styleId="CommentTextChar" w:customStyle="1">
+  <w:style w:type="character" w:customStyle="1" w:styleId="CommentTextChar">
     <w:name w:val="Comment Text Char"/>
     <w:basedOn w:val="DefaultParagraphFont"/>
     <w:link w:val="CommentText"/>
@@ -5064,7 +5268,7 @@
     <w:rsid w:val="00435E1B"/>
   </w:style>
   <w:style w:type="paragraph" w:styleId="CommentSubject">
-    <w:name w:val="Comment Subject"/>
+    <w:name w:val="annotation subject"/>
     <w:basedOn w:val="CommentText"/>
     <w:next w:val="CommentText"/>
     <w:link w:val="CommentSubjectChar"/>
@@ -5077,7 +5281,7 @@
       <w:bCs/>
     </w:rPr>
   </w:style>
-  <w:style w:type="character" w:styleId="CommentSubjectChar" w:customStyle="1">
+  <w:style w:type="character" w:customStyle="1" w:styleId="CommentSubjectChar">
     <w:name w:val="Comment Subject Char"/>
     <w:basedOn w:val="CommentTextChar"/>
     <w:link w:val="CommentSubject"/>
@@ -5105,7 +5309,7 @@
 </file>
 
 <file path=word/theme/theme1.xml><?xml version="1.0" encoding="utf-8"?>
-<a:theme xmlns:a="http://schemas.openxmlformats.org/drawingml/2006/main" xmlns:thm15="http://schemas.microsoft.com/office/thememl/2012/main" name="Office Theme">
+<a:theme xmlns:a="http://schemas.openxmlformats.org/drawingml/2006/main" name="Office Theme">
   <a:themeElements>
     <a:clrScheme name="Office">
       <a:dk1>
@@ -5400,6 +5604,15 @@
 </file>
 
 <file path=customXml/item1.xml><?xml version="1.0" encoding="utf-8"?>
+<?mso-contentType ?>
+<FormTemplates xmlns="http://schemas.microsoft.com/sharepoint/v3/contenttype/forms">
+  <Display>DocumentLibraryForm</Display>
+  <Edit>DocumentLibraryForm</Edit>
+  <New>DocumentLibraryForm</New>
+</FormTemplates>
+</file>
+
+<file path=customXml/item2.xml><?xml version="1.0" encoding="utf-8"?>
 <p:properties xmlns:p="http://schemas.microsoft.com/office/2006/metadata/properties" xmlns:xsi="http://www.w3.org/2001/XMLSchema-instance" xmlns:pc="http://schemas.microsoft.com/office/infopath/2007/PartnerControls">
   <documentManagement>
     <lcf76f155ced4ddcb4097134ff3c332f xmlns="b6c243bf-a1a9-4ba6-8da4-da0b029aa8eb">
@@ -5410,20 +5623,7 @@
 </p:properties>
 </file>
 
-<file path=customXml/item2.xml><?xml version="1.0" encoding="utf-8"?>
-<?mso-contentType ?>
-<FormTemplates xmlns="http://schemas.microsoft.com/sharepoint/v3/contenttype/forms">
-  <Display>DocumentLibraryForm</Display>
-  <Edit>DocumentLibraryForm</Edit>
-  <New>DocumentLibraryForm</New>
-</FormTemplates>
-</file>
-
 <file path=customXml/item3.xml><?xml version="1.0" encoding="utf-8"?>
-<b:Sources xmlns:b="http://schemas.openxmlformats.org/officeDocument/2006/bibliography" xmlns="http://schemas.openxmlformats.org/officeDocument/2006/bibliography" SelectedStyle="\APASixthEditionOfficeOnline.xsl" StyleName="APA" Version="6"/>
-</file>
-
-<file path=customXml/item4.xml><?xml version="1.0" encoding="utf-8"?>
 <ct:contentTypeSchema xmlns:ct="http://schemas.microsoft.com/office/2006/metadata/contentType" xmlns:ma="http://schemas.microsoft.com/office/2006/metadata/properties/metaAttributes" ct:_="" ma:_="" ma:contentTypeName="Document" ma:contentTypeID="0x0101002C90FB65EDBE924A8972BF6227142302" ma:contentTypeVersion="19" ma:contentTypeDescription="Create a new document." ma:contentTypeScope="" ma:versionID="7531c606bbac50d7f91dd9487ee3d38e">
   <xsd:schema xmlns:xsd="http://www.w3.org/2001/XMLSchema" xmlns:xs="http://www.w3.org/2001/XMLSchema" xmlns:p="http://schemas.microsoft.com/office/2006/metadata/properties" xmlns:ns2="b6c243bf-a1a9-4ba6-8da4-da0b029aa8eb" xmlns:ns3="4b0f2749-be2f-491e-8e5a-617d6ac8c552" targetNamespace="http://schemas.microsoft.com/office/2006/metadata/properties" ma:root="true" ma:fieldsID="9dd95e8467294509e291de4fb51054ff" ns2:_="" ns3:_="">
     <xsd:import namespace="b6c243bf-a1a9-4ba6-8da4-da0b029aa8eb"/>
@@ -5684,7 +5884,19 @@
 </ct:contentTypeSchema>
 </file>
 
+<file path=customXml/item4.xml><?xml version="1.0" encoding="utf-8"?>
+<b:Sources xmlns:b="http://schemas.openxmlformats.org/officeDocument/2006/bibliography" xmlns="http://schemas.openxmlformats.org/officeDocument/2006/bibliography" SelectedStyle="\APASixthEditionOfficeOnline.xsl" StyleName="APA" Version="6"/>
+</file>
+
 <file path=customXml/itemProps1.xml><?xml version="1.0" encoding="utf-8"?>
+<ds:datastoreItem xmlns:ds="http://schemas.openxmlformats.org/officeDocument/2006/customXml" ds:itemID="{978C89D2-7780-4E9D-AEC7-39D64F46D75F}">
+  <ds:schemaRefs>
+    <ds:schemaRef ds:uri="http://schemas.microsoft.com/sharepoint/v3/contenttype/forms"/>
+  </ds:schemaRefs>
+</ds:datastoreItem>
+</file>
+
+<file path=customXml/itemProps2.xml><?xml version="1.0" encoding="utf-8"?>
 <ds:datastoreItem xmlns:ds="http://schemas.openxmlformats.org/officeDocument/2006/customXml" ds:itemID="{A0AE37E5-FCCF-403F-9424-D1529FE8218C}">
   <ds:schemaRefs>
     <ds:schemaRef ds:uri="http://schemas.microsoft.com/office/2006/metadata/properties"/>
@@ -5695,22 +5907,29 @@
 </ds:datastoreItem>
 </file>
 
-<file path=customXml/itemProps2.xml><?xml version="1.0" encoding="utf-8"?>
-<ds:datastoreItem xmlns:ds="http://schemas.openxmlformats.org/officeDocument/2006/customXml" ds:itemID="{978C89D2-7780-4E9D-AEC7-39D64F46D75F}">
+<file path=customXml/itemProps3.xml><?xml version="1.0" encoding="utf-8"?>
+<ds:datastoreItem xmlns:ds="http://schemas.openxmlformats.org/officeDocument/2006/customXml" ds:itemID="{CB4D324C-0A4C-4816-A153-56E19F56D8EC}">
   <ds:schemaRefs>
-    <ds:schemaRef ds:uri="http://schemas.microsoft.com/sharepoint/v3/contenttype/forms"/>
+    <ds:schemaRef ds:uri="http://schemas.microsoft.com/office/2006/metadata/contentType"/>
+    <ds:schemaRef ds:uri="http://schemas.microsoft.com/office/2006/metadata/properties/metaAttributes"/>
+    <ds:schemaRef ds:uri="http://www.w3.org/2001/XMLSchema"/>
+    <ds:schemaRef ds:uri="http://schemas.microsoft.com/office/2006/metadata/properties"/>
+    <ds:schemaRef ds:uri="b6c243bf-a1a9-4ba6-8da4-da0b029aa8eb"/>
+    <ds:schemaRef ds:uri="4b0f2749-be2f-491e-8e5a-617d6ac8c552"/>
+    <ds:schemaRef ds:uri="http://schemas.microsoft.com/office/2006/documentManagement/types"/>
+    <ds:schemaRef ds:uri="http://schemas.microsoft.com/office/infopath/2007/PartnerControls"/>
+    <ds:schemaRef ds:uri="http://schemas.openxmlformats.org/package/2006/metadata/core-properties"/>
+    <ds:schemaRef ds:uri="http://purl.org/dc/elements/1.1/"/>
+    <ds:schemaRef ds:uri="http://purl.org/dc/terms/"/>
+    <ds:schemaRef ds:uri="http://schemas.microsoft.com/internal/obd"/>
   </ds:schemaRefs>
 </ds:datastoreItem>
 </file>
 
-<file path=customXml/itemProps3.xml><?xml version="1.0" encoding="utf-8"?>
+<file path=customXml/itemProps4.xml><?xml version="1.0" encoding="utf-8"?>
 <ds:datastoreItem xmlns:ds="http://schemas.openxmlformats.org/officeDocument/2006/customXml" ds:itemID="{F2D63063-93F0-4B9D-AAEA-4663A59CF496}">
   <ds:schemaRefs>
     <ds:schemaRef ds:uri="http://schemas.openxmlformats.org/officeDocument/2006/bibliography"/>
   </ds:schemaRefs>
 </ds:datastoreItem>
-</file>
-
-<file path=customXml/itemProps4.xml><?xml version="1.0" encoding="utf-8"?>
-<ds:datastoreItem xmlns:ds="http://schemas.openxmlformats.org/officeDocument/2006/customXml" ds:itemID="{CB4D324C-0A4C-4816-A153-56E19F56D8EC}"/>
 </file>
</xml_diff>

<commit_message>
Memo: shorter paragraphs per LTC Kuiper, priority budget with Duke alternate
Split paragraphs 2 and 3 (max five sentences each), trim the LTC Webb
detail, and list conferences by priority at $2,000 each with the
Lincoln Laboratory AIAD first and Duke ECE as the alternate.

Co-Authored-By: Claude Opus 5.5 <noreply@anthropic.com>
Claude-Session: https://claude.ai/code/session_01HUa9sxRc7o7bsnuzSz3H5S
</commit_message>
<xml_diff>
--- a/application/Pezan_DXDT_Application_Memo_DRAFT.docx
+++ b/application/Pezan_DXDT_Application_Memo_DRAFT.docx
@@ -354,53 +354,14 @@
           <w:sz w:val="24"/>
           <w:szCs w:val="24"/>
         </w:rPr>
-        <w:t xml:space="preserve">2. Purpose. Mr. </w:t>
-      </w:r>
-      <w:proofErr w:type="spellStart"/>
-      <w:r>
-        <w:rPr>
-          <w:sz w:val="24"/>
-          <w:szCs w:val="24"/>
-        </w:rPr>
-        <w:t>Philippone</w:t>
-      </w:r>
-      <w:proofErr w:type="spellEnd"/>
-      <w:r>
-        <w:rPr>
-          <w:sz w:val="24"/>
-          <w:szCs w:val="24"/>
-        </w:rPr>
-        <w:t xml:space="preserve"> has described data as the ammunition of the future and has framed a commander’s hardest choices as constrained optimization: finding the best decision across competing tradeoffs, fast enough to matter. This past summer I saw that idea from three angles. On the Sea to Shining Sea AIAD, Palantir’s team in Palo Alto walked us through Project Maven and how it gives commanders at every echelon a common picture to decide from. A few days later, at the 4th Infantry Division, we saw how a formation </w:t>
+        <w:t xml:space="preserve">2. Purpose. </w:t>
       </w:r>
       <w:r>
         <w:rPr>
           <w:sz w:val="24"/>
           <w:szCs w:val="24"/>
         </w:rPr>
-        <w:t>employs</w:t>
-      </w:r>
-      <w:r>
-        <w:rPr>
-          <w:sz w:val="24"/>
-          <w:szCs w:val="24"/>
-        </w:rPr>
-        <w:t xml:space="preserve"> those systems and feeds lessons back to the developers. At Stanford’s Gordian Knot Center, Col. (Ret.) Joseph Felter and Jack Faherty described how student startups get new technology into the hands of Army units, and why that is so hard. Then, at my second AIAD with the Army’s Transformation Decision Analysis Center (TDAC), I built the other half: a reinforcement-learning model for contested resupply. This semester I am modeling how an adversary would cut a supply network. Models like these only matter once a platform puts them in front of a commander. I am pursuing the DXDT “Velocity” Scholarship for two reasons. First, its funding would take my interdiction research out of the classroom: to Army and defense conferences where I can present it, a hackathon where I can compete, and MIT Lincoln Laboratory, where I can learn how tools like it </w:t>
-      </w:r>
-      <w:proofErr w:type="gramStart"/>
-      <w:r>
-        <w:rPr>
-          <w:sz w:val="24"/>
-          <w:szCs w:val="24"/>
-        </w:rPr>
-        <w:t>are</w:t>
-      </w:r>
-      <w:proofErr w:type="gramEnd"/>
-      <w:r>
-        <w:rPr>
-          <w:sz w:val="24"/>
-          <w:szCs w:val="24"/>
-        </w:rPr>
-        <w:t xml:space="preserve"> tested before they reach a commander. Second, as a Velocity Scholar I would seek a Palantir AIAD with the Maven team, where I can learn how a fielded platform turns models like mine into decisions and bring that practice back to my research and my future formation.</w:t>
+        <w:t xml:space="preserve">Mr. Philippone has described data as the ammunition of the future and has framed a commander’s hardest choices as constrained optimization: finding the best decision across competing tradeoffs, fast enough to matter. This past summer I saw that idea from three angles. On the Sea to Shining Sea AIAD, Palantir’s team in Palo Alto walked us through Project Maven and how it gives commanders at every echelon a common picture to decide from. At the 4th Infantry Division, we saw how a formation employs those systems and feeds lessons back to the developers. At Stanford’s Gordian Knot Center, Col. (Ret.) Joseph Felter and Jack Faherty described how student startups get new technology into the hands of Army units, and why that is so hard.</w:t>
       </w:r>
     </w:p>
     <w:p>
@@ -408,7 +369,6 @@
         <w:tabs>
           <w:tab w:val="left" w:pos="4680"/>
         </w:tabs>
-        <w:ind w:left="540" w:hanging="540"/>
         <w:rPr>
           <w:sz w:val="24"/>
           <w:szCs w:val="24"/>
@@ -421,8 +381,6 @@
           <w:tab w:val="left" w:pos="4680"/>
         </w:tabs>
         <w:rPr>
-          <w:i/>
-          <w:iCs/>
           <w:sz w:val="24"/>
           <w:szCs w:val="24"/>
         </w:rPr>
@@ -432,75 +390,102 @@
           <w:sz w:val="24"/>
           <w:szCs w:val="24"/>
         </w:rPr>
-        <w:t xml:space="preserve">3. Near-term Research Goals.  My near-term goal is to build a cadet research program that combines reinforcement learning and network optimization for contested logistics. At TDAC I </w:t>
+        <w:t xml:space="preserve">At my second AIAD, with the Army’s Transformation Decision Analysis Center (TDAC), I built the other half: a reinforcement-learning model for contested resupply. I am pursuing the DXDT “Velocity” Scholarship for two reasons. First, its funding would take my research out of the classroom: to defense conferences where I can present it, a hackathon where I can compete, and an AIAD where I can learn how tools like it are tested before they reach a commander. Second, as a Velocity Scholar I would seek to work alongside industry partners such as Palantir, whether through an AIAD, a hackathon, or a joint research project, and bring that practice back to my research and my future formation.</w:t>
+      </w:r>
+    </w:p>
+    <w:p>
+      <w:pPr>
+        <w:tabs>
+          <w:tab w:val="left" w:pos="4680"/>
+        </w:tabs>
+        <w:ind w:left="540" w:hanging="540"/>
+        <w:rPr>
+          <w:sz w:val="24"/>
+          <w:szCs w:val="24"/>
+        </w:rPr>
+      </w:pPr>
+    </w:p>
+    <w:p>
+      <w:pPr>
+        <w:tabs>
+          <w:tab w:val="left" w:pos="4680"/>
+        </w:tabs>
+        <w:rPr>
+          <w:sz w:val="24"/>
+          <w:szCs w:val="24"/>
+        </w:rPr>
+      </w:pPr>
+      <w:r>
+        <w:rPr>
+          <w:sz w:val="24"/>
+          <w:szCs w:val="24"/>
+        </w:rPr>
+        <w:t xml:space="preserve">3. Near-term Research Goals.  </w:t>
       </w:r>
       <w:r>
         <w:rPr>
           <w:sz w:val="24"/>
           <w:szCs w:val="24"/>
         </w:rPr>
-        <w:lastRenderedPageBreak/>
-        <w:t xml:space="preserve">redesigned the reward function for a reinforcement-learning agent that allocates resupply in Logistics Battle Command, the Army’s sustainment simulation. I built diagnostic tools that </w:t>
+        <w:t xml:space="preserve">My near-term goal is to build a cadet research program that combines reinforcement learning and network optimization for contested logistics. At TDAC I redesigned the reward function for a reinforcement-learning agent that allocates resupply in Logistics Battle Command, the Army’s sustainment simulation. I built diagnostic tools that exposed why a high-scoring agent was starving the priority unit, and the retrained agent more than tripled the share of requests filled.</w:t>
       </w:r>
-      <w:proofErr w:type="gramStart"/>
+    </w:p>
+    <w:p>
+      <w:pPr>
+        <w:tabs>
+          <w:tab w:val="left" w:pos="4680"/>
+        </w:tabs>
+        <w:rPr>
+          <w:sz w:val="24"/>
+          <w:szCs w:val="24"/>
+        </w:rPr>
+      </w:pPr>
+    </w:p>
+    <w:p>
+      <w:pPr>
+        <w:tabs>
+          <w:tab w:val="left" w:pos="4680"/>
+        </w:tabs>
+        <w:rPr>
+          <w:sz w:val="24"/>
+          <w:szCs w:val="24"/>
+        </w:rPr>
+      </w:pPr>
       <w:r>
         <w:rPr>
           <w:sz w:val="24"/>
           <w:szCs w:val="24"/>
         </w:rPr>
-        <w:t>exposed</w:t>
+        <w:t xml:space="preserve">This semester I am extending that work to network interdiction with my advisor, LTC Matthew Webb, whose doctoral research was in transportation and logistics. My project asks where an adversary with a fixed effort budget should act to cut Taiwan’s crude oil supply. Additionally, it tests whether LTC Webb’s reinforcement-learning attacker, trained on Ukraine’s rail network, still finds strong strategies on sea lanes. I built a 57-node, 79-edge model of Taiwan’s crude import routes from open sources, with sourced capacities and seven costed adversary actions, and verified it against an independent max-flow calculation. Early tests show that no single action cuts Taiwan’s supply, because shipments reroute.</w:t>
       </w:r>
-      <w:proofErr w:type="gramEnd"/>
+    </w:p>
+    <w:p>
+      <w:pPr>
+        <w:tabs>
+          <w:tab w:val="left" w:pos="4680"/>
+        </w:tabs>
+        <w:rPr>
+          <w:sz w:val="24"/>
+          <w:szCs w:val="24"/>
+        </w:rPr>
+      </w:pPr>
+    </w:p>
+    <w:p>
+      <w:pPr>
+        <w:tabs>
+          <w:tab w:val="left" w:pos="4680"/>
+        </w:tabs>
+        <w:rPr>
+          <w:sz w:val="24"/>
+          <w:szCs w:val="24"/>
+        </w:rPr>
+      </w:pPr>
       <w:r>
         <w:rPr>
           <w:sz w:val="24"/>
           <w:szCs w:val="24"/>
         </w:rPr>
-        <w:t xml:space="preserve"> why a high-scoring agent was starving the priority unit, and the retrained agent more than tripled the share of requests filled. This semester I am working on network interdiction with my advisor, LTC Matthew Webb, whose doctoral research with the MIT Center for Transportation &amp; Logistics developed a reinforcement-learning approach to maximum-flow network interdiction (Webb and Caplice, submitted to Networks). </w:t>
-      </w:r>
-      <w:r>
-        <w:rPr>
-          <w:color w:val="EE0000"/>
-          <w:sz w:val="24"/>
-          <w:szCs w:val="24"/>
-        </w:rPr>
-        <w:t>My project asks where an adversary with a fixed effort budget should act to cut Taiwan’s crude oil supply</w:t>
-      </w:r>
-      <w:r>
-        <w:rPr>
-          <w:sz w:val="24"/>
-          <w:szCs w:val="24"/>
-        </w:rPr>
-        <w:t>,</w:t>
-      </w:r>
-      <w:r>
-        <w:rPr>
-          <w:color w:val="2F5496" w:themeColor="accent1" w:themeShade="BF"/>
-          <w:sz w:val="24"/>
-          <w:szCs w:val="24"/>
-        </w:rPr>
-        <w:t xml:space="preserve"> and whether LTC Webb’s reinforcement-learning attacker, trained on Ukraine’s rail network, still finds strong strategies on sea lanes</w:t>
-      </w:r>
-      <w:r>
-        <w:rPr>
-          <w:sz w:val="24"/>
-          <w:szCs w:val="24"/>
-        </w:rPr>
-        <w:t xml:space="preserve">. I have built a 57-node, 79-edge model of Taiwan’s crude import routes from open sources, with sourced capacities and seven costed adversary actions, connected it to his code, and verified it against an independent max-flow calculation. Early checks show that no single action hurts Taiwan because </w:t>
-      </w:r>
-      <w:r>
-        <w:rPr>
-          <w:sz w:val="24"/>
-          <w:szCs w:val="24"/>
-        </w:rPr>
-        <w:t xml:space="preserve">of </w:t>
-      </w:r>
-      <w:r>
-        <w:rPr>
-          <w:sz w:val="24"/>
-          <w:szCs w:val="24"/>
-        </w:rPr>
-        <w:t>supply reroutes. Over the coming year I will (1) compare optimization baselines against the trained agent, (2) test how the adversary’s best plan changes as blockade and cyber costs vary, and (3) report whether a rail-trained attacker transfers to a maritime network. I will present the results at Projects Day and at the conferences in paragraph 4.</w:t>
+        <w:t xml:space="preserve">Over the coming year I will (1) compare optimization baselines against the trained agent, (2) run wargaming scenarios that vary blockade and cyber costs to see how the adversary’s best plan changes, and (3) report whether a rail-trained attacker transfers to a maritime network. I will present the results at Projects Day and at the conferences in paragraph 4.</w:t>
       </w:r>
     </w:p>
     <w:p>
@@ -571,7 +556,7 @@
           <w:sz w:val="24"/>
           <w:szCs w:val="24"/>
         </w:rPr>
-        <w:t xml:space="preserve">I have listed my plan in priority order.</w:t>
+        <w:t xml:space="preserve">My plan is one AIAD and three conferences in priority order. I request funding for the AIAD and my first-priority conference; the second and third are alternates if a higher priority falls through.</w:t>
       </w:r>
     </w:p>
     <w:p>
@@ -593,7 +578,7 @@
           <w:sz w:val="24"/>
           <w:szCs w:val="24"/>
         </w:rPr>
-        <w:t xml:space="preserve">From </w:t>
+        <w:t xml:space="preserve">AIAD. From </w:t>
       </w:r>
       <w:r>
         <w:rPr>
@@ -608,7 +593,7 @@
           <w:sz w:val="24"/>
           <w:szCs w:val="24"/>
         </w:rPr>
-        <w:t xml:space="preserve">, I will spend $6,700 on housing, food, and transportation for a three-week AIAD at MIT Lincoln Laboratory in Lexington, MA, a Department of Defense research center that builds and tests AI and decision-support tools for the military. At TDAC, my agent scored well while starving the priority unit, which is a testing and evaluation failure. At Lincoln Laboratory I will learn how engineers test these tools before they reach Soldiers, and bring that discipline back to my research and to cadet research in the department.</w:t>
+        <w:t xml:space="preserve">, I will spend $6,700 on housing, food, and transportation for a three-week AIAD at MIT Lincoln Laboratory in Lexington, MA, a Department of Defense research center that builds and tests AI and decision-support tools for the military. At TDAC, my agent scored well while starving the priority unit, which is a testing and evaluation failure. At Lincoln Laboratory I will learn how engineers test these tools before they reach Soldiers. If a Lincoln Laboratory placement is not available, my alternate is a research AIAD at Duke University’s Department of Electrical and Computer Engineering, where LTC Patrick Kuiper earned his doctorate, at the same cost.</w:t>
       </w:r>
     </w:p>
     <w:p>
@@ -630,7 +615,7 @@
           <w:sz w:val="24"/>
           <w:szCs w:val="24"/>
         </w:rPr>
-        <w:t xml:space="preserve">On 24–25 May 2027, I will spend $2,000 on train travel, lodging, and meals to attend the SCSP AI+ Expo in Washington, DC; admission is free. The Expo is the largest gathering of defense-technology companies and government AI leaders in the country, with more than 18,000 attendees. If SCSP runs its National Security Technology Hackathon again, I will enter with a team of cadets; in 2026, finalists demonstrated their prototypes on stage at the Expo. I will also meet the industry teams, such as Palantir’s, whose platforms put models like mine in front of commanders.</w:t>
+        <w:t xml:space="preserve">Conference, Priority 1. On 24–25 May 2027, I will spend $2,000 on train travel, lodging, and meals to attend the SCSP AI+ Expo in Washington, DC; admission is free. The Expo is the largest gathering of defense-technology companies and government AI leaders in the country, with more than 18,000 attendees. If SCSP runs its National Security Technology Hackathon again, I will enter with a team of cadets. I will also meet industry teams, such as Palantir’s, whose platforms put models like mine in front of commanders.</w:t>
       </w:r>
     </w:p>
     <w:p>
@@ -652,7 +637,7 @@
           <w:sz w:val="24"/>
           <w:szCs w:val="24"/>
         </w:rPr>
-        <w:t xml:space="preserve">In </w:t>
+        <w:t xml:space="preserve">Conference, Priority 2. In </w:t>
       </w:r>
       <w:r>
         <w:rPr>
@@ -660,14 +645,36 @@
           <w:szCs w:val="24"/>
           <w:highlight w:val="yellow"/>
         </w:rPr>
-        <w:t xml:space="preserve">[February 2027]</w:t>
+        <w:t xml:space="preserve">[early May 2027]</w:t>
       </w:r>
       <w:r>
         <w:rPr>
           <w:sz w:val="24"/>
           <w:szCs w:val="24"/>
         </w:rPr>
-        <w:t xml:space="preserve">, I will spend $300 on bus fare and meals to compete in HackNYU, a 48-hour student hackathon at New York University that draws more than 800 students; registration is free. It is a low-cost way to practice building a working prototype with a team under time pressure before the AI+ Expo hackathon.</w:t>
+        <w:t xml:space="preserve">, I will spend $2,000 on travel, lodging, meals, and registration to present my Taiwan interdiction paper at the IEEE Systems and Information Engineering Design Symposium (SIEDS) at the University of Virginia, if accepted. Accepted papers are published in IEEE Xplore, which would give the project a peer-reviewed, citable result for the department.</w:t>
+      </w:r>
+    </w:p>
+    <w:p>
+      <w:pPr>
+        <w:pStyle w:val="ListParagraph"/>
+        <w:tabs>
+          <w:tab w:val="left" w:pos="4680"/>
+        </w:tabs>
+        <w:spacing w:before="120"/>
+        <w:ind w:left="660"/>
+        <w:contextualSpacing w:val="0"/>
+        <w:rPr>
+          <w:sz w:val="24"/>
+          <w:szCs w:val="24"/>
+        </w:rPr>
+      </w:pPr>
+      <w:r>
+        <w:rPr>
+          <w:sz w:val="24"/>
+          <w:szCs w:val="24"/>
+        </w:rPr>
+        <w:t xml:space="preserve">Conference, Priority 3. From 16–18 March 2027, I will spend $2,000 on travel, lodging, and meals to attend the AUSA Global Force Symposium in Huntsville, AL, hosted with Army Materiel Command; registration is free for military attendees. There, the Army’s sustainment leaders explain how they plan to keep supply moving in a contested theater, which would sharpen the defender side of my model.</w:t>
       </w:r>
     </w:p>
     <w:p>
@@ -711,7 +718,7 @@
           <w:sz w:val="24"/>
           <w:szCs w:val="24"/>
         </w:rPr>
-        <w:t xml:space="preserve">Listed in priority order.</w:t>
+        <w:t xml:space="preserve">Conferences are listed in priority order; Priorities 2 and 3 are alternates.</w:t>
       </w:r>
     </w:p>
     <w:p>
@@ -958,7 +965,7 @@
                 <w:sz w:val="22"/>
                 <w:szCs w:val="22"/>
               </w:rPr>
-              <w:t xml:space="preserve">MIT Lincoln Laboratory</w:t>
+              <w:t xml:space="preserve">MIT Lincoln Laboratory (alt: Duke University ECE)</w:t>
             </w:r>
           </w:p>
         </w:tc>
@@ -981,7 +988,7 @@
                 <w:sz w:val="22"/>
                 <w:szCs w:val="22"/>
               </w:rPr>
-              <w:t xml:space="preserve">Lexington, MA</w:t>
+              <w:t xml:space="preserve">Lexington, MA (alt: Durham, NC)</w:t>
             </w:r>
           </w:p>
         </w:tc>
@@ -1063,7 +1070,7 @@
                 <w:sz w:val="22"/>
                 <w:szCs w:val="22"/>
               </w:rPr>
-              <w:t xml:space="preserve">Conference and hackathon</w:t>
+              <w:t xml:space="preserve">Conference, Priority 1</w:t>
             </w:r>
           </w:p>
         </w:tc>
@@ -1086,7 +1093,7 @@
                 <w:sz w:val="22"/>
                 <w:szCs w:val="22"/>
               </w:rPr>
-              <w:t xml:space="preserve">SCSP AI+ Expo</w:t>
+              <w:t xml:space="preserve">SCSP AI+ Expo and hackathon</w:t>
             </w:r>
           </w:p>
         </w:tc>
@@ -1132,7 +1139,128 @@
                 <w:sz w:val="22"/>
                 <w:szCs w:val="22"/>
               </w:rPr>
-              <w:t xml:space="preserve">24–25 May 2027 (3 days)</w:t>
+              <w:t xml:space="preserve">24–25 May 2027</w:t>
+            </w:r>
+          </w:p>
+        </w:tc>
+        <w:tc>
+          <w:tcPr>
+            <w:tcW w:w="1710" w:type="dxa"/>
+            <w:vAlign w:val="center"/>
+          </w:tcPr>
+          <w:p>
+            <w:pPr>
+              <w:keepNext/>
+              <w:jc w:val="center"/>
+              <w:rPr>
+                <w:sz w:val="22"/>
+                <w:szCs w:val="22"/>
+              </w:rPr>
+            </w:pPr>
+            <w:r>
+              <w:rPr>
+                <w:sz w:val="22"/>
+                <w:szCs w:val="22"/>
+              </w:rPr>
+              <w:t xml:space="preserve">$2,000</w:t>
+            </w:r>
+          </w:p>
+        </w:tc>
+      </w:tr>
+      <w:tr>
+        <w:trPr>
+          <w:cantSplit/>
+        </w:trPr>
+        <w:tc>
+          <w:tcPr>
+            <w:tcW w:w="2137" w:type="dxa"/>
+            <w:vAlign w:val="center"/>
+          </w:tcPr>
+          <w:p>
+            <w:pPr>
+              <w:keepNext/>
+              <w:jc w:val="center"/>
+              <w:rPr>
+                <w:sz w:val="22"/>
+                <w:szCs w:val="22"/>
+              </w:rPr>
+            </w:pPr>
+            <w:r>
+              <w:rPr>
+                <w:sz w:val="22"/>
+                <w:szCs w:val="22"/>
+              </w:rPr>
+              <w:t xml:space="preserve">Conference, Priority 2 (alternate)</w:t>
+            </w:r>
+          </w:p>
+        </w:tc>
+        <w:tc>
+          <w:tcPr>
+            <w:tcW w:w="1980" w:type="dxa"/>
+            <w:vAlign w:val="center"/>
+          </w:tcPr>
+          <w:p>
+            <w:pPr>
+              <w:keepNext/>
+              <w:jc w:val="center"/>
+              <w:rPr>
+                <w:sz w:val="22"/>
+                <w:szCs w:val="22"/>
+              </w:rPr>
+            </w:pPr>
+            <w:r>
+              <w:rPr>
+                <w:sz w:val="22"/>
+                <w:szCs w:val="22"/>
+              </w:rPr>
+              <w:t xml:space="preserve">IEEE SIEDS, University of Virginia</w:t>
+            </w:r>
+          </w:p>
+        </w:tc>
+        <w:tc>
+          <w:tcPr>
+            <w:tcW w:w="1890" w:type="dxa"/>
+            <w:vAlign w:val="center"/>
+          </w:tcPr>
+          <w:p>
+            <w:pPr>
+              <w:keepNext/>
+              <w:jc w:val="center"/>
+              <w:rPr>
+                <w:sz w:val="22"/>
+                <w:szCs w:val="22"/>
+              </w:rPr>
+            </w:pPr>
+            <w:r>
+              <w:rPr>
+                <w:sz w:val="22"/>
+                <w:szCs w:val="22"/>
+              </w:rPr>
+              <w:t xml:space="preserve">Charlottesville, VA</w:t>
+            </w:r>
+          </w:p>
+        </w:tc>
+        <w:tc>
+          <w:tcPr>
+            <w:tcW w:w="1530" w:type="dxa"/>
+            <w:vAlign w:val="center"/>
+          </w:tcPr>
+          <w:p>
+            <w:pPr>
+              <w:keepNext/>
+              <w:jc w:val="center"/>
+              <w:rPr>
+                <w:sz w:val="22"/>
+                <w:szCs w:val="22"/>
+              </w:rPr>
+            </w:pPr>
+            <w:r>
+              <w:rPr>
+                <w:sz w:val="22"/>
+                <w:szCs w:val="22"/>
+                <w:highlight w:val="yellow"/>
+              </w:rPr>
+              <w:t xml:space="preserve">[Early May 2027]</w:t>
             </w:r>
           </w:p>
         </w:tc>
@@ -1182,7 +1310,7 @@
                 <w:sz w:val="22"/>
                 <w:szCs w:val="22"/>
               </w:rPr>
-              <w:t xml:space="preserve">Hackathon</w:t>
+              <w:t xml:space="preserve">Conference, Priority 3 (alternate)</w:t>
             </w:r>
           </w:p>
         </w:tc>
@@ -1204,7 +1332,7 @@
                 <w:sz w:val="22"/>
                 <w:szCs w:val="22"/>
               </w:rPr>
-              <w:t xml:space="preserve">HackNYU, New York University</w:t>
+              <w:t xml:space="preserve">AUSA Global Force Symposium</w:t>
             </w:r>
           </w:p>
         </w:tc>
@@ -1226,7 +1354,7 @@
                 <w:sz w:val="22"/>
                 <w:szCs w:val="22"/>
               </w:rPr>
-              <w:t xml:space="preserve">New York, NY</w:t>
+              <w:t xml:space="preserve">Huntsville, AL</w:t>
             </w:r>
           </w:p>
         </w:tc>
@@ -1247,16 +1375,8 @@
               <w:rPr>
                 <w:sz w:val="22"/>
                 <w:szCs w:val="22"/>
-                <w:highlight w:val="yellow"/>
               </w:rPr>
-              <w:t xml:space="preserve">[Feb 2027]</w:t>
-            </w:r>
-            <w:r>
-              <w:rPr>
-                <w:sz w:val="22"/>
-                <w:szCs w:val="22"/>
-              </w:rPr>
-              <w:t xml:space="preserve"> (2 days)</w:t>
+              <w:t xml:space="preserve">16–18 Mar 2027</w:t>
             </w:r>
           </w:p>
         </w:tc>
@@ -1278,7 +1398,7 @@
                 <w:sz w:val="22"/>
                 <w:szCs w:val="22"/>
               </w:rPr>
-              <w:t xml:space="preserve">$300</w:t>
+              <w:t xml:space="preserve">$2,000</w:t>
             </w:r>
           </w:p>
         </w:tc>
@@ -1324,7 +1444,7 @@
           <w:sz w:val="24"/>
           <w:szCs w:val="24"/>
         </w:rPr>
-        <w:t xml:space="preserve">$9,000 ($6,700 AIAD, $2,000 AI+ Expo, $300 hackathon), within the $10,000 limit.</w:t>
+        <w:t xml:space="preserve">$8,700: the AIAD ($6,700) and the first-priority conference ($2,000). Each alternate is also estimated at $2,000, so any substitution keeps the total at $8,700, within the $10,000 limit.</w:t>
       </w:r>
     </w:p>
     <w:p>
@@ -1360,7 +1480,7 @@
           <w:sz w:val="24"/>
           <w:szCs w:val="24"/>
         </w:rPr>
-        <w:t xml:space="preserve">Nov 2026–Jan 2027: request the Lincoln Laboratory AIAD and register for HackNYU and the AI+ Expo. </w:t>
+        <w:t xml:space="preserve">Nov 2026–Feb 2027: request the AIAD placement, submit the SIEDS abstract, and register for the conferences. Mar–May 2027: attend the funded conference (Global Force 16–18 March, SIEDS </w:t>
       </w:r>
       <w:r>
         <w:rPr>
@@ -1368,14 +1488,14 @@
           <w:szCs w:val="24"/>
           <w:highlight w:val="yellow"/>
         </w:rPr>
-        <w:t xml:space="preserve">[February 2027]</w:t>
+        <w:t xml:space="preserve">[early May]</w:t>
       </w:r>
       <w:r>
         <w:rPr>
           <w:sz w:val="24"/>
           <w:szCs w:val="24"/>
         </w:rPr>
-        <w:t xml:space="preserve">: HackNYU. 24–25 May 2027: AI+ Expo. </w:t>
+        <w:t xml:space="preserve">, or the AI+ Expo 24–25 May). </w:t>
       </w:r>
       <w:r>
         <w:rPr>
@@ -1390,7 +1510,7 @@
           <w:sz w:val="24"/>
           <w:szCs w:val="24"/>
         </w:rPr>
-        <w:t xml:space="preserve">: Lincoln Laboratory AIAD. All funds will be spent by 31 July 2027, well before my graduation in May 2029.</w:t>
+        <w:t xml:space="preserve">: complete the AIAD. All funds will be spent by 31 July 2027, well before my graduation in May 2029.</w:t>
       </w:r>
     </w:p>
     <w:p>

</xml_diff>

<commit_message>
Memo: open paragraph 2 with the reasons for applying
Co-Authored-By: Claude Opus 5.5 <noreply@anthropic.com>
Claude-Session: https://claude.ai/code/session_01HUa9sxRc7o7bsnuzSz3H5S
</commit_message>
<xml_diff>
--- a/application/Pezan_DXDT_Application_Memo_DRAFT.docx
+++ b/application/Pezan_DXDT_Application_Memo_DRAFT.docx
@@ -361,6 +361,35 @@
           <w:sz w:val="24"/>
           <w:szCs w:val="24"/>
         </w:rPr>
+        <w:t xml:space="preserve">I am pursuing the DXDT “Velocity” Scholarship for two reasons. First, its funding would take my research out of the classroom: to defense conferences where I can present it, a hackathon where I can compete, and an AIAD where I can learn how tools like it are tested before they reach a commander. Second, as a Velocity Scholar I would seek to work alongside industry partners such as Palantir, whether through an AIAD, a hackathon, or a joint research project. Both would let me bring what I learn back to my research, to cadet research in the department, and to my future formation.</w:t>
+      </w:r>
+    </w:p>
+    <w:p>
+      <w:pPr>
+        <w:tabs>
+          <w:tab w:val="left" w:pos="4680"/>
+        </w:tabs>
+        <w:rPr>
+          <w:sz w:val="24"/>
+          <w:szCs w:val="24"/>
+        </w:rPr>
+      </w:pPr>
+    </w:p>
+    <w:p>
+      <w:pPr>
+        <w:tabs>
+          <w:tab w:val="left" w:pos="4680"/>
+        </w:tabs>
+        <w:rPr>
+          <w:sz w:val="24"/>
+          <w:szCs w:val="24"/>
+        </w:rPr>
+      </w:pPr>
+      <w:r>
+        <w:rPr>
+          <w:sz w:val="24"/>
+          <w:szCs w:val="24"/>
+        </w:rPr>
         <w:t xml:space="preserve">Mr. Philippone has described data as the ammunition of the future and has framed a commander’s hardest choices as constrained optimization: finding the best decision across competing tradeoffs, fast enough to matter. This past summer I saw that idea from three angles. On the Sea to Shining Sea AIAD, Palantir’s team in Palo Alto walked us through Project Maven and how it gives commanders at every echelon a common picture to decide from. At the 4th Infantry Division, we saw how a formation employs those systems and feeds lessons back to the developers. At Stanford’s Gordian Knot Center, Col. (Ret.) Joseph Felter and Jack Faherty described how student startups get new technology into the hands of Army units, and why that is so hard.</w:t>
       </w:r>
     </w:p>
@@ -390,7 +419,7 @@
           <w:sz w:val="24"/>
           <w:szCs w:val="24"/>
         </w:rPr>
-        <w:t xml:space="preserve">At my second AIAD, with the Army’s Transformation Decision Analysis Center (TDAC), I built the other half: a reinforcement-learning model for contested resupply. I am pursuing the DXDT “Velocity” Scholarship for two reasons. First, its funding would take my research out of the classroom: to defense conferences where I can present it, a hackathon where I can compete, and an AIAD where I can learn how tools like it are tested before they reach a commander. Second, as a Velocity Scholar I would seek to work alongside industry partners such as Palantir, whether through an AIAD, a hackathon, or a joint research project, and bring that practice back to my research and my future formation.</w:t>
+        <w:t xml:space="preserve">At my second AIAD, with the Army’s Transformation Decision Analysis Center (TDAC), I built the other half: a reinforcement-learning model for contested resupply. Models like mine only matter once a platform puts them in front of a commander, and this scholarship would help me learn how to close that gap.</w:t>
       </w:r>
     </w:p>
     <w:p>

</xml_diff>

<commit_message>
Memo: remove colons from body text
Co-Authored-By: Claude Opus 5.5 <noreply@anthropic.com>
Claude-Session: https://claude.ai/code/session_01HUa9sxRc7o7bsnuzSz3H5S
</commit_message>
<xml_diff>
--- a/application/Pezan_DXDT_Application_Memo_DRAFT.docx
+++ b/application/Pezan_DXDT_Application_Memo_DRAFT.docx
@@ -361,7 +361,7 @@
           <w:sz w:val="24"/>
           <w:szCs w:val="24"/>
         </w:rPr>
-        <w:t xml:space="preserve">I am pursuing the DXDT “Velocity” Scholarship for two reasons. First, its funding would take my research out of the classroom: to defense conferences where I can present it, a hackathon where I can compete, and an AIAD where I can learn how tools like it are tested before they reach a commander. Second, as a Velocity Scholar I would seek to work alongside industry partners such as Palantir, whether through an AIAD, a hackathon, or a joint research project. Both would let me bring what I learn back to my research, to cadet research in the department, and to my future formation.</w:t>
+        <w:t xml:space="preserve">I am pursuing the DXDT “Velocity” Scholarship for two reasons. First, its funding would take my research beyond the classroom. I could present it at defense conferences, compete with it at a hackathon, and learn at an AIAD how tools like it are tested before they reach a commander. Second, as a Velocity Scholar I would seek to work alongside industry partners such as Palantir, whether through an AIAD, a hackathon, or a joint research project. Both would let me bring what I learn back to my research, to cadet research in the department, and to my future formation.</w:t>
       </w:r>
     </w:p>
     <w:p>
@@ -390,7 +390,7 @@
           <w:sz w:val="24"/>
           <w:szCs w:val="24"/>
         </w:rPr>
-        <w:t xml:space="preserve">Mr. Philippone has described data as the ammunition of the future and has framed a commander’s hardest choices as constrained optimization: finding the best decision across competing tradeoffs, fast enough to matter. This past summer I saw that idea from three angles. On the Sea to Shining Sea AIAD, Palantir’s team in Palo Alto walked us through Project Maven and how it gives commanders at every echelon a common picture to decide from. At the 4th Infantry Division, we saw how a formation employs those systems and feeds lessons back to the developers. At Stanford’s Gordian Knot Center, Col. (Ret.) Joseph Felter and Jack Faherty described how student startups get new technology into the hands of Army units, and why that is so hard.</w:t>
+        <w:t xml:space="preserve">Mr. Philippone has described data as the ammunition of the future and has framed a commander’s hardest choices as constrained optimization, which means finding the best decision across competing tradeoffs fast enough to matter. This past summer I saw that idea from three angles. On the Sea to Shining Sea AIAD, Palantir’s team in Palo Alto walked us through Project Maven and how it gives commanders at every echelon a common picture to decide from. At the 4th Infantry Division, we saw how a formation employs those systems and feeds lessons back to the developers. At Stanford’s Gordian Knot Center, Col. (Ret.) Joseph Felter and Jack Faherty described how student startups get new technology into the hands of Army units, and why that is so hard.</w:t>
       </w:r>
     </w:p>
     <w:p>
@@ -419,7 +419,7 @@
           <w:sz w:val="24"/>
           <w:szCs w:val="24"/>
         </w:rPr>
-        <w:t xml:space="preserve">At my second AIAD, with the Army’s Transformation Decision Analysis Center (TDAC), I built the other half: a reinforcement-learning model for contested resupply. Models like mine only matter once a platform puts them in front of a commander, and this scholarship would help me learn how to close that gap.</w:t>
+        <w:t xml:space="preserve">At my second AIAD, with the Army’s Transformation Decision Analysis Center (TDAC), I built the other half, a reinforcement-learning model for contested resupply. Models like mine only matter once a platform puts them in front of a commander, and this scholarship would help me learn how to close that gap.</w:t>
       </w:r>
     </w:p>
     <w:p>
@@ -994,7 +994,7 @@
                 <w:sz w:val="22"/>
                 <w:szCs w:val="22"/>
               </w:rPr>
-              <w:t xml:space="preserve">MIT Lincoln Laboratory (alt: Duke University ECE)</w:t>
+              <w:t xml:space="preserve">MIT Lincoln Laboratory (alternate, Duke University ECE)</w:t>
             </w:r>
           </w:p>
         </w:tc>
@@ -1017,7 +1017,7 @@
                 <w:sz w:val="22"/>
                 <w:szCs w:val="22"/>
               </w:rPr>
-              <w:t xml:space="preserve">Lexington, MA (alt: Durham, NC)</w:t>
+              <w:t xml:space="preserve">Lexington, MA (alternate, Durham, NC)</w:t>
             </w:r>
           </w:p>
         </w:tc>
@@ -1473,7 +1473,7 @@
           <w:sz w:val="24"/>
           <w:szCs w:val="24"/>
         </w:rPr>
-        <w:t xml:space="preserve">$8,700: the AIAD ($6,700) and the first-priority conference ($2,000). Each alternate is also estimated at $2,000, so any substitution keeps the total at $8,700, within the $10,000 limit.</w:t>
+        <w:t xml:space="preserve">$8,700, covering the AIAD ($6,700) and the first-priority conference ($2,000). Each alternate is also estimated at $2,000, so any substitution keeps the total at $8,700, within the $10,000 limit.</w:t>
       </w:r>
     </w:p>
     <w:p>
@@ -1509,7 +1509,7 @@
           <w:sz w:val="24"/>
           <w:szCs w:val="24"/>
         </w:rPr>
-        <w:t xml:space="preserve">Nov 2026–Feb 2027: request the AIAD placement, submit the SIEDS abstract, and register for the conferences. Mar–May 2027: attend the funded conference (Global Force 16–18 March, SIEDS </w:t>
+        <w:t xml:space="preserve">From November 2026 to February 2027, I will request the AIAD placement, submit the SIEDS abstract, and register for the conferences. Between March and May 2027, I will attend the funded conference (Global Force on 16–18 March, SIEDS in </w:t>
       </w:r>
       <w:r>
         <w:rPr>
@@ -1524,7 +1524,7 @@
           <w:sz w:val="24"/>
           <w:szCs w:val="24"/>
         </w:rPr>
-        <w:t xml:space="preserve">, or the AI+ Expo 24–25 May). </w:t>
+        <w:t xml:space="preserve">, or the AI+ Expo on 24–25 May). I will complete the AIAD from </w:t>
       </w:r>
       <w:r>
         <w:rPr>
@@ -1539,7 +1539,7 @@
           <w:sz w:val="24"/>
           <w:szCs w:val="24"/>
         </w:rPr>
-        <w:t xml:space="preserve">: complete the AIAD. All funds will be spent by 31 July 2027, well before my graduation in May 2029.</w:t>
+        <w:t xml:space="preserve">. All funds will be spent by 31 July 2027, well before my graduation in May 2029.</w:t>
       </w:r>
     </w:p>
     <w:p>

</xml_diff>

<commit_message>
Memo: add MITx supply chain courses to the user's latest draft; fix colons and typos
Co-Authored-By: Claude Opus 5.5 <noreply@anthropic.com>
Claude-Session: https://claude.ai/code/session_01HUa9sxRc7o7bsnuzSz3H5S
</commit_message>
<xml_diff>
--- a/application/Pezan_DXDT_Application_Memo_DRAFT.docx
+++ b/application/Pezan_DXDT_Application_Memo_DRAFT.docx
@@ -133,10 +133,10 @@
             <v:path o:extrusionok="f" gradientshapeok="t" o:connecttype="rect"/>
             <o:lock v:ext="edit" aspectratio="t"/>
           </v:shapetype>
-          <v:shape id="_x0000_i1025" type="#_x0000_t75" style="width:71.3pt;height:71.3pt" o:ole="" fillcolor="window">
+          <v:shape id="_x0000_i1025" type="#_x0000_t75" style="width:71.5pt;height:71.5pt" o:ole="" fillcolor="window">
             <v:imagedata r:id="rId11" o:title=""/>
           </v:shape>
-          <o:OLEObject Type="Embed" ProgID="Word.Picture.8" ShapeID="_x0000_i1025" DrawAspect="Content" ObjectID="_1853593667" r:id="rId12"/>
+          <o:OLEObject Type="Embed" ProgID="Word.Picture.8" ShapeID="_x0000_i1025" DrawAspect="Content" ObjectID="_1853643262" r:id="rId12"/>
         </w:object>
       </w:r>
     </w:p>
@@ -300,14 +300,7 @@
           <w:sz w:val="24"/>
           <w:szCs w:val="24"/>
         </w:rPr>
-        <w:t>1.  Long-term Professional Goals.  I intend to serve as an Army officer who turns operational problems into rigorous models and fielded software. I plan to commission as an Infantry officer and lead Soldiers first, because the problems worth modeling start in formations. As an Operations Research major with a minor in artificial intelligence and a finance specialization, I then want to build toward service as an Operations Research/Systems Analyst (FA49) or in an Army AI organization, where decision science directly shapes how the force is sustained and employed. Longer term, I plan to earn a graduate degree in operations research or machine learning and return to West Point to teach in the Department of Mathematical Sciences, bringing current industry practice into the classroom.</w:t>
-      </w:r>
-      <w:r>
-        <w:rPr>
-          <w:sz w:val="24"/>
-          <w:szCs w:val="24"/>
-        </w:rPr>
-        <w:br/>
+        <w:t xml:space="preserve">1.  Long-term Professional Goals.  I intend to serve as an Army officer who turns operational problems into rigorous models and fielded software. I plan to commission as an Infantry officer and lead Soldiers first, because I believe many crucial problems start within formations. As an Operations Research major with a minor in artificial intelligence and a finance specialization, I then want to build toward service as an Operations Research/Systems Analyst (FA49) or work with AI through the Army AI Integration Center (AI2C) or the GenAI Task Force. Additionally, I plan to earn a graduate degree, such as an MBA or another qualifying degree, and return to West Point to teach in the Department of Mathematical Sciences, bringing current industry practice into the classroom.</w:t>
       </w:r>
     </w:p>
     <w:p>
@@ -325,7 +318,7 @@
           <w:sz w:val="24"/>
           <w:szCs w:val="24"/>
         </w:rPr>
-        <w:t>COULD BREAK IT DOWN FURTHER EX. AFTER COMPANY COMMAND = LONG TEMRS. BEFORE = SHORT TERM</w:t>
+        <w:t xml:space="preserve">2. Purpose. Mr. Philippone has described data as the ammunition of the future and has framed a commander’s hardest choices as constrained optimization, which means finding the best decision across competing tradeoffs fast enough to matter. This past summer I saw that idea from three angles. On the Sea to Shining Sea AIAD, Palantir’s team in Palo Alto walked us through Project Maven and how it gives commanders at every echelon a common picture to decide from. At the 4th Infantry Division, we saw how a formation employs those systems and feeds lessons back to the developers. At Stanford’s Gordian Knot Center, Col. (Ret.) Joseph Felter and Jack Faherty described how student startups get new technology into the hands of Army units, and why that is so hard.</w:t>
       </w:r>
     </w:p>
     <w:p>
@@ -354,14 +347,7 @@
           <w:sz w:val="24"/>
           <w:szCs w:val="24"/>
         </w:rPr>
-        <w:t xml:space="preserve">2. Purpose. </w:t>
-      </w:r>
-      <w:r>
-        <w:rPr>
-          <w:sz w:val="24"/>
-          <w:szCs w:val="24"/>
-        </w:rPr>
-        <w:t xml:space="preserve">I am pursuing the DXDT “Velocity” Scholarship for two reasons. First, its funding would take my research beyond the classroom. I could present it at defense conferences, compete with it at a hackathon, and learn at an AIAD how tools like it are tested before they reach a commander. Second, as a Velocity Scholar I would seek to work alongside industry partners such as Palantir, whether through an AIAD, a hackathon, or a joint research project. Both would let me bring what I learn back to my research, to cadet research in the department, and to my future formation.</w:t>
+        <w:t>At my second AIAD, with the Army’s Transformation Decision Analysis Center (TDAC), I built a reinforcement-learning model for contested resupply. I am pursuing the DXDT “Velocity” Scholarship for two reasons. First, its funding would take my research out of the classroom to defense conferences where I can present it, a hackathon where I can compete, and an AIAD where I can learn how tools like it are tested before they reach a commander. Second, as a Velocity Scholar I would seek to work alongside industry partners such as Palantir, whether through an AIAD, a hackathon, or a joint research project, and bring that practice back to my research and my future formation.</w:t>
       </w:r>
     </w:p>
     <w:p>
@@ -369,6 +355,7 @@
         <w:tabs>
           <w:tab w:val="left" w:pos="4680"/>
         </w:tabs>
+        <w:ind w:left="540" w:hanging="540"/>
         <w:rPr>
           <w:sz w:val="24"/>
           <w:szCs w:val="24"/>
@@ -390,7 +377,7 @@
           <w:sz w:val="24"/>
           <w:szCs w:val="24"/>
         </w:rPr>
-        <w:t xml:space="preserve">Mr. Philippone has described data as the ammunition of the future and has framed a commander’s hardest choices as constrained optimization, which means finding the best decision across competing tradeoffs fast enough to matter. This past summer I saw that idea from three angles. On the Sea to Shining Sea AIAD, Palantir’s team in Palo Alto walked us through Project Maven and how it gives commanders at every echelon a common picture to decide from. At the 4th Infantry Division, we saw how a formation employs those systems and feeds lessons back to the developers. At Stanford’s Gordian Knot Center, Col. (Ret.) Joseph Felter and Jack Faherty described how student startups get new technology into the hands of Army units, and why that is so hard.</w:t>
+        <w:t xml:space="preserve">3. Near-term Research Goals.  My near-term goal is to complete and present my research on a transportation and logistics problem that combines reinforcement learning and network optimization on a maritime network. At TDAC I redesigned the reward function for a reinforcement-learning agent that allocates resupply in Logistics Battle Command, the Army’s sustainment simulation. I built diagnostic tools that exposed why a high-scoring agent was starving the priority unit, and the retrained agent more than tripled the share of requests filled.</w:t>
       </w:r>
     </w:p>
     <w:p>
@@ -419,7 +406,7 @@
           <w:sz w:val="24"/>
           <w:szCs w:val="24"/>
         </w:rPr>
-        <w:t xml:space="preserve">At my second AIAD, with the Army’s Transformation Decision Analysis Center (TDAC), I built the other half, a reinforcement-learning model for contested resupply. Models like mine only matter once a platform puts them in front of a commander, and this scholarship would help me learn how to close that gap.</w:t>
+        <w:t xml:space="preserve">This semester I am extending that work to network interdiction with my advisor, LTC Matthew Webb, whose doctoral research was in transportation and logistics. My project asks where an adversary with a fixed effort budget should act to cut Taiwan’s crude oil supply. Additionally, it tests whether LTC Webb’s reinforcement-learning attacker, trained on Ukraine’s rail network, still finds strong strategies on sea lanes. I built a 57-node, 79-edge model of Taiwan’s crude import routes from open sources, with sourced capacities and seven costed adversary actions, and verified it against an independent max-flow calculation. </w:t>
       </w:r>
     </w:p>
     <w:p>
@@ -427,7 +414,6 @@
         <w:tabs>
           <w:tab w:val="left" w:pos="4680"/>
         </w:tabs>
-        <w:ind w:left="540" w:hanging="540"/>
         <w:rPr>
           <w:sz w:val="24"/>
           <w:szCs w:val="24"/>
@@ -449,72 +435,7 @@
           <w:sz w:val="24"/>
           <w:szCs w:val="24"/>
         </w:rPr>
-        <w:t xml:space="preserve">3. Near-term Research Goals.  </w:t>
-      </w:r>
-      <w:r>
-        <w:rPr>
-          <w:sz w:val="24"/>
-          <w:szCs w:val="24"/>
-        </w:rPr>
-        <w:t xml:space="preserve">My near-term goal is to build a cadet research program that combines reinforcement learning and network optimization for contested logistics. At TDAC I redesigned the reward function for a reinforcement-learning agent that allocates resupply in Logistics Battle Command, the Army’s sustainment simulation. I built diagnostic tools that exposed why a high-scoring agent was starving the priority unit, and the retrained agent more than tripled the share of requests filled.</w:t>
-      </w:r>
-    </w:p>
-    <w:p>
-      <w:pPr>
-        <w:tabs>
-          <w:tab w:val="left" w:pos="4680"/>
-        </w:tabs>
-        <w:rPr>
-          <w:sz w:val="24"/>
-          <w:szCs w:val="24"/>
-        </w:rPr>
-      </w:pPr>
-    </w:p>
-    <w:p>
-      <w:pPr>
-        <w:tabs>
-          <w:tab w:val="left" w:pos="4680"/>
-        </w:tabs>
-        <w:rPr>
-          <w:sz w:val="24"/>
-          <w:szCs w:val="24"/>
-        </w:rPr>
-      </w:pPr>
-      <w:r>
-        <w:rPr>
-          <w:sz w:val="24"/>
-          <w:szCs w:val="24"/>
-        </w:rPr>
-        <w:t xml:space="preserve">This semester I am extending that work to network interdiction with my advisor, LTC Matthew Webb, whose doctoral research was in transportation and logistics. My project asks where an adversary with a fixed effort budget should act to cut Taiwan’s crude oil supply. Additionally, it tests whether LTC Webb’s reinforcement-learning attacker, trained on Ukraine’s rail network, still finds strong strategies on sea lanes. I built a 57-node, 79-edge model of Taiwan’s crude import routes from open sources, with sourced capacities and seven costed adversary actions, and verified it against an independent max-flow calculation. Early tests show that no single action cuts Taiwan’s supply, because shipments reroute.</w:t>
-      </w:r>
-    </w:p>
-    <w:p>
-      <w:pPr>
-        <w:tabs>
-          <w:tab w:val="left" w:pos="4680"/>
-        </w:tabs>
-        <w:rPr>
-          <w:sz w:val="24"/>
-          <w:szCs w:val="24"/>
-        </w:rPr>
-      </w:pPr>
-    </w:p>
-    <w:p>
-      <w:pPr>
-        <w:tabs>
-          <w:tab w:val="left" w:pos="4680"/>
-        </w:tabs>
-        <w:rPr>
-          <w:sz w:val="24"/>
-          <w:szCs w:val="24"/>
-        </w:rPr>
-      </w:pPr>
-      <w:r>
-        <w:rPr>
-          <w:sz w:val="24"/>
-          <w:szCs w:val="24"/>
-        </w:rPr>
-        <w:t xml:space="preserve">Over the coming year I will (1) compare optimization baselines against the trained agent, (2) run wargaming scenarios that vary blockade and cyber costs to see how the adversary’s best plan changes, and (3) report whether a rail-trained attacker transfers to a maritime network. I will present the results at Projects Day and at the conferences in paragraph 4.</w:t>
+        <w:t>Over the coming year I will (1) compare optimization baselines against the trained agent, (2) run wargaming scenarios that vary blockade and cyber costs to see how the adversary’s best plan changes, and (3) report whether a rail-trained attacker transfers to a maritime network. I will present the results at Projects Day and at the conferences in paragraph 4.</w:t>
       </w:r>
     </w:p>
     <w:p>
@@ -578,14 +499,7 @@
           <w:sz w:val="24"/>
           <w:szCs w:val="24"/>
         </w:rPr>
-        <w:t xml:space="preserve">Funding Plan.  </w:t>
-      </w:r>
-      <w:r>
-        <w:rPr>
-          <w:sz w:val="24"/>
-          <w:szCs w:val="24"/>
-        </w:rPr>
-        <w:t xml:space="preserve">My plan is one AIAD and three conferences in priority order. I request funding for the AIAD and my first-priority conference; the second and third are alternates if a higher priority falls through.</w:t>
+        <w:t xml:space="preserve">Funding Plan.  My plan is one AIAD, three conferences in priority order, and three online courses. I request funding for the AIAD, my first-priority conference, and the courses; the second and third conferences are alternates if a higher priority falls through.</w:t>
       </w:r>
     </w:p>
     <w:p>
@@ -613,16 +527,50 @@
         <w:rPr>
           <w:sz w:val="24"/>
           <w:szCs w:val="24"/>
-          <w:highlight w:val="yellow"/>
-        </w:rPr>
-        <w:t xml:space="preserve">[12–30 July 2027]</w:t>
+        </w:rPr>
+        <w:t>11</w:t>
       </w:r>
       <w:r>
         <w:rPr>
           <w:sz w:val="24"/>
           <w:szCs w:val="24"/>
         </w:rPr>
-        <w:t xml:space="preserve">, I will spend $6,700 on housing, food, and transportation for a three-week AIAD at MIT Lincoln Laboratory in Lexington, MA, a Department of Defense research center that builds and tests AI and decision-support tools for the military. At TDAC, my agent scored well while starving the priority unit, which is a testing and evaluation failure. At Lincoln Laboratory I will learn how engineers test these tools before they reach Soldiers. If a Lincoln Laboratory placement is not available, my alternate is a research AIAD at Duke University’s Department of Electrical and Computer Engineering, where LTC Patrick Kuiper earned his doctorate, at the same cost.</w:t>
+        <w:t>–</w:t>
+      </w:r>
+      <w:r>
+        <w:rPr>
+          <w:sz w:val="24"/>
+          <w:szCs w:val="24"/>
+        </w:rPr>
+        <w:t>31</w:t>
+      </w:r>
+      <w:r>
+        <w:rPr>
+          <w:sz w:val="24"/>
+          <w:szCs w:val="24"/>
+        </w:rPr>
+        <w:t xml:space="preserve"> July 2027,</w:t>
+      </w:r>
+      <w:r>
+        <w:rPr>
+          <w:sz w:val="24"/>
+          <w:szCs w:val="24"/>
+        </w:rPr>
+        <w:t xml:space="preserve"> I will spend $6,700 on housing, food, and transportation for a three-week AIAD at MIT Lincoln Laboratory in Lexington, MA, a Department of Defense research center that builds and tests AI and decision-support tools for the military. At TDAC, my agent scored well while starving the priority unit, which is a testing and evaluation failure. At Lincoln Laboratory I will learn how engineers test these tools before they reach Soldiers. If a Lincoln Laboratory placement is not available, my alternate is a research AIAD at Duke University’s Department of Electrical and Computer Engineering, where LTC Patrick Kuiper earned his doctorate, at the same </w:t>
+      </w:r>
+      <w:r>
+        <w:rPr>
+          <w:sz w:val="24"/>
+          <w:szCs w:val="24"/>
+        </w:rPr>
+        <w:t xml:space="preserve">estimated </w:t>
+      </w:r>
+      <w:r>
+        <w:rPr>
+          <w:sz w:val="24"/>
+          <w:szCs w:val="24"/>
+        </w:rPr>
+        <w:t>cost.</w:t>
       </w:r>
     </w:p>
     <w:p>
@@ -644,7 +592,7 @@
           <w:sz w:val="24"/>
           <w:szCs w:val="24"/>
         </w:rPr>
-        <w:t xml:space="preserve">Conference, Priority 1. On 24–25 May 2027, I will spend $2,000 on train travel, lodging, and meals to attend the SCSP AI+ Expo in Washington, DC; admission is free. The Expo is the largest gathering of defense-technology companies and government AI leaders in the country, with more than 18,000 attendees. If SCSP runs its National Security Technology Hackathon again, I will enter with a team of cadets. I will also meet industry teams, such as Palantir’s, whose platforms put models like mine in front of commanders.</w:t>
+        <w:t xml:space="preserve">Conference, Priority 1. On 24–25 May 2027, I will spend $2,000 on train travel, lodging, and meals to attend the SCSP AI+ Expo in Washington, DC; admission is free. The Expo is the largest gathering of defense-technology companies and government AI leaders in the country, with more than 18,000 attendees. If SCSP runs its National Security Technology Hackathon again, I will enter with a team of cadets. </w:t>
       </w:r>
     </w:p>
     <w:p>
@@ -672,16 +620,15 @@
         <w:rPr>
           <w:sz w:val="24"/>
           <w:szCs w:val="24"/>
-          <w:highlight w:val="yellow"/>
-        </w:rPr>
-        <w:t xml:space="preserve">[early May 2027]</w:t>
+        </w:rPr>
+        <w:t>early May 2027</w:t>
       </w:r>
       <w:r>
         <w:rPr>
           <w:sz w:val="24"/>
           <w:szCs w:val="24"/>
         </w:rPr>
-        <w:t xml:space="preserve">, I will spend $2,000 on travel, lodging, meals, and registration to present my Taiwan interdiction paper at the IEEE Systems and Information Engineering Design Symposium (SIEDS) at the University of Virginia, if accepted. Accepted papers are published in IEEE Xplore, which would give the project a peer-reviewed, citable result for the department.</w:t>
+        <w:t>, I will spend $2,000 on travel, lodging, meals, and registration to present my Taiwan interdiction paper at the IEEE Systems and Information Engineering Design Symposium (SIEDS) at the University of Virginia, if accepted. Accepted papers are published in IEEE Xplore, which would give the project a peer-reviewed, citable result for the department.</w:t>
       </w:r>
     </w:p>
     <w:p>
@@ -690,9 +637,7 @@
         <w:tabs>
           <w:tab w:val="left" w:pos="4680"/>
         </w:tabs>
-        <w:spacing w:before="120"/>
         <w:ind w:left="660"/>
-        <w:contextualSpacing w:val="0"/>
         <w:rPr>
           <w:sz w:val="24"/>
           <w:szCs w:val="24"/>
@@ -703,7 +648,15 @@
           <w:sz w:val="24"/>
           <w:szCs w:val="24"/>
         </w:rPr>
-        <w:t xml:space="preserve">Conference, Priority 3. From 16–18 March 2027, I will spend $2,000 on travel, lodging, and meals to attend the AUSA Global Force Symposium in Huntsville, AL, hosted with Army Materiel Command; registration is free for military attendees. There, the Army’s sustainment leaders explain how they plan to keep supply moving in a contested theater, which would sharpen the defender side of my model.</w:t>
+        <w:t xml:space="preserve">Conference, Priority 3. From 16–18 March 2027, I will spend $2,000 on travel, lodging, and meals to attend the AUSA Global Force Symposium in Huntsville, AL; registration is free for military attendees. It is the Army’s annual forum on modernization, where senior leaders and industry discuss the technology, acquisition, and concepts that will shape the </w:t>
+      </w:r>
+      <w:r>
+        <w:rPr>
+          <w:sz w:val="24"/>
+          <w:szCs w:val="24"/>
+        </w:rPr>
+        <w:lastRenderedPageBreak/>
+        <w:t>future force. Attending would show me which problems the Army is trying to solve and where research like mine can help.</w:t>
       </w:r>
     </w:p>
     <w:p>
@@ -718,6 +671,13 @@
           <w:szCs w:val="24"/>
         </w:rPr>
       </w:pPr>
+      <w:r>
+        <w:rPr>
+          <w:sz w:val="24"/>
+          <w:szCs w:val="24"/>
+        </w:rPr>
+        <w:t xml:space="preserve">Online Courses. During 2027, I will spend $797 on verified certificates for three courses in the MITx Supply Chain Management MicroMasters program, offered by the MIT Center for Transportation &amp; Logistics. The courses are Supply Chain Analytics (SC0x, $199), Supply Chain Fundamentals (SC1x, $299), and Supply Chain Design (SC2x, $299). Supply Chain Design covers network design and optimization, the defender’s side of the problem my Taiwan model attacks. The courses also count toward the MicroMasters credential, a pathway to graduate study in supply chain management.</w:t>
+      </w:r>
     </w:p>
     <w:p>
       <w:pPr>
@@ -740,14 +700,7 @@
           <w:sz w:val="24"/>
           <w:szCs w:val="24"/>
         </w:rPr>
-        <w:t xml:space="preserve">Research Travel. </w:t>
-      </w:r>
-      <w:r>
-        <w:rPr>
-          <w:sz w:val="24"/>
-          <w:szCs w:val="24"/>
-        </w:rPr>
-        <w:t xml:space="preserve">Conferences are listed in priority order; Priorities 2 and 3 are alternates.</w:t>
+        <w:t>Research Travel. Conferences are listed in priority order; Priorities 2 and 3 are alternates.</w:t>
       </w:r>
     </w:p>
     <w:p>
@@ -971,7 +924,7 @@
                 <w:sz w:val="22"/>
                 <w:szCs w:val="22"/>
               </w:rPr>
-              <w:t xml:space="preserve">AIAD</w:t>
+              <w:t>AIAD</w:t>
             </w:r>
           </w:p>
         </w:tc>
@@ -994,7 +947,7 @@
                 <w:sz w:val="22"/>
                 <w:szCs w:val="22"/>
               </w:rPr>
-              <w:t xml:space="preserve">MIT Lincoln Laboratory (alternate, Duke University ECE)</w:t>
+              <w:t>MIT Lincoln Laboratory (alternate, Duke University ECE)</w:t>
             </w:r>
           </w:p>
         </w:tc>
@@ -1017,7 +970,7 @@
                 <w:sz w:val="22"/>
                 <w:szCs w:val="22"/>
               </w:rPr>
-              <w:t xml:space="preserve">Lexington, MA (alternate, Durham, NC)</w:t>
+              <w:t>Lexington, MA (alternate, Durham, NC)</w:t>
             </w:r>
           </w:p>
         </w:tc>
@@ -1039,16 +992,29 @@
               <w:rPr>
                 <w:sz w:val="22"/>
                 <w:szCs w:val="22"/>
-                <w:highlight w:val="yellow"/>
               </w:rPr>
-              <w:t xml:space="preserve">[12–30 Jul 2027]</w:t>
+              <w:t>11</w:t>
             </w:r>
             <w:r>
               <w:rPr>
                 <w:sz w:val="22"/>
                 <w:szCs w:val="22"/>
               </w:rPr>
-              <w:t xml:space="preserve"> (21 days)</w:t>
+              <w:t>–</w:t>
+            </w:r>
+            <w:r>
+              <w:rPr>
+                <w:sz w:val="22"/>
+                <w:szCs w:val="22"/>
+              </w:rPr>
+              <w:t>31</w:t>
+            </w:r>
+            <w:r>
+              <w:rPr>
+                <w:sz w:val="22"/>
+                <w:szCs w:val="22"/>
+              </w:rPr>
+              <w:t xml:space="preserve"> Jul 2027 </w:t>
             </w:r>
           </w:p>
         </w:tc>
@@ -1071,7 +1037,7 @@
                 <w:sz w:val="22"/>
                 <w:szCs w:val="22"/>
               </w:rPr>
-              <w:t xml:space="preserve">$6,700</w:t>
+              <w:t>$6,700</w:t>
             </w:r>
           </w:p>
         </w:tc>
@@ -1099,7 +1065,7 @@
                 <w:sz w:val="22"/>
                 <w:szCs w:val="22"/>
               </w:rPr>
-              <w:t xml:space="preserve">Conference, Priority 1</w:t>
+              <w:t>Conference, Priority 1</w:t>
             </w:r>
           </w:p>
         </w:tc>
@@ -1122,7 +1088,7 @@
                 <w:sz w:val="22"/>
                 <w:szCs w:val="22"/>
               </w:rPr>
-              <w:t xml:space="preserve">SCSP AI+ Expo and hackathon</w:t>
+              <w:t>SCSP AI+ Expo and hackathon</w:t>
             </w:r>
           </w:p>
         </w:tc>
@@ -1145,7 +1111,7 @@
                 <w:sz w:val="22"/>
                 <w:szCs w:val="22"/>
               </w:rPr>
-              <w:t xml:space="preserve">Washington, DC</w:t>
+              <w:t>Washington, DC</w:t>
             </w:r>
           </w:p>
         </w:tc>
@@ -1168,7 +1134,7 @@
                 <w:sz w:val="22"/>
                 <w:szCs w:val="22"/>
               </w:rPr>
-              <w:t xml:space="preserve">24–25 May 2027</w:t>
+              <w:t>24–25 May 2027</w:t>
             </w:r>
           </w:p>
         </w:tc>
@@ -1191,7 +1157,7 @@
                 <w:sz w:val="22"/>
                 <w:szCs w:val="22"/>
               </w:rPr>
-              <w:t xml:space="preserve">$2,000</w:t>
+              <w:t>$2,000</w:t>
             </w:r>
           </w:p>
         </w:tc>
@@ -1219,7 +1185,7 @@
                 <w:sz w:val="22"/>
                 <w:szCs w:val="22"/>
               </w:rPr>
-              <w:t xml:space="preserve">Conference, Priority 2 (alternate)</w:t>
+              <w:t>Conference, Priority 2 (alternate)</w:t>
             </w:r>
           </w:p>
         </w:tc>
@@ -1242,7 +1208,7 @@
                 <w:sz w:val="22"/>
                 <w:szCs w:val="22"/>
               </w:rPr>
-              <w:t xml:space="preserve">IEEE SIEDS, University of Virginia</w:t>
+              <w:t>IEEE SIEDS, University of Virginia</w:t>
             </w:r>
           </w:p>
         </w:tc>
@@ -1265,7 +1231,7 @@
                 <w:sz w:val="22"/>
                 <w:szCs w:val="22"/>
               </w:rPr>
-              <w:t xml:space="preserve">Charlottesville, VA</w:t>
+              <w:t>Charlottesville, VA</w:t>
             </w:r>
           </w:p>
         </w:tc>
@@ -1287,9 +1253,8 @@
               <w:rPr>
                 <w:sz w:val="22"/>
                 <w:szCs w:val="22"/>
-                <w:highlight w:val="yellow"/>
               </w:rPr>
-              <w:t xml:space="preserve">[Early May 2027]</w:t>
+              <w:t>Early May 2027</w:t>
             </w:r>
           </w:p>
         </w:tc>
@@ -1312,7 +1277,7 @@
                 <w:sz w:val="22"/>
                 <w:szCs w:val="22"/>
               </w:rPr>
-              <w:t xml:space="preserve">$2,000</w:t>
+              <w:t>$2,000</w:t>
             </w:r>
           </w:p>
         </w:tc>
@@ -1339,7 +1304,7 @@
                 <w:sz w:val="22"/>
                 <w:szCs w:val="22"/>
               </w:rPr>
-              <w:t xml:space="preserve">Conference, Priority 3 (alternate)</w:t>
+              <w:t>Conference, Priority 3 (alternate)</w:t>
             </w:r>
           </w:p>
         </w:tc>
@@ -1361,7 +1326,7 @@
                 <w:sz w:val="22"/>
                 <w:szCs w:val="22"/>
               </w:rPr>
-              <w:t xml:space="preserve">AUSA Global Force Symposium</w:t>
+              <w:t>AUSA Global Force Symposium</w:t>
             </w:r>
           </w:p>
         </w:tc>
@@ -1383,7 +1348,7 @@
                 <w:sz w:val="22"/>
                 <w:szCs w:val="22"/>
               </w:rPr>
-              <w:t xml:space="preserve">Huntsville, AL</w:t>
+              <w:t>Huntsville, AL</w:t>
             </w:r>
           </w:p>
         </w:tc>
@@ -1405,7 +1370,7 @@
                 <w:sz w:val="22"/>
                 <w:szCs w:val="22"/>
               </w:rPr>
-              <w:t xml:space="preserve">16–18 Mar 2027</w:t>
+              <w:t>16–18 Mar 2027</w:t>
             </w:r>
           </w:p>
         </w:tc>
@@ -1427,7 +1392,7 @@
                 <w:sz w:val="22"/>
                 <w:szCs w:val="22"/>
               </w:rPr>
-              <w:t xml:space="preserve">$2,000</w:t>
+              <w:t>$2,000</w:t>
             </w:r>
           </w:p>
         </w:tc>
@@ -1466,21 +1431,17 @@
           <w:sz w:val="24"/>
           <w:szCs w:val="24"/>
         </w:rPr>
-        <w:t xml:space="preserve">Total. </w:t>
-      </w:r>
-      <w:r>
-        <w:rPr>
-          <w:sz w:val="24"/>
-          <w:szCs w:val="24"/>
-        </w:rPr>
-        <w:t xml:space="preserve">$8,700, covering the AIAD ($6,700) and the first-priority conference ($2,000). Each alternate is also estimated at $2,000, so any substitution keeps the total at $8,700, within the $10,000 limit.</w:t>
+        <w:t xml:space="preserve">Equipment, Materials, or Supplies. Three MITx course certificates purchased from MIT (learn.mit.edu), SC0x ($199), SC1x ($299), and SC2x ($299), for a total of $797.</w:t>
       </w:r>
     </w:p>
     <w:p>
       <w:pPr>
-        <w:tabs>
+        <w:pStyle w:val="ListParagraph"/>
+        <w:tabs>
+          <w:tab w:val="left" w:pos="450"/>
           <w:tab w:val="left" w:pos="4680"/>
         </w:tabs>
+        <w:ind w:left="540" w:hanging="240"/>
         <w:rPr>
           <w:sz w:val="24"/>
           <w:szCs w:val="24"/>
@@ -1489,9 +1450,16 @@
     </w:p>
     <w:p>
       <w:pPr>
-        <w:tabs>
+        <w:pStyle w:val="ListParagraph"/>
+        <w:numPr>
+          <w:ilvl w:val="0"/>
+          <w:numId w:val="28"/>
+        </w:numPr>
+        <w:tabs>
+          <w:tab w:val="left" w:pos="450"/>
           <w:tab w:val="left" w:pos="4680"/>
         </w:tabs>
+        <w:ind w:left="540" w:hanging="240"/>
         <w:rPr>
           <w:sz w:val="24"/>
           <w:szCs w:val="24"/>
@@ -1502,44 +1470,7 @@
           <w:sz w:val="24"/>
           <w:szCs w:val="24"/>
         </w:rPr>
-        <w:t xml:space="preserve">     d. Timeline for Expenditures. </w:t>
-      </w:r>
-      <w:r>
-        <w:rPr>
-          <w:sz w:val="24"/>
-          <w:szCs w:val="24"/>
-        </w:rPr>
-        <w:t xml:space="preserve">From November 2026 to February 2027, I will request the AIAD placement, submit the SIEDS abstract, and register for the conferences. Between March and May 2027, I will attend the funded conference (Global Force on 16–18 March, SIEDS in </w:t>
-      </w:r>
-      <w:r>
-        <w:rPr>
-          <w:sz w:val="24"/>
-          <w:szCs w:val="24"/>
-          <w:highlight w:val="yellow"/>
-        </w:rPr>
-        <w:t xml:space="preserve">[early May]</w:t>
-      </w:r>
-      <w:r>
-        <w:rPr>
-          <w:sz w:val="24"/>
-          <w:szCs w:val="24"/>
-        </w:rPr>
-        <w:t xml:space="preserve">, or the AI+ Expo on 24–25 May). I will complete the AIAD from </w:t>
-      </w:r>
-      <w:r>
-        <w:rPr>
-          <w:sz w:val="24"/>
-          <w:szCs w:val="24"/>
-          <w:highlight w:val="yellow"/>
-        </w:rPr>
-        <w:t xml:space="preserve">[12–30 July 2027]</w:t>
-      </w:r>
-      <w:r>
-        <w:rPr>
-          <w:sz w:val="24"/>
-          <w:szCs w:val="24"/>
-        </w:rPr>
-        <w:t xml:space="preserve">. All funds will be spent by 31 July 2027, well before my graduation in May 2029.</w:t>
+        <w:t xml:space="preserve">Total. $9,497, covering the AIAD ($6,700), the first-priority conference ($2,000), and the online courses ($797). Each alternate conference is also estimated at $2,000, so any substitution keeps the total at $9,497, within the $10,000 limit.</w:t>
       </w:r>
     </w:p>
     <w:p>
@@ -1568,23 +1499,36 @@
           <w:sz w:val="24"/>
           <w:szCs w:val="24"/>
         </w:rPr>
-        <w:t xml:space="preserve">5. Contact information for </w:t>
+        <w:t xml:space="preserve">     e. Timeline for Expenditures. From November 2026 to February 2027, I will request the AIAD placement, submit the SIEDS abstract, and register for the conferences. Between March and May 2027, I will attend the funded conference (Global Force on 16–18 March, SIEDS in early May, or the AI+ Expo on 24–25 May). I will complete the AIAD from 11–31 July 2027. I will purchase each MITx course certificate when that course opens in 2027. All funds will be spent by 31 December 2027, well before my graduation in May 2029.</w:t>
       </w:r>
-      <w:proofErr w:type="gramStart"/>
+    </w:p>
+    <w:p>
+      <w:pPr>
+        <w:tabs>
+          <w:tab w:val="left" w:pos="4680"/>
+        </w:tabs>
+        <w:rPr>
+          <w:sz w:val="24"/>
+          <w:szCs w:val="24"/>
+        </w:rPr>
+      </w:pPr>
+    </w:p>
+    <w:p>
+      <w:pPr>
+        <w:tabs>
+          <w:tab w:val="left" w:pos="4680"/>
+        </w:tabs>
+        <w:rPr>
+          <w:sz w:val="24"/>
+          <w:szCs w:val="24"/>
+        </w:rPr>
+      </w:pPr>
       <w:r>
         <w:rPr>
           <w:sz w:val="24"/>
           <w:szCs w:val="24"/>
         </w:rPr>
-        <w:t>applicant</w:t>
-      </w:r>
-      <w:proofErr w:type="gramEnd"/>
-      <w:r>
-        <w:rPr>
-          <w:sz w:val="24"/>
-          <w:szCs w:val="24"/>
-        </w:rPr>
-        <w:t>. CDT Dennis G. Pezan, Company C-2, Class of 2029; dennis.pezan@westpoint.edu; (815) 592-6927.</w:t>
+        <w:t>5. Contact information for applicant. CDT Dennis G. Pezan, Company C-2, Class of 2029; dennis.pezan@westpoint.edu; (815) 592-6927.</w:t>
       </w:r>
     </w:p>
     <w:p>
@@ -5150,7 +5094,6 @@
   <w:style w:type="character" w:default="1" w:styleId="DefaultParagraphFont">
     <w:name w:val="Default Paragraph Font"/>
     <w:uiPriority w:val="1"/>
-    <w:semiHidden/>
     <w:unhideWhenUsed/>
   </w:style>
   <w:style w:type="table" w:default="1" w:styleId="TableNormal">
@@ -5753,15 +5696,6 @@
 </file>
 
 <file path=customXml/item1.xml><?xml version="1.0" encoding="utf-8"?>
-<?mso-contentType ?>
-<FormTemplates xmlns="http://schemas.microsoft.com/sharepoint/v3/contenttype/forms">
-  <Display>DocumentLibraryForm</Display>
-  <Edit>DocumentLibraryForm</Edit>
-  <New>DocumentLibraryForm</New>
-</FormTemplates>
-</file>
-
-<file path=customXml/item2.xml><?xml version="1.0" encoding="utf-8"?>
 <p:properties xmlns:p="http://schemas.microsoft.com/office/2006/metadata/properties" xmlns:xsi="http://www.w3.org/2001/XMLSchema-instance" xmlns:pc="http://schemas.microsoft.com/office/infopath/2007/PartnerControls">
   <documentManagement>
     <lcf76f155ced4ddcb4097134ff3c332f xmlns="b6c243bf-a1a9-4ba6-8da4-da0b029aa8eb">
@@ -5772,7 +5706,20 @@
 </p:properties>
 </file>
 
+<file path=customXml/item2.xml><?xml version="1.0" encoding="utf-8"?>
+<?mso-contentType ?>
+<FormTemplates xmlns="http://schemas.microsoft.com/sharepoint/v3/contenttype/forms">
+  <Display>DocumentLibraryForm</Display>
+  <Edit>DocumentLibraryForm</Edit>
+  <New>DocumentLibraryForm</New>
+</FormTemplates>
+</file>
+
 <file path=customXml/item3.xml><?xml version="1.0" encoding="utf-8"?>
+<b:Sources xmlns:b="http://schemas.openxmlformats.org/officeDocument/2006/bibliography" xmlns="http://schemas.openxmlformats.org/officeDocument/2006/bibliography" SelectedStyle="\APASixthEditionOfficeOnline.xsl" StyleName="APA" Version="6"/>
+</file>
+
+<file path=customXml/item4.xml><?xml version="1.0" encoding="utf-8"?>
 <ct:contentTypeSchema xmlns:ct="http://schemas.microsoft.com/office/2006/metadata/contentType" xmlns:ma="http://schemas.microsoft.com/office/2006/metadata/properties/metaAttributes" ct:_="" ma:_="" ma:contentTypeName="Document" ma:contentTypeID="0x0101002C90FB65EDBE924A8972BF6227142302" ma:contentTypeVersion="19" ma:contentTypeDescription="Create a new document." ma:contentTypeScope="" ma:versionID="7531c606bbac50d7f91dd9487ee3d38e">
   <xsd:schema xmlns:xsd="http://www.w3.org/2001/XMLSchema" xmlns:xs="http://www.w3.org/2001/XMLSchema" xmlns:p="http://schemas.microsoft.com/office/2006/metadata/properties" xmlns:ns2="b6c243bf-a1a9-4ba6-8da4-da0b029aa8eb" xmlns:ns3="4b0f2749-be2f-491e-8e5a-617d6ac8c552" targetNamespace="http://schemas.microsoft.com/office/2006/metadata/properties" ma:root="true" ma:fieldsID="9dd95e8467294509e291de4fb51054ff" ns2:_="" ns3:_="">
     <xsd:import namespace="b6c243bf-a1a9-4ba6-8da4-da0b029aa8eb"/>
@@ -6033,19 +5980,7 @@
 </ct:contentTypeSchema>
 </file>
 
-<file path=customXml/item4.xml><?xml version="1.0" encoding="utf-8"?>
-<b:Sources xmlns:b="http://schemas.openxmlformats.org/officeDocument/2006/bibliography" xmlns="http://schemas.openxmlformats.org/officeDocument/2006/bibliography" SelectedStyle="\APASixthEditionOfficeOnline.xsl" StyleName="APA" Version="6"/>
-</file>
-
 <file path=customXml/itemProps1.xml><?xml version="1.0" encoding="utf-8"?>
-<ds:datastoreItem xmlns:ds="http://schemas.openxmlformats.org/officeDocument/2006/customXml" ds:itemID="{978C89D2-7780-4E9D-AEC7-39D64F46D75F}">
-  <ds:schemaRefs>
-    <ds:schemaRef ds:uri="http://schemas.microsoft.com/sharepoint/v3/contenttype/forms"/>
-  </ds:schemaRefs>
-</ds:datastoreItem>
-</file>
-
-<file path=customXml/itemProps2.xml><?xml version="1.0" encoding="utf-8"?>
 <ds:datastoreItem xmlns:ds="http://schemas.openxmlformats.org/officeDocument/2006/customXml" ds:itemID="{A0AE37E5-FCCF-403F-9424-D1529FE8218C}">
   <ds:schemaRefs>
     <ds:schemaRef ds:uri="http://schemas.microsoft.com/office/2006/metadata/properties"/>
@@ -6056,7 +5991,23 @@
 </ds:datastoreItem>
 </file>
 
+<file path=customXml/itemProps2.xml><?xml version="1.0" encoding="utf-8"?>
+<ds:datastoreItem xmlns:ds="http://schemas.openxmlformats.org/officeDocument/2006/customXml" ds:itemID="{978C89D2-7780-4E9D-AEC7-39D64F46D75F}">
+  <ds:schemaRefs>
+    <ds:schemaRef ds:uri="http://schemas.microsoft.com/sharepoint/v3/contenttype/forms"/>
+  </ds:schemaRefs>
+</ds:datastoreItem>
+</file>
+
 <file path=customXml/itemProps3.xml><?xml version="1.0" encoding="utf-8"?>
+<ds:datastoreItem xmlns:ds="http://schemas.openxmlformats.org/officeDocument/2006/customXml" ds:itemID="{F2D63063-93F0-4B9D-AAEA-4663A59CF496}">
+  <ds:schemaRefs>
+    <ds:schemaRef ds:uri="http://schemas.openxmlformats.org/officeDocument/2006/bibliography"/>
+  </ds:schemaRefs>
+</ds:datastoreItem>
+</file>
+
+<file path=customXml/itemProps4.xml><?xml version="1.0" encoding="utf-8"?>
 <ds:datastoreItem xmlns:ds="http://schemas.openxmlformats.org/officeDocument/2006/customXml" ds:itemID="{CB4D324C-0A4C-4816-A153-56E19F56D8EC}">
   <ds:schemaRefs>
     <ds:schemaRef ds:uri="http://schemas.microsoft.com/office/2006/metadata/contentType"/>
@@ -6073,12 +6024,4 @@
     <ds:schemaRef ds:uri="http://schemas.microsoft.com/internal/obd"/>
   </ds:schemaRefs>
 </ds:datastoreItem>
-</file>
-
-<file path=customXml/itemProps4.xml><?xml version="1.0" encoding="utf-8"?>
-<ds:datastoreItem xmlns:ds="http://schemas.openxmlformats.org/officeDocument/2006/customXml" ds:itemID="{F2D63063-93F0-4B9D-AAEA-4663A59CF496}">
-  <ds:schemaRefs>
-    <ds:schemaRef ds:uri="http://schemas.openxmlformats.org/officeDocument/2006/bibliography"/>
-  </ds:schemaRefs>
-</ds:datastoreItem>
 </file>
</xml_diff>

<commit_message>
Memo: reapply MITx courses and fixes to the user's latest draft; signature block and enclosure
Co-Authored-By: Claude Opus 5.5 <noreply@anthropic.com>
Claude-Session: https://claude.ai/code/session_01HUa9sxRc7o7bsnuzSz3H5S
</commit_message>
<xml_diff>
--- a/application/Pezan_DXDT_Application_Memo_DRAFT.docx
+++ b/application/Pezan_DXDT_Application_Memo_DRAFT.docx
@@ -136,7 +136,7 @@
           <v:shape id="_x0000_i1025" type="#_x0000_t75" style="width:71.5pt;height:71.5pt" o:ole="" fillcolor="window">
             <v:imagedata r:id="rId11" o:title=""/>
           </v:shape>
-          <o:OLEObject Type="Embed" ProgID="Word.Picture.8" ShapeID="_x0000_i1025" DrawAspect="Content" ObjectID="_1853643262" r:id="rId12"/>
+          <o:OLEObject Type="Embed" ProgID="Word.Picture.8" ShapeID="_x0000_i1025" DrawAspect="Content" ObjectID="_1853644175" r:id="rId12"/>
         </w:object>
       </w:r>
     </w:p>
@@ -347,7 +347,23 @@
           <w:sz w:val="24"/>
           <w:szCs w:val="24"/>
         </w:rPr>
-        <w:t>At my second AIAD, with the Army’s Transformation Decision Analysis Center (TDAC), I built a reinforcement-learning model for contested resupply. I am pursuing the DXDT “Velocity” Scholarship for two reasons. First, its funding would take my research out of the classroom to defense conferences where I can present it, a hackathon where I can compete, and an AIAD where I can learn how tools like it are tested before they reach a commander. Second, as a Velocity Scholar I would seek to work alongside industry partners such as Palantir, whether through an AIAD, a hackathon, or a joint research project, and bring that practice back to my research and my future formation.</w:t>
+        <w:t xml:space="preserve">At my second AIAD, with the Army’s Transformation Decision Analysis Center (TDAC), I built a reinforcement-learning model for contested resupply. I am pursuing the DXDT “Velocity” Scholarship for two reasons. First, its funding would take my research out of the classroom to defense conferences where I can present it, a hackathon where I can compete, and an AIAD where I can learn how tools like it </w:t>
+      </w:r>
+      <w:proofErr w:type="gramStart"/>
+      <w:r>
+        <w:rPr>
+          <w:sz w:val="24"/>
+          <w:szCs w:val="24"/>
+        </w:rPr>
+        <w:t>are</w:t>
+      </w:r>
+      <w:proofErr w:type="gramEnd"/>
+      <w:r>
+        <w:rPr>
+          <w:sz w:val="24"/>
+          <w:szCs w:val="24"/>
+        </w:rPr>
+        <w:t xml:space="preserve"> tested before they reach a commander. Second, as a Velocity Scholar I would seek to work alongside industry partners such as Palantir, whether through an AIAD, a hackathon, or a joint research project, and bring that practice back to my research and my future formation.</w:t>
       </w:r>
     </w:p>
     <w:p>
@@ -1499,7 +1515,7 @@
           <w:sz w:val="24"/>
           <w:szCs w:val="24"/>
         </w:rPr>
-        <w:t xml:space="preserve">     e. Timeline for Expenditures. From November 2026 to February 2027, I will request the AIAD placement, submit the SIEDS abstract, and register for the conferences. Between March and May 2027, I will attend the funded conference (Global Force on 16–18 March, SIEDS in early May, or the AI+ Expo on 24–25 May). I will complete the AIAD from 11–31 July 2027. I will purchase each MITx course certificate when that course opens in 2027. All funds will be spent by 31 December 2027, well before my graduation in May 2029.</w:t>
+        <w:t xml:space="preserve">     e. Timeline for Expenditures. From November 2026 to February 2027, I will request the AIAD placement, submit the SIEDS abstract, and register for the conferences. Between March and May 2027, I will attend the funded conference (dates in the table above), and I will complete the AIAD from 11–31 July 2027. I will buy each MITx certificate when that course opens, and all funds will be spent by 31 December 2027, before my graduation in May 2029.</w:t>
       </w:r>
     </w:p>
     <w:p>
@@ -1528,7 +1544,35 @@
           <w:sz w:val="24"/>
           <w:szCs w:val="24"/>
         </w:rPr>
-        <w:t>5. Contact information for applicant. CDT Dennis G. Pezan, Company C-2, Class of 2029; dennis.pezan@westpoint.edu; (815) 592-6927.</w:t>
+        <w:t xml:space="preserve">5. </w:t>
+      </w:r>
+      <w:r>
+        <w:rPr>
+          <w:sz w:val="24"/>
+          <w:szCs w:val="24"/>
+        </w:rPr>
+        <w:t>The point of contact for this memorandum is CDT</w:t>
+      </w:r>
+      <w:r>
+        <w:rPr>
+          <w:sz w:val="24"/>
+          <w:szCs w:val="24"/>
+        </w:rPr>
+        <w:t xml:space="preserve"> Dennis Pezan </w:t>
+      </w:r>
+      <w:r>
+        <w:rPr>
+          <w:sz w:val="24"/>
+          <w:szCs w:val="24"/>
+        </w:rPr>
+        <w:t>at (</w:t>
+      </w:r>
+      <w:r>
+        <w:rPr>
+          <w:sz w:val="24"/>
+          <w:szCs w:val="24"/>
+        </w:rPr>
+        <w:t>815) 592-6927</w:t>
       </w:r>
     </w:p>
     <w:p>
@@ -1541,6 +1585,27 @@
           <w:szCs w:val="24"/>
         </w:rPr>
       </w:pPr>
+      <w:r>
+        <w:rPr>
+          <w:sz w:val="24"/>
+          <w:szCs w:val="24"/>
+        </w:rPr>
+        <w:t xml:space="preserve">or </w:t>
+      </w:r>
+      <w:r>
+        <w:rPr>
+          <w:sz w:val="24"/>
+          <w:szCs w:val="24"/>
+        </w:rPr>
+        <w:t>dennis.pezan</w:t>
+      </w:r>
+      <w:r>
+        <w:rPr>
+          <w:sz w:val="24"/>
+          <w:szCs w:val="24"/>
+        </w:rPr>
+        <w:t>@westpoint.edu.</w:t>
+      </w:r>
     </w:p>
     <w:p>
       <w:pPr>
@@ -1574,21 +1639,6 @@
           <w:szCs w:val="24"/>
         </w:rPr>
       </w:pPr>
-      <w:r>
-        <w:rPr>
-          <w:sz w:val="24"/>
-          <w:szCs w:val="24"/>
-        </w:rPr>
-        <w:t>Encl</w:t>
-      </w:r>
-      <w:r>
-        <w:rPr>
-          <w:sz w:val="24"/>
-          <w:szCs w:val="24"/>
-        </w:rPr>
-        <w:tab/>
-        <w:t>DENNIS G. PEZAN</w:t>
-      </w:r>
     </w:p>
     <w:p>
       <w:pPr>
@@ -1605,15 +1655,96 @@
           <w:sz w:val="24"/>
           <w:szCs w:val="24"/>
         </w:rPr>
-        <w:t xml:space="preserve">Applicant’s Curriculum Vitae </w:t>
-      </w:r>
-      <w:r>
-        <w:rPr>
-          <w:sz w:val="24"/>
-          <w:szCs w:val="24"/>
-        </w:rPr>
         <w:tab/>
-        <w:t>CDT, USCC</w:t>
+      </w:r>
+    </w:p>
+    <w:p>
+      <w:pPr>
+        <w:tabs>
+          <w:tab w:val="left" w:pos="4680"/>
+        </w:tabs>
+        <w:rPr>
+          <w:sz w:val="24"/>
+          <w:szCs w:val="24"/>
+        </w:rPr>
+      </w:pPr>
+      <w:r>
+        <w:rPr>
+          <w:sz w:val="24"/>
+          <w:szCs w:val="24"/>
+        </w:rPr>
+        <w:t xml:space="preserve">Encl</w:t>
+      </w:r>
+      <w:r>
+        <w:rPr>
+          <w:sz w:val="24"/>
+          <w:szCs w:val="24"/>
+        </w:rPr>
+        <w:tab/>
+      </w:r>
+      <w:r>
+        <w:rPr>
+          <w:sz w:val="24"/>
+          <w:szCs w:val="24"/>
+        </w:rPr>
+        <w:t xml:space="preserve">DENNIS G. PEZAN</w:t>
+      </w:r>
+    </w:p>
+    <w:p>
+      <w:pPr>
+        <w:tabs>
+          <w:tab w:val="left" w:pos="4680"/>
+        </w:tabs>
+        <w:rPr>
+          <w:sz w:val="24"/>
+          <w:szCs w:val="24"/>
+        </w:rPr>
+      </w:pPr>
+      <w:r>
+        <w:rPr>
+          <w:sz w:val="24"/>
+          <w:szCs w:val="24"/>
+        </w:rPr>
+        <w:t xml:space="preserve">Applicant’s Curriculum Vitae</w:t>
+      </w:r>
+      <w:r>
+        <w:rPr>
+          <w:sz w:val="24"/>
+          <w:szCs w:val="24"/>
+        </w:rPr>
+        <w:tab/>
+      </w:r>
+      <w:r>
+        <w:rPr>
+          <w:sz w:val="24"/>
+          <w:szCs w:val="24"/>
+        </w:rPr>
+        <w:t xml:space="preserve">CDT, USCC</w:t>
+      </w:r>
+    </w:p>
+    <w:p>
+      <w:pPr>
+        <w:tabs>
+          <w:tab w:val="left" w:pos="4680"/>
+        </w:tabs>
+        <w:rPr>
+          <w:sz w:val="24"/>
+          <w:szCs w:val="24"/>
+        </w:rPr>
+      </w:pPr>
+      <w:r>
+        <w:rPr>
+          <w:sz w:val="24"/>
+          <w:szCs w:val="24"/>
+        </w:rPr>
+        <w:tab/>
+      </w:r>
+      <w:r>
+        <w:rPr>
+          <w:sz w:val="24"/>
+          <w:szCs w:val="24"/>
+        </w:rPr>
+        <w:t xml:space="preserve">Team Leader, Company C-2</w:t>
       </w:r>
     </w:p>
     <w:sectPr>

</xml_diff>